<commit_message>
Adiciona o PDF da entrega da A1
Exportei o documento em PDF para quem for corrigir não depender do Word.
Aproveitei e deixei os títulos dos diagramas 3.3 e 3.4 na mesma página
das figuras, que antes ficavam sozinhos no pé da página.
</commit_message>
<xml_diff>
--- a/11_Apresentacao/Financy-A1.docx
+++ b/11_Apresentacao/Financy-A1.docx
@@ -740,6 +740,8 @@
     <w:p>
       <w:pPr>
         <w:pStyle w:val="Heading2"/>
+        <w:keepNext/>
+        <w:keepLines/>
         <w:spacing w:after="140" w:before="280"/>
       </w:pPr>
       <w:r>
@@ -771,6 +773,8 @@
     <w:p>
       <w:pPr>
         <w:pStyle w:val="Heading2"/>
+        <w:keepNext/>
+        <w:keepLines/>
         <w:spacing w:after="140" w:before="280"/>
       </w:pPr>
       <w:r>
@@ -1048,6 +1052,8 @@
     <w:p>
       <w:pPr>
         <w:pStyle w:val="Heading2"/>
+        <w:keepNext/>
+        <w:keepLines/>
         <w:spacing w:after="140" w:before="280"/>
       </w:pPr>
       <w:r>
@@ -1607,6 +1613,8 @@
     <w:p>
       <w:pPr>
         <w:pStyle w:val="Heading2"/>
+        <w:keepNext/>
+        <w:keepLines/>
         <w:spacing w:after="140" w:before="280"/>
       </w:pPr>
       <w:r>
@@ -1719,6 +1727,8 @@
     <w:p>
       <w:pPr>
         <w:pStyle w:val="Heading2"/>
+        <w:keepNext/>
+        <w:keepLines/>
         <w:spacing w:after="140" w:before="280"/>
       </w:pPr>
       <w:r>
@@ -1831,6 +1841,8 @@
     <w:p>
       <w:pPr>
         <w:pStyle w:val="Heading2"/>
+        <w:keepNext/>
+        <w:keepLines/>
         <w:spacing w:after="140" w:before="280"/>
       </w:pPr>
       <w:r>
@@ -1994,6 +2006,8 @@
     <w:p>
       <w:pPr>
         <w:pStyle w:val="Heading2"/>
+        <w:keepNext/>
+        <w:keepLines/>
         <w:spacing w:after="140" w:before="280"/>
       </w:pPr>
       <w:r>
@@ -2812,6 +2826,8 @@
     <w:p>
       <w:pPr>
         <w:pStyle w:val="Heading2"/>
+        <w:keepNext/>
+        <w:keepLines/>
         <w:spacing w:after="140" w:before="280"/>
       </w:pPr>
       <w:r>
@@ -3488,6 +3504,8 @@
     <w:p>
       <w:pPr>
         <w:pStyle w:val="Heading2"/>
+        <w:keepNext/>
+        <w:keepLines/>
         <w:spacing w:after="140" w:before="280"/>
       </w:pPr>
       <w:r>
@@ -3880,6 +3898,8 @@
     <w:p>
       <w:pPr>
         <w:pStyle w:val="Heading2"/>
+        <w:keepNext/>
+        <w:keepLines/>
         <w:spacing w:after="140" w:before="280"/>
       </w:pPr>
       <w:r>
@@ -4698,6 +4718,8 @@
     <w:p>
       <w:pPr>
         <w:pStyle w:val="Heading2"/>
+        <w:keepNext/>
+        <w:keepLines/>
         <w:spacing w:after="140" w:before="280"/>
       </w:pPr>
       <w:r>
@@ -6827,6 +6849,8 @@
     <w:p>
       <w:pPr>
         <w:pStyle w:val="Heading2"/>
+        <w:keepNext/>
+        <w:keepLines/>
         <w:spacing w:after="140" w:before="280"/>
       </w:pPr>
       <w:r>
@@ -8027,6 +8051,8 @@
     <w:p>
       <w:pPr>
         <w:pStyle w:val="Heading2"/>
+        <w:keepNext/>
+        <w:keepLines/>
         <w:spacing w:after="140" w:before="280"/>
       </w:pPr>
       <w:r>
@@ -8107,6 +8133,8 @@
     <w:p>
       <w:pPr>
         <w:pStyle w:val="Heading2"/>
+        <w:keepNext/>
+        <w:keepLines/>
         <w:spacing w:after="140" w:before="280"/>
       </w:pPr>
       <w:r>
@@ -8187,6 +8215,8 @@
     <w:p>
       <w:pPr>
         <w:pStyle w:val="Heading2"/>
+        <w:keepNext/>
+        <w:keepLines/>
         <w:spacing w:after="140" w:before="280"/>
       </w:pPr>
       <w:r>
@@ -8285,6 +8315,8 @@
     <w:p>
       <w:pPr>
         <w:pStyle w:val="Heading2"/>
+        <w:keepNext/>
+        <w:keepLines/>
         <w:spacing w:after="140" w:before="280"/>
       </w:pPr>
       <w:r>
@@ -8905,6 +8937,8 @@
     <w:p>
       <w:pPr>
         <w:pStyle w:val="Heading2"/>
+        <w:keepNext/>
+        <w:keepLines/>
         <w:spacing w:after="140" w:before="280"/>
       </w:pPr>
       <w:r>
@@ -9510,6 +9544,8 @@
     <w:p>
       <w:pPr>
         <w:pStyle w:val="Heading2"/>
+        <w:keepNext/>
+        <w:keepLines/>
         <w:spacing w:after="140" w:before="280"/>
       </w:pPr>
       <w:r>
@@ -9719,6 +9755,8 @@
     <w:p>
       <w:pPr>
         <w:pStyle w:val="Heading2"/>
+        <w:keepNext/>
+        <w:keepLines/>
         <w:spacing w:after="140" w:before="280"/>
       </w:pPr>
       <w:r>
@@ -10978,6 +11016,8 @@
     <w:p>
       <w:pPr>
         <w:pStyle w:val="Heading2"/>
+        <w:keepNext/>
+        <w:keepLines/>
         <w:spacing w:after="140" w:before="280"/>
       </w:pPr>
       <w:r>
@@ -12339,6 +12379,8 @@
     <w:p>
       <w:pPr>
         <w:pStyle w:val="Heading2"/>
+        <w:keepNext/>
+        <w:keepLines/>
         <w:spacing w:after="140" w:before="280"/>
       </w:pPr>
       <w:r>
@@ -12508,6 +12550,8 @@
     <w:p>
       <w:pPr>
         <w:pStyle w:val="Heading2"/>
+        <w:keepNext/>
+        <w:keepLines/>
         <w:spacing w:after="140" w:before="280"/>
       </w:pPr>
       <w:r>
@@ -12639,6 +12683,8 @@
     <w:p>
       <w:pPr>
         <w:pStyle w:val="Heading2"/>
+        <w:keepNext/>
+        <w:keepLines/>
         <w:spacing w:after="140" w:before="280"/>
       </w:pPr>
       <w:r>
@@ -12710,6 +12756,8 @@
     <w:p>
       <w:pPr>
         <w:pStyle w:val="Heading2"/>
+        <w:keepNext/>
+        <w:keepLines/>
         <w:spacing w:after="140" w:before="280"/>
       </w:pPr>
       <w:r>
@@ -13400,6 +13448,8 @@
     <w:p>
       <w:pPr>
         <w:pStyle w:val="Heading2"/>
+        <w:keepNext/>
+        <w:keepLines/>
         <w:spacing w:after="140" w:before="280"/>
       </w:pPr>
       <w:r>
@@ -14556,6 +14606,8 @@
     <w:p>
       <w:pPr>
         <w:pStyle w:val="Heading2"/>
+        <w:keepNext/>
+        <w:keepLines/>
         <w:spacing w:after="140" w:before="280"/>
       </w:pPr>
       <w:r>
@@ -15419,6 +15471,8 @@
     <w:p>
       <w:pPr>
         <w:pStyle w:val="Heading2"/>
+        <w:keepNext/>
+        <w:keepLines/>
         <w:spacing w:after="140" w:before="280"/>
       </w:pPr>
       <w:r>
@@ -15895,6 +15949,8 @@
     <w:p>
       <w:pPr>
         <w:pStyle w:val="Heading2"/>
+        <w:keepNext/>
+        <w:keepLines/>
         <w:spacing w:after="140" w:before="280"/>
       </w:pPr>
       <w:r>
@@ -15954,6 +16010,8 @@
     <w:p>
       <w:pPr>
         <w:pStyle w:val="Heading2"/>
+        <w:keepNext/>
+        <w:keepLines/>
         <w:spacing w:after="140" w:before="280"/>
       </w:pPr>
       <w:r>
@@ -16075,6 +16133,8 @@
     <w:p>
       <w:pPr>
         <w:pStyle w:val="Heading2"/>
+        <w:keepNext/>
+        <w:keepLines/>
         <w:spacing w:after="140" w:before="280"/>
       </w:pPr>
       <w:r>
@@ -16634,6 +16694,8 @@
     <w:p>
       <w:pPr>
         <w:pStyle w:val="Heading2"/>
+        <w:keepNext/>
+        <w:keepLines/>
         <w:spacing w:after="140" w:before="280"/>
       </w:pPr>
       <w:r>
@@ -17168,6 +17230,8 @@
     <w:p>
       <w:pPr>
         <w:pStyle w:val="Heading2"/>
+        <w:keepNext/>
+        <w:keepLines/>
         <w:spacing w:after="140" w:before="280"/>
       </w:pPr>
       <w:r>
@@ -17773,6 +17837,8 @@
     <w:p>
       <w:pPr>
         <w:pStyle w:val="Heading2"/>
+        <w:keepNext/>
+        <w:keepLines/>
         <w:spacing w:after="140" w:before="280"/>
       </w:pPr>
       <w:r>
@@ -17844,6 +17910,8 @@
     <w:p>
       <w:pPr>
         <w:pStyle w:val="Heading2"/>
+        <w:keepNext/>
+        <w:keepLines/>
         <w:spacing w:after="140" w:before="280"/>
       </w:pPr>
       <w:r>
@@ -21521,6 +21589,8 @@
     <w:p>
       <w:pPr>
         <w:pStyle w:val="Heading2"/>
+        <w:keepNext/>
+        <w:keepLines/>
         <w:spacing w:after="140" w:before="280"/>
       </w:pPr>
       <w:r>
@@ -22932,6 +23002,8 @@
     <w:p>
       <w:pPr>
         <w:pStyle w:val="Heading2"/>
+        <w:keepNext/>
+        <w:keepLines/>
         <w:spacing w:after="140" w:before="280"/>
       </w:pPr>
       <w:r>
@@ -24548,6 +24620,8 @@
     <w:p>
       <w:pPr>
         <w:pStyle w:val="Heading2"/>
+        <w:keepNext/>
+        <w:keepLines/>
         <w:spacing w:after="140" w:before="280"/>
       </w:pPr>
       <w:r>
@@ -25311,6 +25385,8 @@
     <w:p>
       <w:pPr>
         <w:pStyle w:val="Heading2"/>
+        <w:keepNext/>
+        <w:keepLines/>
         <w:spacing w:after="140" w:before="280"/>
       </w:pPr>
       <w:r>
@@ -25342,6 +25418,8 @@
     <w:p>
       <w:pPr>
         <w:pStyle w:val="Heading2"/>
+        <w:keepNext/>
+        <w:keepLines/>
         <w:spacing w:after="140" w:before="280"/>
       </w:pPr>
       <w:r>
@@ -25373,6 +25451,8 @@
     <w:p>
       <w:pPr>
         <w:pStyle w:val="Heading2"/>
+        <w:keepNext/>
+        <w:keepLines/>
         <w:spacing w:after="140" w:before="280"/>
       </w:pPr>
       <w:r>

</xml_diff>

<commit_message>
A1 versão 1.1: correções da avaliação do professor
Corrigi o que a avaliação de 21/10 apontou. O principal: o colaborador
por produção agora recebe salário base + quantidade × valor por unidade,
nos requisitos, nos diagramas e nos casos de teste.

Também detalhei os requisitos funcionais e completei a matriz com os não
funcionais. Refiz os diagramas de classes, sequência e atividades e dei
aos critérios de qualidade uma forma objetiva de verificar. Os casos de
teste agora têm dados e valores esperados (são 24), e a ata desta revisão
está preenchida. Cada pasta recebeu o PDF da sua parte.
</commit_message>
<xml_diff>
--- a/11_Apresentacao/Financy-A1.docx
+++ b/11_Apresentacao/Financy-A1.docx
@@ -410,7 +410,7 @@
                 <w:sz w:val="21"/>
                 <w:szCs w:val="21"/>
               </w:rPr>
-              <w:t xml:space="preserve">20/10/2026</w:t>
+              <w:t xml:space="preserve">30/10/2026</w:t>
             </w:r>
           </w:p>
         </w:tc>
@@ -481,7 +481,7 @@
                 <w:sz w:val="21"/>
                 <w:szCs w:val="21"/>
               </w:rPr>
-              <w:t xml:space="preserve">1.0 · Entrega da A1</w:t>
+              <w:t xml:space="preserve">1.1 · Revisada após a avaliação da A1 (a 1.0 foi entregue em 20/10/2026)</w:t>
             </w:r>
           </w:p>
         </w:tc>
@@ -2036,8 +2036,9 @@
         <w:tblLayout w:type="fixed"/>
       </w:tblPr>
       <w:tblGrid>
-        <w:gridCol w:w="1400"/>
-        <w:gridCol w:w="7672"/>
+        <w:gridCol w:w="1100"/>
+        <w:gridCol w:w="2700"/>
+        <w:gridCol w:w="5272"/>
       </w:tblGrid>
       <w:tr>
         <w:trPr>
@@ -2045,7 +2046,7 @@
         </w:trPr>
         <w:tc>
           <w:tcPr>
-            <w:tcW w:type="dxa" w:w="1400"/>
+            <w:tcW w:type="dxa" w:w="1100"/>
             <w:tcBorders>
               <w:top w:val="single" w:color="C9D3D1" w:sz="4"/>
               <w:left w:val="single" w:color="C9D3D1" w:sz="4"/>
@@ -2079,7 +2080,41 @@
         </w:tc>
         <w:tc>
           <w:tcPr>
-            <w:tcW w:type="dxa" w:w="7672"/>
+            <w:tcW w:type="dxa" w:w="2700"/>
+            <w:tcBorders>
+              <w:top w:val="single" w:color="C9D3D1" w:sz="4"/>
+              <w:left w:val="single" w:color="C9D3D1" w:sz="4"/>
+              <w:bottom w:val="single" w:color="C9D3D1" w:sz="4"/>
+              <w:right w:val="single" w:color="C9D3D1" w:sz="4"/>
+            </w:tcBorders>
+            <w:shd w:fill="E3EEEC" w:color="auto" w:val="clear"/>
+            <w:tcMar>
+              <w:top w:type="dxa" w:w="70"/>
+              <w:left w:type="dxa" w:w="110"/>
+              <w:bottom w:type="dxa" w:w="70"/>
+              <w:right w:type="dxa" w:w="110"/>
+            </w:tcMar>
+          </w:tcPr>
+          <w:p>
+            <w:pPr>
+              <w:spacing w:after="0" w:line="260"/>
+            </w:pPr>
+            <w:r>
+              <w:rPr>
+                <w:rFonts w:ascii="Arial" w:cs="Arial" w:eastAsia="Arial" w:hAnsi="Arial"/>
+                <w:b/>
+                <w:bCs/>
+                <w:color w:val="1E2A30"/>
+                <w:sz w:val="19"/>
+                <w:szCs w:val="19"/>
+              </w:rPr>
+              <w:t xml:space="preserve">Requisito</w:t>
+            </w:r>
+          </w:p>
+        </w:tc>
+        <w:tc>
+          <w:tcPr>
+            <w:tcW w:type="dxa" w:w="5272"/>
             <w:tcBorders>
               <w:top w:val="single" w:color="C9D3D1" w:sz="4"/>
               <w:left w:val="single" w:color="C9D3D1" w:sz="4"/>
@@ -2118,7 +2153,7 @@
         </w:trPr>
         <w:tc>
           <w:tcPr>
-            <w:tcW w:type="dxa" w:w="1400"/>
+            <w:tcW w:type="dxa" w:w="1100"/>
             <w:tcBorders>
               <w:top w:val="single" w:color="C9D3D1" w:sz="4"/>
               <w:left w:val="single" w:color="C9D3D1" w:sz="4"/>
@@ -2151,34 +2186,67 @@
         </w:tc>
         <w:tc>
           <w:tcPr>
-            <w:tcW w:type="dxa" w:w="7672"/>
-            <w:tcBorders>
-              <w:top w:val="single" w:color="C9D3D1" w:sz="4"/>
-              <w:left w:val="single" w:color="C9D3D1" w:sz="4"/>
-              <w:bottom w:val="single" w:color="C9D3D1" w:sz="4"/>
-              <w:right w:val="single" w:color="C9D3D1" w:sz="4"/>
-            </w:tcBorders>
-            <w:tcMar>
-              <w:top w:type="dxa" w:w="70"/>
-              <w:left w:type="dxa" w:w="110"/>
-              <w:bottom w:type="dxa" w:w="70"/>
-              <w:right w:type="dxa" w:w="110"/>
-            </w:tcMar>
-          </w:tcPr>
-          <w:p>
-            <w:pPr>
-              <w:spacing w:after="0" w:line="260"/>
-            </w:pPr>
-            <w:r>
-              <w:rPr>
-                <w:rFonts w:ascii="Arial" w:cs="Arial" w:eastAsia="Arial" w:hAnsi="Arial"/>
-                <w:b w:val="false"/>
-                <w:bCs w:val="false"/>
-                <w:color w:val="1E2A30"/>
-                <w:sz w:val="19"/>
-                <w:szCs w:val="19"/>
-              </w:rPr>
-              <w:t xml:space="preserve">Cadastro de Colaborador</w:t>
+            <w:tcW w:type="dxa" w:w="2700"/>
+            <w:tcBorders>
+              <w:top w:val="single" w:color="C9D3D1" w:sz="4"/>
+              <w:left w:val="single" w:color="C9D3D1" w:sz="4"/>
+              <w:bottom w:val="single" w:color="C9D3D1" w:sz="4"/>
+              <w:right w:val="single" w:color="C9D3D1" w:sz="4"/>
+            </w:tcBorders>
+            <w:tcMar>
+              <w:top w:type="dxa" w:w="70"/>
+              <w:left w:type="dxa" w:w="110"/>
+              <w:bottom w:type="dxa" w:w="70"/>
+              <w:right w:type="dxa" w:w="110"/>
+            </w:tcMar>
+          </w:tcPr>
+          <w:p>
+            <w:pPr>
+              <w:spacing w:after="0" w:line="260"/>
+            </w:pPr>
+            <w:r>
+              <w:rPr>
+                <w:rFonts w:ascii="Arial" w:cs="Arial" w:eastAsia="Arial" w:hAnsi="Arial"/>
+                <w:b w:val="false"/>
+                <w:bCs w:val="false"/>
+                <w:color w:val="1E2A30"/>
+                <w:sz w:val="19"/>
+                <w:szCs w:val="19"/>
+              </w:rPr>
+              <w:t xml:space="preserve">Cadastro de colaborador</w:t>
+            </w:r>
+          </w:p>
+        </w:tc>
+        <w:tc>
+          <w:tcPr>
+            <w:tcW w:type="dxa" w:w="5272"/>
+            <w:tcBorders>
+              <w:top w:val="single" w:color="C9D3D1" w:sz="4"/>
+              <w:left w:val="single" w:color="C9D3D1" w:sz="4"/>
+              <w:bottom w:val="single" w:color="C9D3D1" w:sz="4"/>
+              <w:right w:val="single" w:color="C9D3D1" w:sz="4"/>
+            </w:tcBorders>
+            <w:tcMar>
+              <w:top w:type="dxa" w:w="70"/>
+              <w:left w:type="dxa" w:w="110"/>
+              <w:bottom w:type="dxa" w:w="70"/>
+              <w:right w:type="dxa" w:w="110"/>
+            </w:tcMar>
+          </w:tcPr>
+          <w:p>
+            <w:pPr>
+              <w:spacing w:after="0" w:line="260"/>
+            </w:pPr>
+            <w:r>
+              <w:rPr>
+                <w:rFonts w:ascii="Arial" w:cs="Arial" w:eastAsia="Arial" w:hAnsi="Arial"/>
+                <w:b w:val="false"/>
+                <w:bCs w:val="false"/>
+                <w:color w:val="1E2A30"/>
+                <w:sz w:val="19"/>
+                <w:szCs w:val="19"/>
+              </w:rPr>
+              <w:t xml:space="preserve">Cadastrar um colaborador informando matrícula, nome e tipo de remuneração (padrão, comissionado ou por produção).</w:t>
             </w:r>
           </w:p>
         </w:tc>
@@ -2189,7 +2257,7 @@
         </w:trPr>
         <w:tc>
           <w:tcPr>
-            <w:tcW w:type="dxa" w:w="1400"/>
+            <w:tcW w:type="dxa" w:w="1100"/>
             <w:tcBorders>
               <w:top w:val="single" w:color="C9D3D1" w:sz="4"/>
               <w:left w:val="single" w:color="C9D3D1" w:sz="4"/>
@@ -2222,34 +2290,67 @@
         </w:tc>
         <w:tc>
           <w:tcPr>
-            <w:tcW w:type="dxa" w:w="7672"/>
-            <w:tcBorders>
-              <w:top w:val="single" w:color="C9D3D1" w:sz="4"/>
-              <w:left w:val="single" w:color="C9D3D1" w:sz="4"/>
-              <w:bottom w:val="single" w:color="C9D3D1" w:sz="4"/>
-              <w:right w:val="single" w:color="C9D3D1" w:sz="4"/>
-            </w:tcBorders>
-            <w:tcMar>
-              <w:top w:type="dxa" w:w="70"/>
-              <w:left w:type="dxa" w:w="110"/>
-              <w:bottom w:type="dxa" w:w="70"/>
-              <w:right w:type="dxa" w:w="110"/>
-            </w:tcMar>
-          </w:tcPr>
-          <w:p>
-            <w:pPr>
-              <w:spacing w:after="0" w:line="260"/>
-            </w:pPr>
-            <w:r>
-              <w:rPr>
-                <w:rFonts w:ascii="Arial" w:cs="Arial" w:eastAsia="Arial" w:hAnsi="Arial"/>
-                <w:b w:val="false"/>
-                <w:bCs w:val="false"/>
-                <w:color w:val="1E2A30"/>
-                <w:sz w:val="19"/>
-                <w:szCs w:val="19"/>
-              </w:rPr>
-              <w:t xml:space="preserve">Cadastro de Colaborador Padrão</w:t>
+            <w:tcW w:type="dxa" w:w="2700"/>
+            <w:tcBorders>
+              <w:top w:val="single" w:color="C9D3D1" w:sz="4"/>
+              <w:left w:val="single" w:color="C9D3D1" w:sz="4"/>
+              <w:bottom w:val="single" w:color="C9D3D1" w:sz="4"/>
+              <w:right w:val="single" w:color="C9D3D1" w:sz="4"/>
+            </w:tcBorders>
+            <w:tcMar>
+              <w:top w:type="dxa" w:w="70"/>
+              <w:left w:type="dxa" w:w="110"/>
+              <w:bottom w:type="dxa" w:w="70"/>
+              <w:right w:type="dxa" w:w="110"/>
+            </w:tcMar>
+          </w:tcPr>
+          <w:p>
+            <w:pPr>
+              <w:spacing w:after="0" w:line="260"/>
+            </w:pPr>
+            <w:r>
+              <w:rPr>
+                <w:rFonts w:ascii="Arial" w:cs="Arial" w:eastAsia="Arial" w:hAnsi="Arial"/>
+                <w:b w:val="false"/>
+                <w:bCs w:val="false"/>
+                <w:color w:val="1E2A30"/>
+                <w:sz w:val="19"/>
+                <w:szCs w:val="19"/>
+              </w:rPr>
+              <w:t xml:space="preserve">Cadastro de colaborador padrão</w:t>
+            </w:r>
+          </w:p>
+        </w:tc>
+        <w:tc>
+          <w:tcPr>
+            <w:tcW w:type="dxa" w:w="5272"/>
+            <w:tcBorders>
+              <w:top w:val="single" w:color="C9D3D1" w:sz="4"/>
+              <w:left w:val="single" w:color="C9D3D1" w:sz="4"/>
+              <w:bottom w:val="single" w:color="C9D3D1" w:sz="4"/>
+              <w:right w:val="single" w:color="C9D3D1" w:sz="4"/>
+            </w:tcBorders>
+            <w:tcMar>
+              <w:top w:type="dxa" w:w="70"/>
+              <w:left w:type="dxa" w:w="110"/>
+              <w:bottom w:type="dxa" w:w="70"/>
+              <w:right w:type="dxa" w:w="110"/>
+            </w:tcMar>
+          </w:tcPr>
+          <w:p>
+            <w:pPr>
+              <w:spacing w:after="0" w:line="260"/>
+            </w:pPr>
+            <w:r>
+              <w:rPr>
+                <w:rFonts w:ascii="Arial" w:cs="Arial" w:eastAsia="Arial" w:hAnsi="Arial"/>
+                <w:b w:val="false"/>
+                <w:bCs w:val="false"/>
+                <w:color w:val="1E2A30"/>
+                <w:sz w:val="19"/>
+                <w:szCs w:val="19"/>
+              </w:rPr>
+              <w:t xml:space="preserve">Cadastrar o colaborador padrão com o salário base mensal.</w:t>
             </w:r>
           </w:p>
         </w:tc>
@@ -2260,7 +2361,7 @@
         </w:trPr>
         <w:tc>
           <w:tcPr>
-            <w:tcW w:type="dxa" w:w="1400"/>
+            <w:tcW w:type="dxa" w:w="1100"/>
             <w:tcBorders>
               <w:top w:val="single" w:color="C9D3D1" w:sz="4"/>
               <w:left w:val="single" w:color="C9D3D1" w:sz="4"/>
@@ -2293,34 +2394,67 @@
         </w:tc>
         <w:tc>
           <w:tcPr>
-            <w:tcW w:type="dxa" w:w="7672"/>
-            <w:tcBorders>
-              <w:top w:val="single" w:color="C9D3D1" w:sz="4"/>
-              <w:left w:val="single" w:color="C9D3D1" w:sz="4"/>
-              <w:bottom w:val="single" w:color="C9D3D1" w:sz="4"/>
-              <w:right w:val="single" w:color="C9D3D1" w:sz="4"/>
-            </w:tcBorders>
-            <w:tcMar>
-              <w:top w:type="dxa" w:w="70"/>
-              <w:left w:type="dxa" w:w="110"/>
-              <w:bottom w:type="dxa" w:w="70"/>
-              <w:right w:type="dxa" w:w="110"/>
-            </w:tcMar>
-          </w:tcPr>
-          <w:p>
-            <w:pPr>
-              <w:spacing w:after="0" w:line="260"/>
-            </w:pPr>
-            <w:r>
-              <w:rPr>
-                <w:rFonts w:ascii="Arial" w:cs="Arial" w:eastAsia="Arial" w:hAnsi="Arial"/>
-                <w:b w:val="false"/>
-                <w:bCs w:val="false"/>
-                <w:color w:val="1E2A30"/>
-                <w:sz w:val="19"/>
-                <w:szCs w:val="19"/>
-              </w:rPr>
-              <w:t xml:space="preserve">Cadastro de Colaborador Comissionado</w:t>
+            <w:tcW w:type="dxa" w:w="2700"/>
+            <w:tcBorders>
+              <w:top w:val="single" w:color="C9D3D1" w:sz="4"/>
+              <w:left w:val="single" w:color="C9D3D1" w:sz="4"/>
+              <w:bottom w:val="single" w:color="C9D3D1" w:sz="4"/>
+              <w:right w:val="single" w:color="C9D3D1" w:sz="4"/>
+            </w:tcBorders>
+            <w:tcMar>
+              <w:top w:type="dxa" w:w="70"/>
+              <w:left w:type="dxa" w:w="110"/>
+              <w:bottom w:type="dxa" w:w="70"/>
+              <w:right w:type="dxa" w:w="110"/>
+            </w:tcMar>
+          </w:tcPr>
+          <w:p>
+            <w:pPr>
+              <w:spacing w:after="0" w:line="260"/>
+            </w:pPr>
+            <w:r>
+              <w:rPr>
+                <w:rFonts w:ascii="Arial" w:cs="Arial" w:eastAsia="Arial" w:hAnsi="Arial"/>
+                <w:b w:val="false"/>
+                <w:bCs w:val="false"/>
+                <w:color w:val="1E2A30"/>
+                <w:sz w:val="19"/>
+                <w:szCs w:val="19"/>
+              </w:rPr>
+              <w:t xml:space="preserve">Cadastro de colaborador comissionado</w:t>
+            </w:r>
+          </w:p>
+        </w:tc>
+        <w:tc>
+          <w:tcPr>
+            <w:tcW w:type="dxa" w:w="5272"/>
+            <w:tcBorders>
+              <w:top w:val="single" w:color="C9D3D1" w:sz="4"/>
+              <w:left w:val="single" w:color="C9D3D1" w:sz="4"/>
+              <w:bottom w:val="single" w:color="C9D3D1" w:sz="4"/>
+              <w:right w:val="single" w:color="C9D3D1" w:sz="4"/>
+            </w:tcBorders>
+            <w:tcMar>
+              <w:top w:type="dxa" w:w="70"/>
+              <w:left w:type="dxa" w:w="110"/>
+              <w:bottom w:type="dxa" w:w="70"/>
+              <w:right w:type="dxa" w:w="110"/>
+            </w:tcMar>
+          </w:tcPr>
+          <w:p>
+            <w:pPr>
+              <w:spacing w:after="0" w:line="260"/>
+            </w:pPr>
+            <w:r>
+              <w:rPr>
+                <w:rFonts w:ascii="Arial" w:cs="Arial" w:eastAsia="Arial" w:hAnsi="Arial"/>
+                <w:b w:val="false"/>
+                <w:bCs w:val="false"/>
+                <w:color w:val="1E2A30"/>
+                <w:sz w:val="19"/>
+                <w:szCs w:val="19"/>
+              </w:rPr>
+              <w:t xml:space="preserve">Cadastrar o comissionado com salário base, valor de vendas do período e percentual de comissão.</w:t>
             </w:r>
           </w:p>
         </w:tc>
@@ -2331,7 +2465,7 @@
         </w:trPr>
         <w:tc>
           <w:tcPr>
-            <w:tcW w:type="dxa" w:w="1400"/>
+            <w:tcW w:type="dxa" w:w="1100"/>
             <w:tcBorders>
               <w:top w:val="single" w:color="C9D3D1" w:sz="4"/>
               <w:left w:val="single" w:color="C9D3D1" w:sz="4"/>
@@ -2364,34 +2498,67 @@
         </w:tc>
         <w:tc>
           <w:tcPr>
-            <w:tcW w:type="dxa" w:w="7672"/>
-            <w:tcBorders>
-              <w:top w:val="single" w:color="C9D3D1" w:sz="4"/>
-              <w:left w:val="single" w:color="C9D3D1" w:sz="4"/>
-              <w:bottom w:val="single" w:color="C9D3D1" w:sz="4"/>
-              <w:right w:val="single" w:color="C9D3D1" w:sz="4"/>
-            </w:tcBorders>
-            <w:tcMar>
-              <w:top w:type="dxa" w:w="70"/>
-              <w:left w:type="dxa" w:w="110"/>
-              <w:bottom w:type="dxa" w:w="70"/>
-              <w:right w:type="dxa" w:w="110"/>
-            </w:tcMar>
-          </w:tcPr>
-          <w:p>
-            <w:pPr>
-              <w:spacing w:after="0" w:line="260"/>
-            </w:pPr>
-            <w:r>
-              <w:rPr>
-                <w:rFonts w:ascii="Arial" w:cs="Arial" w:eastAsia="Arial" w:hAnsi="Arial"/>
-                <w:b w:val="false"/>
-                <w:bCs w:val="false"/>
-                <w:color w:val="1E2A30"/>
-                <w:sz w:val="19"/>
-                <w:szCs w:val="19"/>
-              </w:rPr>
-              <w:t xml:space="preserve">Cadastro de Colaborador por Produção</w:t>
+            <w:tcW w:type="dxa" w:w="2700"/>
+            <w:tcBorders>
+              <w:top w:val="single" w:color="C9D3D1" w:sz="4"/>
+              <w:left w:val="single" w:color="C9D3D1" w:sz="4"/>
+              <w:bottom w:val="single" w:color="C9D3D1" w:sz="4"/>
+              <w:right w:val="single" w:color="C9D3D1" w:sz="4"/>
+            </w:tcBorders>
+            <w:tcMar>
+              <w:top w:type="dxa" w:w="70"/>
+              <w:left w:type="dxa" w:w="110"/>
+              <w:bottom w:type="dxa" w:w="70"/>
+              <w:right w:type="dxa" w:w="110"/>
+            </w:tcMar>
+          </w:tcPr>
+          <w:p>
+            <w:pPr>
+              <w:spacing w:after="0" w:line="260"/>
+            </w:pPr>
+            <w:r>
+              <w:rPr>
+                <w:rFonts w:ascii="Arial" w:cs="Arial" w:eastAsia="Arial" w:hAnsi="Arial"/>
+                <w:b w:val="false"/>
+                <w:bCs w:val="false"/>
+                <w:color w:val="1E2A30"/>
+                <w:sz w:val="19"/>
+                <w:szCs w:val="19"/>
+              </w:rPr>
+              <w:t xml:space="preserve">Cadastro de colaborador por produção</w:t>
+            </w:r>
+          </w:p>
+        </w:tc>
+        <w:tc>
+          <w:tcPr>
+            <w:tcW w:type="dxa" w:w="5272"/>
+            <w:tcBorders>
+              <w:top w:val="single" w:color="C9D3D1" w:sz="4"/>
+              <w:left w:val="single" w:color="C9D3D1" w:sz="4"/>
+              <w:bottom w:val="single" w:color="C9D3D1" w:sz="4"/>
+              <w:right w:val="single" w:color="C9D3D1" w:sz="4"/>
+            </w:tcBorders>
+            <w:tcMar>
+              <w:top w:type="dxa" w:w="70"/>
+              <w:left w:type="dxa" w:w="110"/>
+              <w:bottom w:type="dxa" w:w="70"/>
+              <w:right w:type="dxa" w:w="110"/>
+            </w:tcMar>
+          </w:tcPr>
+          <w:p>
+            <w:pPr>
+              <w:spacing w:after="0" w:line="260"/>
+            </w:pPr>
+            <w:r>
+              <w:rPr>
+                <w:rFonts w:ascii="Arial" w:cs="Arial" w:eastAsia="Arial" w:hAnsi="Arial"/>
+                <w:b w:val="false"/>
+                <w:bCs w:val="false"/>
+                <w:color w:val="1E2A30"/>
+                <w:sz w:val="19"/>
+                <w:szCs w:val="19"/>
+              </w:rPr>
+              <w:t xml:space="preserve">Cadastrar o colaborador por produção com salário base, quantidade produzida e valor pago por unidade.</w:t>
             </w:r>
           </w:p>
         </w:tc>
@@ -2402,7 +2569,7 @@
         </w:trPr>
         <w:tc>
           <w:tcPr>
-            <w:tcW w:type="dxa" w:w="1400"/>
+            <w:tcW w:type="dxa" w:w="1100"/>
             <w:tcBorders>
               <w:top w:val="single" w:color="C9D3D1" w:sz="4"/>
               <w:left w:val="single" w:color="C9D3D1" w:sz="4"/>
@@ -2435,34 +2602,67 @@
         </w:tc>
         <w:tc>
           <w:tcPr>
-            <w:tcW w:type="dxa" w:w="7672"/>
-            <w:tcBorders>
-              <w:top w:val="single" w:color="C9D3D1" w:sz="4"/>
-              <w:left w:val="single" w:color="C9D3D1" w:sz="4"/>
-              <w:bottom w:val="single" w:color="C9D3D1" w:sz="4"/>
-              <w:right w:val="single" w:color="C9D3D1" w:sz="4"/>
-            </w:tcBorders>
-            <w:tcMar>
-              <w:top w:type="dxa" w:w="70"/>
-              <w:left w:type="dxa" w:w="110"/>
-              <w:bottom w:type="dxa" w:w="70"/>
-              <w:right w:type="dxa" w:w="110"/>
-            </w:tcMar>
-          </w:tcPr>
-          <w:p>
-            <w:pPr>
-              <w:spacing w:after="0" w:line="260"/>
-            </w:pPr>
-            <w:r>
-              <w:rPr>
-                <w:rFonts w:ascii="Arial" w:cs="Arial" w:eastAsia="Arial" w:hAnsi="Arial"/>
-                <w:b w:val="false"/>
-                <w:bCs w:val="false"/>
-                <w:color w:val="1E2A30"/>
-                <w:sz w:val="19"/>
-                <w:szCs w:val="19"/>
-              </w:rPr>
-              <w:t xml:space="preserve">Consulta de Colaboradores</w:t>
+            <w:tcW w:type="dxa" w:w="2700"/>
+            <w:tcBorders>
+              <w:top w:val="single" w:color="C9D3D1" w:sz="4"/>
+              <w:left w:val="single" w:color="C9D3D1" w:sz="4"/>
+              <w:bottom w:val="single" w:color="C9D3D1" w:sz="4"/>
+              <w:right w:val="single" w:color="C9D3D1" w:sz="4"/>
+            </w:tcBorders>
+            <w:tcMar>
+              <w:top w:type="dxa" w:w="70"/>
+              <w:left w:type="dxa" w:w="110"/>
+              <w:bottom w:type="dxa" w:w="70"/>
+              <w:right w:type="dxa" w:w="110"/>
+            </w:tcMar>
+          </w:tcPr>
+          <w:p>
+            <w:pPr>
+              <w:spacing w:after="0" w:line="260"/>
+            </w:pPr>
+            <w:r>
+              <w:rPr>
+                <w:rFonts w:ascii="Arial" w:cs="Arial" w:eastAsia="Arial" w:hAnsi="Arial"/>
+                <w:b w:val="false"/>
+                <w:bCs w:val="false"/>
+                <w:color w:val="1E2A30"/>
+                <w:sz w:val="19"/>
+                <w:szCs w:val="19"/>
+              </w:rPr>
+              <w:t xml:space="preserve">Consulta de colaboradores</w:t>
+            </w:r>
+          </w:p>
+        </w:tc>
+        <w:tc>
+          <w:tcPr>
+            <w:tcW w:type="dxa" w:w="5272"/>
+            <w:tcBorders>
+              <w:top w:val="single" w:color="C9D3D1" w:sz="4"/>
+              <w:left w:val="single" w:color="C9D3D1" w:sz="4"/>
+              <w:bottom w:val="single" w:color="C9D3D1" w:sz="4"/>
+              <w:right w:val="single" w:color="C9D3D1" w:sz="4"/>
+            </w:tcBorders>
+            <w:tcMar>
+              <w:top w:type="dxa" w:w="70"/>
+              <w:left w:type="dxa" w:w="110"/>
+              <w:bottom w:type="dxa" w:w="70"/>
+              <w:right w:type="dxa" w:w="110"/>
+            </w:tcMar>
+          </w:tcPr>
+          <w:p>
+            <w:pPr>
+              <w:spacing w:after="0" w:line="260"/>
+            </w:pPr>
+            <w:r>
+              <w:rPr>
+                <w:rFonts w:ascii="Arial" w:cs="Arial" w:eastAsia="Arial" w:hAnsi="Arial"/>
+                <w:b w:val="false"/>
+                <w:bCs w:val="false"/>
+                <w:color w:val="1E2A30"/>
+                <w:sz w:val="19"/>
+                <w:szCs w:val="19"/>
+              </w:rPr>
+              <w:t xml:space="preserve">Listar todos os colaboradores com os dados cadastrais e remuneratórios e localizar um colaborador pela matrícula.</w:t>
             </w:r>
           </w:p>
         </w:tc>
@@ -2473,7 +2673,7 @@
         </w:trPr>
         <w:tc>
           <w:tcPr>
-            <w:tcW w:type="dxa" w:w="1400"/>
+            <w:tcW w:type="dxa" w:w="1100"/>
             <w:tcBorders>
               <w:top w:val="single" w:color="C9D3D1" w:sz="4"/>
               <w:left w:val="single" w:color="C9D3D1" w:sz="4"/>
@@ -2506,34 +2706,67 @@
         </w:tc>
         <w:tc>
           <w:tcPr>
-            <w:tcW w:type="dxa" w:w="7672"/>
-            <w:tcBorders>
-              <w:top w:val="single" w:color="C9D3D1" w:sz="4"/>
-              <w:left w:val="single" w:color="C9D3D1" w:sz="4"/>
-              <w:bottom w:val="single" w:color="C9D3D1" w:sz="4"/>
-              <w:right w:val="single" w:color="C9D3D1" w:sz="4"/>
-            </w:tcBorders>
-            <w:tcMar>
-              <w:top w:type="dxa" w:w="70"/>
-              <w:left w:type="dxa" w:w="110"/>
-              <w:bottom w:type="dxa" w:w="70"/>
-              <w:right w:type="dxa" w:w="110"/>
-            </w:tcMar>
-          </w:tcPr>
-          <w:p>
-            <w:pPr>
-              <w:spacing w:after="0" w:line="260"/>
-            </w:pPr>
-            <w:r>
-              <w:rPr>
-                <w:rFonts w:ascii="Arial" w:cs="Arial" w:eastAsia="Arial" w:hAnsi="Arial"/>
-                <w:b w:val="false"/>
-                <w:bCs w:val="false"/>
-                <w:color w:val="1E2A30"/>
-                <w:sz w:val="19"/>
-                <w:szCs w:val="19"/>
-              </w:rPr>
-              <w:t xml:space="preserve">Cálculo de Salário</w:t>
+            <w:tcW w:type="dxa" w:w="2700"/>
+            <w:tcBorders>
+              <w:top w:val="single" w:color="C9D3D1" w:sz="4"/>
+              <w:left w:val="single" w:color="C9D3D1" w:sz="4"/>
+              <w:bottom w:val="single" w:color="C9D3D1" w:sz="4"/>
+              <w:right w:val="single" w:color="C9D3D1" w:sz="4"/>
+            </w:tcBorders>
+            <w:tcMar>
+              <w:top w:type="dxa" w:w="70"/>
+              <w:left w:type="dxa" w:w="110"/>
+              <w:bottom w:type="dxa" w:w="70"/>
+              <w:right w:type="dxa" w:w="110"/>
+            </w:tcMar>
+          </w:tcPr>
+          <w:p>
+            <w:pPr>
+              <w:spacing w:after="0" w:line="260"/>
+            </w:pPr>
+            <w:r>
+              <w:rPr>
+                <w:rFonts w:ascii="Arial" w:cs="Arial" w:eastAsia="Arial" w:hAnsi="Arial"/>
+                <w:b w:val="false"/>
+                <w:bCs w:val="false"/>
+                <w:color w:val="1E2A30"/>
+                <w:sz w:val="19"/>
+                <w:szCs w:val="19"/>
+              </w:rPr>
+              <w:t xml:space="preserve">Cálculo de salário</w:t>
+            </w:r>
+          </w:p>
+        </w:tc>
+        <w:tc>
+          <w:tcPr>
+            <w:tcW w:type="dxa" w:w="5272"/>
+            <w:tcBorders>
+              <w:top w:val="single" w:color="C9D3D1" w:sz="4"/>
+              <w:left w:val="single" w:color="C9D3D1" w:sz="4"/>
+              <w:bottom w:val="single" w:color="C9D3D1" w:sz="4"/>
+              <w:right w:val="single" w:color="C9D3D1" w:sz="4"/>
+            </w:tcBorders>
+            <w:tcMar>
+              <w:top w:type="dxa" w:w="70"/>
+              <w:left w:type="dxa" w:w="110"/>
+              <w:bottom w:type="dxa" w:w="70"/>
+              <w:right w:type="dxa" w:w="110"/>
+            </w:tcMar>
+          </w:tcPr>
+          <w:p>
+            <w:pPr>
+              <w:spacing w:after="0" w:line="260"/>
+            </w:pPr>
+            <w:r>
+              <w:rPr>
+                <w:rFonts w:ascii="Arial" w:cs="Arial" w:eastAsia="Arial" w:hAnsi="Arial"/>
+                <w:b w:val="false"/>
+                <w:bCs w:val="false"/>
+                <w:color w:val="1E2A30"/>
+                <w:sz w:val="19"/>
+                <w:szCs w:val="19"/>
+              </w:rPr>
+              <w:t xml:space="preserve">Calcular o salário bruto de cada colaborador conforme o tipo de remuneração.</w:t>
             </w:r>
           </w:p>
         </w:tc>
@@ -2544,7 +2777,7 @@
         </w:trPr>
         <w:tc>
           <w:tcPr>
-            <w:tcW w:type="dxa" w:w="1400"/>
+            <w:tcW w:type="dxa" w:w="1100"/>
             <w:tcBorders>
               <w:top w:val="single" w:color="C9D3D1" w:sz="4"/>
               <w:left w:val="single" w:color="C9D3D1" w:sz="4"/>
@@ -2577,34 +2810,67 @@
         </w:tc>
         <w:tc>
           <w:tcPr>
-            <w:tcW w:type="dxa" w:w="7672"/>
-            <w:tcBorders>
-              <w:top w:val="single" w:color="C9D3D1" w:sz="4"/>
-              <w:left w:val="single" w:color="C9D3D1" w:sz="4"/>
-              <w:bottom w:val="single" w:color="C9D3D1" w:sz="4"/>
-              <w:right w:val="single" w:color="C9D3D1" w:sz="4"/>
-            </w:tcBorders>
-            <w:tcMar>
-              <w:top w:type="dxa" w:w="70"/>
-              <w:left w:type="dxa" w:w="110"/>
-              <w:bottom w:type="dxa" w:w="70"/>
-              <w:right w:type="dxa" w:w="110"/>
-            </w:tcMar>
-          </w:tcPr>
-          <w:p>
-            <w:pPr>
-              <w:spacing w:after="0" w:line="260"/>
-            </w:pPr>
-            <w:r>
-              <w:rPr>
-                <w:rFonts w:ascii="Arial" w:cs="Arial" w:eastAsia="Arial" w:hAnsi="Arial"/>
-                <w:b w:val="false"/>
-                <w:bCs w:val="false"/>
-                <w:color w:val="1E2A30"/>
-                <w:sz w:val="19"/>
-                <w:szCs w:val="19"/>
-              </w:rPr>
-              <w:t xml:space="preserve">Geração da Folha de Pagamento</w:t>
+            <w:tcW w:type="dxa" w:w="2700"/>
+            <w:tcBorders>
+              <w:top w:val="single" w:color="C9D3D1" w:sz="4"/>
+              <w:left w:val="single" w:color="C9D3D1" w:sz="4"/>
+              <w:bottom w:val="single" w:color="C9D3D1" w:sz="4"/>
+              <w:right w:val="single" w:color="C9D3D1" w:sz="4"/>
+            </w:tcBorders>
+            <w:tcMar>
+              <w:top w:type="dxa" w:w="70"/>
+              <w:left w:type="dxa" w:w="110"/>
+              <w:bottom w:type="dxa" w:w="70"/>
+              <w:right w:type="dxa" w:w="110"/>
+            </w:tcMar>
+          </w:tcPr>
+          <w:p>
+            <w:pPr>
+              <w:spacing w:after="0" w:line="260"/>
+            </w:pPr>
+            <w:r>
+              <w:rPr>
+                <w:rFonts w:ascii="Arial" w:cs="Arial" w:eastAsia="Arial" w:hAnsi="Arial"/>
+                <w:b w:val="false"/>
+                <w:bCs w:val="false"/>
+                <w:color w:val="1E2A30"/>
+                <w:sz w:val="19"/>
+                <w:szCs w:val="19"/>
+              </w:rPr>
+              <w:t xml:space="preserve">Geração da folha de pagamento</w:t>
+            </w:r>
+          </w:p>
+        </w:tc>
+        <w:tc>
+          <w:tcPr>
+            <w:tcW w:type="dxa" w:w="5272"/>
+            <w:tcBorders>
+              <w:top w:val="single" w:color="C9D3D1" w:sz="4"/>
+              <w:left w:val="single" w:color="C9D3D1" w:sz="4"/>
+              <w:bottom w:val="single" w:color="C9D3D1" w:sz="4"/>
+              <w:right w:val="single" w:color="C9D3D1" w:sz="4"/>
+            </w:tcBorders>
+            <w:tcMar>
+              <w:top w:type="dxa" w:w="70"/>
+              <w:left w:type="dxa" w:w="110"/>
+              <w:bottom w:type="dxa" w:w="70"/>
+              <w:right w:type="dxa" w:w="110"/>
+            </w:tcMar>
+          </w:tcPr>
+          <w:p>
+            <w:pPr>
+              <w:spacing w:after="0" w:line="260"/>
+            </w:pPr>
+            <w:r>
+              <w:rPr>
+                <w:rFonts w:ascii="Arial" w:cs="Arial" w:eastAsia="Arial" w:hAnsi="Arial"/>
+                <w:b w:val="false"/>
+                <w:bCs w:val="false"/>
+                <w:color w:val="1E2A30"/>
+                <w:sz w:val="19"/>
+                <w:szCs w:val="19"/>
+              </w:rPr>
+              <w:t xml:space="preserve">Gerar a folha individual de um colaborador, com salário bruto, descontos e salário líquido.</w:t>
             </w:r>
           </w:p>
         </w:tc>
@@ -2615,7 +2881,7 @@
         </w:trPr>
         <w:tc>
           <w:tcPr>
-            <w:tcW w:type="dxa" w:w="1400"/>
+            <w:tcW w:type="dxa" w:w="1100"/>
             <w:tcBorders>
               <w:top w:val="single" w:color="C9D3D1" w:sz="4"/>
               <w:left w:val="single" w:color="C9D3D1" w:sz="4"/>
@@ -2648,34 +2914,67 @@
         </w:tc>
         <w:tc>
           <w:tcPr>
-            <w:tcW w:type="dxa" w:w="7672"/>
-            <w:tcBorders>
-              <w:top w:val="single" w:color="C9D3D1" w:sz="4"/>
-              <w:left w:val="single" w:color="C9D3D1" w:sz="4"/>
-              <w:bottom w:val="single" w:color="C9D3D1" w:sz="4"/>
-              <w:right w:val="single" w:color="C9D3D1" w:sz="4"/>
-            </w:tcBorders>
-            <w:tcMar>
-              <w:top w:type="dxa" w:w="70"/>
-              <w:left w:type="dxa" w:w="110"/>
-              <w:bottom w:type="dxa" w:w="70"/>
-              <w:right w:type="dxa" w:w="110"/>
-            </w:tcMar>
-          </w:tcPr>
-          <w:p>
-            <w:pPr>
-              <w:spacing w:after="0" w:line="260"/>
-            </w:pPr>
-            <w:r>
-              <w:rPr>
-                <w:rFonts w:ascii="Arial" w:cs="Arial" w:eastAsia="Arial" w:hAnsi="Arial"/>
-                <w:b w:val="false"/>
-                <w:bCs w:val="false"/>
-                <w:color w:val="1E2A30"/>
-                <w:sz w:val="19"/>
-                <w:szCs w:val="19"/>
-              </w:rPr>
-              <w:t xml:space="preserve">Emissão de Resumo da Folha</w:t>
+            <w:tcW w:type="dxa" w:w="2700"/>
+            <w:tcBorders>
+              <w:top w:val="single" w:color="C9D3D1" w:sz="4"/>
+              <w:left w:val="single" w:color="C9D3D1" w:sz="4"/>
+              <w:bottom w:val="single" w:color="C9D3D1" w:sz="4"/>
+              <w:right w:val="single" w:color="C9D3D1" w:sz="4"/>
+            </w:tcBorders>
+            <w:tcMar>
+              <w:top w:type="dxa" w:w="70"/>
+              <w:left w:type="dxa" w:w="110"/>
+              <w:bottom w:type="dxa" w:w="70"/>
+              <w:right w:type="dxa" w:w="110"/>
+            </w:tcMar>
+          </w:tcPr>
+          <w:p>
+            <w:pPr>
+              <w:spacing w:after="0" w:line="260"/>
+            </w:pPr>
+            <w:r>
+              <w:rPr>
+                <w:rFonts w:ascii="Arial" w:cs="Arial" w:eastAsia="Arial" w:hAnsi="Arial"/>
+                <w:b w:val="false"/>
+                <w:bCs w:val="false"/>
+                <w:color w:val="1E2A30"/>
+                <w:sz w:val="19"/>
+                <w:szCs w:val="19"/>
+              </w:rPr>
+              <w:t xml:space="preserve">Emissão de resumo da folha</w:t>
+            </w:r>
+          </w:p>
+        </w:tc>
+        <w:tc>
+          <w:tcPr>
+            <w:tcW w:type="dxa" w:w="5272"/>
+            <w:tcBorders>
+              <w:top w:val="single" w:color="C9D3D1" w:sz="4"/>
+              <w:left w:val="single" w:color="C9D3D1" w:sz="4"/>
+              <w:bottom w:val="single" w:color="C9D3D1" w:sz="4"/>
+              <w:right w:val="single" w:color="C9D3D1" w:sz="4"/>
+            </w:tcBorders>
+            <w:tcMar>
+              <w:top w:type="dxa" w:w="70"/>
+              <w:left w:type="dxa" w:w="110"/>
+              <w:bottom w:type="dxa" w:w="70"/>
+              <w:right w:type="dxa" w:w="110"/>
+            </w:tcMar>
+          </w:tcPr>
+          <w:p>
+            <w:pPr>
+              <w:spacing w:after="0" w:line="260"/>
+            </w:pPr>
+            <w:r>
+              <w:rPr>
+                <w:rFonts w:ascii="Arial" w:cs="Arial" w:eastAsia="Arial" w:hAnsi="Arial"/>
+                <w:b w:val="false"/>
+                <w:bCs w:val="false"/>
+                <w:color w:val="1E2A30"/>
+                <w:sz w:val="19"/>
+                <w:szCs w:val="19"/>
+              </w:rPr>
+              <w:t xml:space="preserve">Emitir o resumo consolidado com todos os colaboradores e o total geral da folha.</w:t>
             </w:r>
           </w:p>
         </w:tc>
@@ -2686,7 +2985,7 @@
         </w:trPr>
         <w:tc>
           <w:tcPr>
-            <w:tcW w:type="dxa" w:w="1400"/>
+            <w:tcW w:type="dxa" w:w="1100"/>
             <w:tcBorders>
               <w:top w:val="single" w:color="C9D3D1" w:sz="4"/>
               <w:left w:val="single" w:color="C9D3D1" w:sz="4"/>
@@ -2719,34 +3018,67 @@
         </w:tc>
         <w:tc>
           <w:tcPr>
-            <w:tcW w:type="dxa" w:w="7672"/>
-            <w:tcBorders>
-              <w:top w:val="single" w:color="C9D3D1" w:sz="4"/>
-              <w:left w:val="single" w:color="C9D3D1" w:sz="4"/>
-              <w:bottom w:val="single" w:color="C9D3D1" w:sz="4"/>
-              <w:right w:val="single" w:color="C9D3D1" w:sz="4"/>
-            </w:tcBorders>
-            <w:tcMar>
-              <w:top w:type="dxa" w:w="70"/>
-              <w:left w:type="dxa" w:w="110"/>
-              <w:bottom w:type="dxa" w:w="70"/>
-              <w:right w:type="dxa" w:w="110"/>
-            </w:tcMar>
-          </w:tcPr>
-          <w:p>
-            <w:pPr>
-              <w:spacing w:after="0" w:line="260"/>
-            </w:pPr>
-            <w:r>
-              <w:rPr>
-                <w:rFonts w:ascii="Arial" w:cs="Arial" w:eastAsia="Arial" w:hAnsi="Arial"/>
-                <w:b w:val="false"/>
-                <w:bCs w:val="false"/>
-                <w:color w:val="1E2A30"/>
-                <w:sz w:val="19"/>
-                <w:szCs w:val="19"/>
-              </w:rPr>
-              <w:t xml:space="preserve">Manutenção de Cadastros</w:t>
+            <w:tcW w:type="dxa" w:w="2700"/>
+            <w:tcBorders>
+              <w:top w:val="single" w:color="C9D3D1" w:sz="4"/>
+              <w:left w:val="single" w:color="C9D3D1" w:sz="4"/>
+              <w:bottom w:val="single" w:color="C9D3D1" w:sz="4"/>
+              <w:right w:val="single" w:color="C9D3D1" w:sz="4"/>
+            </w:tcBorders>
+            <w:tcMar>
+              <w:top w:type="dxa" w:w="70"/>
+              <w:left w:type="dxa" w:w="110"/>
+              <w:bottom w:type="dxa" w:w="70"/>
+              <w:right w:type="dxa" w:w="110"/>
+            </w:tcMar>
+          </w:tcPr>
+          <w:p>
+            <w:pPr>
+              <w:spacing w:after="0" w:line="260"/>
+            </w:pPr>
+            <w:r>
+              <w:rPr>
+                <w:rFonts w:ascii="Arial" w:cs="Arial" w:eastAsia="Arial" w:hAnsi="Arial"/>
+                <w:b w:val="false"/>
+                <w:bCs w:val="false"/>
+                <w:color w:val="1E2A30"/>
+                <w:sz w:val="19"/>
+                <w:szCs w:val="19"/>
+              </w:rPr>
+              <w:t xml:space="preserve">Manutenção de cadastros</w:t>
+            </w:r>
+          </w:p>
+        </w:tc>
+        <w:tc>
+          <w:tcPr>
+            <w:tcW w:type="dxa" w:w="5272"/>
+            <w:tcBorders>
+              <w:top w:val="single" w:color="C9D3D1" w:sz="4"/>
+              <w:left w:val="single" w:color="C9D3D1" w:sz="4"/>
+              <w:bottom w:val="single" w:color="C9D3D1" w:sz="4"/>
+              <w:right w:val="single" w:color="C9D3D1" w:sz="4"/>
+            </w:tcBorders>
+            <w:tcMar>
+              <w:top w:type="dxa" w:w="70"/>
+              <w:left w:type="dxa" w:w="110"/>
+              <w:bottom w:type="dxa" w:w="70"/>
+              <w:right w:type="dxa" w:w="110"/>
+            </w:tcMar>
+          </w:tcPr>
+          <w:p>
+            <w:pPr>
+              <w:spacing w:after="0" w:line="260"/>
+            </w:pPr>
+            <w:r>
+              <w:rPr>
+                <w:rFonts w:ascii="Arial" w:cs="Arial" w:eastAsia="Arial" w:hAnsi="Arial"/>
+                <w:b w:val="false"/>
+                <w:bCs w:val="false"/>
+                <w:color w:val="1E2A30"/>
+                <w:sz w:val="19"/>
+                <w:szCs w:val="19"/>
+              </w:rPr>
+              <w:t xml:space="preserve">Alterar os dados e excluir o cadastro de um colaborador.</w:t>
             </w:r>
           </w:p>
         </w:tc>
@@ -2757,7 +3089,7 @@
         </w:trPr>
         <w:tc>
           <w:tcPr>
-            <w:tcW w:type="dxa" w:w="1400"/>
+            <w:tcW w:type="dxa" w:w="1100"/>
             <w:tcBorders>
               <w:top w:val="single" w:color="C9D3D1" w:sz="4"/>
               <w:left w:val="single" w:color="C9D3D1" w:sz="4"/>
@@ -2790,34 +3122,67 @@
         </w:tc>
         <w:tc>
           <w:tcPr>
-            <w:tcW w:type="dxa" w:w="7672"/>
-            <w:tcBorders>
-              <w:top w:val="single" w:color="C9D3D1" w:sz="4"/>
-              <w:left w:val="single" w:color="C9D3D1" w:sz="4"/>
-              <w:bottom w:val="single" w:color="C9D3D1" w:sz="4"/>
-              <w:right w:val="single" w:color="C9D3D1" w:sz="4"/>
-            </w:tcBorders>
-            <w:tcMar>
-              <w:top w:type="dxa" w:w="70"/>
-              <w:left w:type="dxa" w:w="110"/>
-              <w:bottom w:type="dxa" w:w="70"/>
-              <w:right w:type="dxa" w:w="110"/>
-            </w:tcMar>
-          </w:tcPr>
-          <w:p>
-            <w:pPr>
-              <w:spacing w:after="0" w:line="260"/>
-            </w:pPr>
-            <w:r>
-              <w:rPr>
-                <w:rFonts w:ascii="Arial" w:cs="Arial" w:eastAsia="Arial" w:hAnsi="Arial"/>
-                <w:b w:val="false"/>
-                <w:bCs w:val="false"/>
-                <w:color w:val="1E2A30"/>
-                <w:sz w:val="19"/>
-                <w:szCs w:val="19"/>
-              </w:rPr>
-              <w:t xml:space="preserve">Cálculo de descontos (INSS e IRRF) e do salário líquido (funcionalidade extra)</w:t>
+            <w:tcW w:type="dxa" w:w="2700"/>
+            <w:tcBorders>
+              <w:top w:val="single" w:color="C9D3D1" w:sz="4"/>
+              <w:left w:val="single" w:color="C9D3D1" w:sz="4"/>
+              <w:bottom w:val="single" w:color="C9D3D1" w:sz="4"/>
+              <w:right w:val="single" w:color="C9D3D1" w:sz="4"/>
+            </w:tcBorders>
+            <w:tcMar>
+              <w:top w:type="dxa" w:w="70"/>
+              <w:left w:type="dxa" w:w="110"/>
+              <w:bottom w:type="dxa" w:w="70"/>
+              <w:right w:type="dxa" w:w="110"/>
+            </w:tcMar>
+          </w:tcPr>
+          <w:p>
+            <w:pPr>
+              <w:spacing w:after="0" w:line="260"/>
+            </w:pPr>
+            <w:r>
+              <w:rPr>
+                <w:rFonts w:ascii="Arial" w:cs="Arial" w:eastAsia="Arial" w:hAnsi="Arial"/>
+                <w:b w:val="false"/>
+                <w:bCs w:val="false"/>
+                <w:color w:val="1E2A30"/>
+                <w:sz w:val="19"/>
+                <w:szCs w:val="19"/>
+              </w:rPr>
+              <w:t xml:space="preserve">Descontos e salário líquido</w:t>
+            </w:r>
+          </w:p>
+        </w:tc>
+        <w:tc>
+          <w:tcPr>
+            <w:tcW w:type="dxa" w:w="5272"/>
+            <w:tcBorders>
+              <w:top w:val="single" w:color="C9D3D1" w:sz="4"/>
+              <w:left w:val="single" w:color="C9D3D1" w:sz="4"/>
+              <w:bottom w:val="single" w:color="C9D3D1" w:sz="4"/>
+              <w:right w:val="single" w:color="C9D3D1" w:sz="4"/>
+            </w:tcBorders>
+            <w:tcMar>
+              <w:top w:type="dxa" w:w="70"/>
+              <w:left w:type="dxa" w:w="110"/>
+              <w:bottom w:type="dxa" w:w="70"/>
+              <w:right w:type="dxa" w:w="110"/>
+            </w:tcMar>
+          </w:tcPr>
+          <w:p>
+            <w:pPr>
+              <w:spacing w:after="0" w:line="260"/>
+            </w:pPr>
+            <w:r>
+              <w:rPr>
+                <w:rFonts w:ascii="Arial" w:cs="Arial" w:eastAsia="Arial" w:hAnsi="Arial"/>
+                <w:b w:val="false"/>
+                <w:bCs w:val="false"/>
+                <w:color w:val="1E2A30"/>
+                <w:sz w:val="19"/>
+                <w:szCs w:val="19"/>
+              </w:rPr>
+              <w:t xml:space="preserve">Calcular INSS, IRRF e salário líquido (funcionalidade extra, além do pedido pelo cliente).</w:t>
             </w:r>
           </w:p>
         </w:tc>
@@ -4283,7 +4648,7 @@
                 <w:sz w:val="19"/>
                 <w:szCs w:val="19"/>
               </w:rPr>
-              <w:t xml:space="preserve">O sistema cadastra o colaborador por produção com quantidade produzida e valor por unidade, nenhum negativo; bruto = quantidade × valor por unidade.</w:t>
+              <w:t xml:space="preserve">O sistema cadastra o colaborador por produção com salário base, quantidade produzida e valor por unidade, nenhum negativo; bruto = salário base + quantidade produzida × valor por unidade.</w:t>
             </w:r>
           </w:p>
         </w:tc>
@@ -4354,7 +4719,7 @@
                 <w:sz w:val="19"/>
                 <w:szCs w:val="19"/>
               </w:rPr>
-              <w:t xml:space="preserve">O sistema consulta o colaborador pela matrícula e informa quando nenhum colaborador é encontrado.</w:t>
+              <w:t xml:space="preserve">O sistema lista todos os colaboradores com matrícula, nome, tipo, valores informados no cadastro e salário bruto; localiza um colaborador pela matrícula; e informa quando nenhum colaborador é encontrado.</w:t>
             </w:r>
           </w:p>
         </w:tc>
@@ -5552,7 +5917,7 @@
                 <w:sz w:val="18"/>
                 <w:szCs w:val="18"/>
               </w:rPr>
-              <w:t xml:space="preserve">RN006, RN007, RN008</w:t>
+              <w:t xml:space="preserve">RN003, RN006, RN007, RN008</w:t>
             </w:r>
           </w:p>
         </w:tc>
@@ -5689,7 +6054,7 @@
                 <w:sz w:val="18"/>
                 <w:szCs w:val="18"/>
               </w:rPr>
-              <w:t xml:space="preserve">Consulta de colaboradores</w:t>
+              <w:t xml:space="preserve">Consulta e listagem de colaboradores</w:t>
             </w:r>
           </w:p>
         </w:tc>
@@ -5755,7 +6120,7 @@
                 <w:sz w:val="18"/>
                 <w:szCs w:val="18"/>
               </w:rPr>
-              <w:t xml:space="preserve">CT005</w:t>
+              <w:t xml:space="preserve">CT005, CT022</w:t>
             </w:r>
           </w:p>
         </w:tc>
@@ -5925,7 +6290,7 @@
                 <w:sz w:val="18"/>
                 <w:szCs w:val="18"/>
               </w:rPr>
-              <w:t xml:space="preserve">CT006, CT017, CT018</w:t>
+              <w:t xml:space="preserve">CT003, CT004, CT006, CT017, CT018</w:t>
             </w:r>
           </w:p>
         </w:tc>
@@ -6369,7 +6734,7 @@
                 <w:sz w:val="18"/>
                 <w:szCs w:val="18"/>
               </w:rPr>
-              <w:t xml:space="preserve">Manutenção de cadastros</w:t>
+              <w:t xml:space="preserve">Alteração e exclusão de cadastros</w:t>
             </w:r>
           </w:p>
         </w:tc>
@@ -6402,7 +6767,7 @@
                 <w:sz w:val="18"/>
                 <w:szCs w:val="18"/>
               </w:rPr>
-              <w:t xml:space="preserve">RN001, RN002</w:t>
+              <w:t xml:space="preserve">RN001 a RN007</w:t>
             </w:r>
           </w:p>
         </w:tc>
@@ -6435,7 +6800,7 @@
                 <w:sz w:val="18"/>
                 <w:szCs w:val="18"/>
               </w:rPr>
-              <w:t xml:space="preserve">CT009</w:t>
+              <w:t xml:space="preserve">CT009, CT021</w:t>
             </w:r>
           </w:p>
         </w:tc>
@@ -6676,7 +7041,7 @@
                 <w:sz w:val="18"/>
                 <w:szCs w:val="18"/>
               </w:rPr>
-              <w:t xml:space="preserve">RNF003</w:t>
+              <w:t xml:space="preserve">RNF001</w:t>
             </w:r>
           </w:p>
         </w:tc>
@@ -6709,7 +7074,7 @@
                 <w:sz w:val="18"/>
                 <w:szCs w:val="18"/>
               </w:rPr>
-              <w:t xml:space="preserve">Persistência</w:t>
+              <w:t xml:space="preserve">Interface amigável e intuitiva</w:t>
             </w:r>
           </w:p>
         </w:tc>
@@ -6775,7 +7140,517 @@
                 <w:sz w:val="18"/>
                 <w:szCs w:val="18"/>
               </w:rPr>
-              <w:t xml:space="preserve">CT020</w:t>
+              <w:t xml:space="preserve">CT024</w:t>
+            </w:r>
+          </w:p>
+        </w:tc>
+        <w:tc>
+          <w:tcPr>
+            <w:tcW w:type="dxa" w:w="1200"/>
+            <w:tcBorders>
+              <w:top w:val="single" w:color="C9D3D1" w:sz="4"/>
+              <w:left w:val="single" w:color="C9D3D1" w:sz="4"/>
+              <w:bottom w:val="single" w:color="C9D3D1" w:sz="4"/>
+              <w:right w:val="single" w:color="C9D3D1" w:sz="4"/>
+            </w:tcBorders>
+            <w:tcMar>
+              <w:top w:type="dxa" w:w="70"/>
+              <w:left w:type="dxa" w:w="110"/>
+              <w:bottom w:type="dxa" w:w="70"/>
+              <w:right w:type="dxa" w:w="110"/>
+            </w:tcMar>
+          </w:tcPr>
+          <w:p>
+            <w:pPr>
+              <w:spacing w:after="0" w:line="260"/>
+            </w:pPr>
+            <w:r>
+              <w:rPr>
+                <w:rFonts w:ascii="Arial" w:cs="Arial" w:eastAsia="Arial" w:hAnsi="Arial"/>
+                <w:b w:val="false"/>
+                <w:bCs w:val="false"/>
+                <w:color w:val="1E2A30"/>
+                <w:sz w:val="18"/>
+                <w:szCs w:val="18"/>
+              </w:rPr>
+              <w:t xml:space="preserve">Não iniciado</w:t>
+            </w:r>
+          </w:p>
+        </w:tc>
+      </w:tr>
+      <w:tr>
+        <w:trPr>
+          <w:tblHeader w:val="off"/>
+        </w:trPr>
+        <w:tc>
+          <w:tcPr>
+            <w:tcW w:type="dxa" w:w="1050"/>
+            <w:tcBorders>
+              <w:top w:val="single" w:color="C9D3D1" w:sz="4"/>
+              <w:left w:val="single" w:color="C9D3D1" w:sz="4"/>
+              <w:bottom w:val="single" w:color="C9D3D1" w:sz="4"/>
+              <w:right w:val="single" w:color="C9D3D1" w:sz="4"/>
+            </w:tcBorders>
+            <w:tcMar>
+              <w:top w:type="dxa" w:w="70"/>
+              <w:left w:type="dxa" w:w="110"/>
+              <w:bottom w:type="dxa" w:w="70"/>
+              <w:right w:type="dxa" w:w="110"/>
+            </w:tcMar>
+          </w:tcPr>
+          <w:p>
+            <w:pPr>
+              <w:spacing w:after="0" w:line="260"/>
+            </w:pPr>
+            <w:r>
+              <w:rPr>
+                <w:rFonts w:ascii="Arial" w:cs="Arial" w:eastAsia="Arial" w:hAnsi="Arial"/>
+                <w:b/>
+                <w:bCs/>
+                <w:color w:val="1E2A30"/>
+                <w:sz w:val="18"/>
+                <w:szCs w:val="18"/>
+              </w:rPr>
+              <w:t xml:space="preserve">RNF002</w:t>
+            </w:r>
+          </w:p>
+        </w:tc>
+        <w:tc>
+          <w:tcPr>
+            <w:tcW w:type="dxa" w:w="2500"/>
+            <w:tcBorders>
+              <w:top w:val="single" w:color="C9D3D1" w:sz="4"/>
+              <w:left w:val="single" w:color="C9D3D1" w:sz="4"/>
+              <w:bottom w:val="single" w:color="C9D3D1" w:sz="4"/>
+              <w:right w:val="single" w:color="C9D3D1" w:sz="4"/>
+            </w:tcBorders>
+            <w:tcMar>
+              <w:top w:type="dxa" w:w="70"/>
+              <w:left w:type="dxa" w:w="110"/>
+              <w:bottom w:type="dxa" w:w="70"/>
+              <w:right w:type="dxa" w:w="110"/>
+            </w:tcMar>
+          </w:tcPr>
+          <w:p>
+            <w:pPr>
+              <w:spacing w:after="0" w:line="260"/>
+            </w:pPr>
+            <w:r>
+              <w:rPr>
+                <w:rFonts w:ascii="Arial" w:cs="Arial" w:eastAsia="Arial" w:hAnsi="Arial"/>
+                <w:b w:val="false"/>
+                <w:bCs w:val="false"/>
+                <w:color w:val="1E2A30"/>
+                <w:sz w:val="18"/>
+                <w:szCs w:val="18"/>
+              </w:rPr>
+              <w:t xml:space="preserve">Validação antes do cálculo</w:t>
+            </w:r>
+          </w:p>
+        </w:tc>
+        <w:tc>
+          <w:tcPr>
+            <w:tcW w:type="dxa" w:w="2050"/>
+            <w:tcBorders>
+              <w:top w:val="single" w:color="C9D3D1" w:sz="4"/>
+              <w:left w:val="single" w:color="C9D3D1" w:sz="4"/>
+              <w:bottom w:val="single" w:color="C9D3D1" w:sz="4"/>
+              <w:right w:val="single" w:color="C9D3D1" w:sz="4"/>
+            </w:tcBorders>
+            <w:tcMar>
+              <w:top w:type="dxa" w:w="70"/>
+              <w:left w:type="dxa" w:w="110"/>
+              <w:bottom w:type="dxa" w:w="70"/>
+              <w:right w:type="dxa" w:w="110"/>
+            </w:tcMar>
+          </w:tcPr>
+          <w:p>
+            <w:pPr>
+              <w:spacing w:after="0" w:line="260"/>
+            </w:pPr>
+            <w:r>
+              <w:rPr>
+                <w:rFonts w:ascii="Arial" w:cs="Arial" w:eastAsia="Arial" w:hAnsi="Arial"/>
+                <w:b w:val="false"/>
+                <w:bCs w:val="false"/>
+                <w:color w:val="1E2A30"/>
+                <w:sz w:val="18"/>
+                <w:szCs w:val="18"/>
+              </w:rPr>
+              <w:t xml:space="preserve">RN002 a RN007</w:t>
+            </w:r>
+          </w:p>
+        </w:tc>
+        <w:tc>
+          <w:tcPr>
+            <w:tcW w:type="dxa" w:w="2272"/>
+            <w:tcBorders>
+              <w:top w:val="single" w:color="C9D3D1" w:sz="4"/>
+              <w:left w:val="single" w:color="C9D3D1" w:sz="4"/>
+              <w:bottom w:val="single" w:color="C9D3D1" w:sz="4"/>
+              <w:right w:val="single" w:color="C9D3D1" w:sz="4"/>
+            </w:tcBorders>
+            <w:tcMar>
+              <w:top w:type="dxa" w:w="70"/>
+              <w:left w:type="dxa" w:w="110"/>
+              <w:bottom w:type="dxa" w:w="70"/>
+              <w:right w:type="dxa" w:w="110"/>
+            </w:tcMar>
+          </w:tcPr>
+          <w:p>
+            <w:pPr>
+              <w:spacing w:after="0" w:line="260"/>
+            </w:pPr>
+            <w:r>
+              <w:rPr>
+                <w:rFonts w:ascii="Arial" w:cs="Arial" w:eastAsia="Arial" w:hAnsi="Arial"/>
+                <w:b w:val="false"/>
+                <w:bCs w:val="false"/>
+                <w:color w:val="1E2A30"/>
+                <w:sz w:val="18"/>
+                <w:szCs w:val="18"/>
+              </w:rPr>
+              <w:t xml:space="preserve">CT011 a CT016</w:t>
+            </w:r>
+          </w:p>
+        </w:tc>
+        <w:tc>
+          <w:tcPr>
+            <w:tcW w:type="dxa" w:w="1200"/>
+            <w:tcBorders>
+              <w:top w:val="single" w:color="C9D3D1" w:sz="4"/>
+              <w:left w:val="single" w:color="C9D3D1" w:sz="4"/>
+              <w:bottom w:val="single" w:color="C9D3D1" w:sz="4"/>
+              <w:right w:val="single" w:color="C9D3D1" w:sz="4"/>
+            </w:tcBorders>
+            <w:tcMar>
+              <w:top w:type="dxa" w:w="70"/>
+              <w:left w:type="dxa" w:w="110"/>
+              <w:bottom w:type="dxa" w:w="70"/>
+              <w:right w:type="dxa" w:w="110"/>
+            </w:tcMar>
+          </w:tcPr>
+          <w:p>
+            <w:pPr>
+              <w:spacing w:after="0" w:line="260"/>
+            </w:pPr>
+            <w:r>
+              <w:rPr>
+                <w:rFonts w:ascii="Arial" w:cs="Arial" w:eastAsia="Arial" w:hAnsi="Arial"/>
+                <w:b w:val="false"/>
+                <w:bCs w:val="false"/>
+                <w:color w:val="1E2A30"/>
+                <w:sz w:val="18"/>
+                <w:szCs w:val="18"/>
+              </w:rPr>
+              <w:t xml:space="preserve">Não iniciado</w:t>
+            </w:r>
+          </w:p>
+        </w:tc>
+      </w:tr>
+      <w:tr>
+        <w:trPr>
+          <w:tblHeader w:val="off"/>
+        </w:trPr>
+        <w:tc>
+          <w:tcPr>
+            <w:tcW w:type="dxa" w:w="1050"/>
+            <w:tcBorders>
+              <w:top w:val="single" w:color="C9D3D1" w:sz="4"/>
+              <w:left w:val="single" w:color="C9D3D1" w:sz="4"/>
+              <w:bottom w:val="single" w:color="C9D3D1" w:sz="4"/>
+              <w:right w:val="single" w:color="C9D3D1" w:sz="4"/>
+            </w:tcBorders>
+            <w:tcMar>
+              <w:top w:type="dxa" w:w="70"/>
+              <w:left w:type="dxa" w:w="110"/>
+              <w:bottom w:type="dxa" w:w="70"/>
+              <w:right w:type="dxa" w:w="110"/>
+            </w:tcMar>
+          </w:tcPr>
+          <w:p>
+            <w:pPr>
+              <w:spacing w:after="0" w:line="260"/>
+            </w:pPr>
+            <w:r>
+              <w:rPr>
+                <w:rFonts w:ascii="Arial" w:cs="Arial" w:eastAsia="Arial" w:hAnsi="Arial"/>
+                <w:b/>
+                <w:bCs/>
+                <w:color w:val="1E2A30"/>
+                <w:sz w:val="18"/>
+                <w:szCs w:val="18"/>
+              </w:rPr>
+              <w:t xml:space="preserve">RNF003</w:t>
+            </w:r>
+          </w:p>
+        </w:tc>
+        <w:tc>
+          <w:tcPr>
+            <w:tcW w:type="dxa" w:w="2500"/>
+            <w:tcBorders>
+              <w:top w:val="single" w:color="C9D3D1" w:sz="4"/>
+              <w:left w:val="single" w:color="C9D3D1" w:sz="4"/>
+              <w:bottom w:val="single" w:color="C9D3D1" w:sz="4"/>
+              <w:right w:val="single" w:color="C9D3D1" w:sz="4"/>
+            </w:tcBorders>
+            <w:tcMar>
+              <w:top w:type="dxa" w:w="70"/>
+              <w:left w:type="dxa" w:w="110"/>
+              <w:bottom w:type="dxa" w:w="70"/>
+              <w:right w:type="dxa" w:w="110"/>
+            </w:tcMar>
+          </w:tcPr>
+          <w:p>
+            <w:pPr>
+              <w:spacing w:after="0" w:line="260"/>
+            </w:pPr>
+            <w:r>
+              <w:rPr>
+                <w:rFonts w:ascii="Arial" w:cs="Arial" w:eastAsia="Arial" w:hAnsi="Arial"/>
+                <w:b w:val="false"/>
+                <w:bCs w:val="false"/>
+                <w:color w:val="1E2A30"/>
+                <w:sz w:val="18"/>
+                <w:szCs w:val="18"/>
+              </w:rPr>
+              <w:t xml:space="preserve">Persistência</w:t>
+            </w:r>
+          </w:p>
+        </w:tc>
+        <w:tc>
+          <w:tcPr>
+            <w:tcW w:type="dxa" w:w="2050"/>
+            <w:tcBorders>
+              <w:top w:val="single" w:color="C9D3D1" w:sz="4"/>
+              <w:left w:val="single" w:color="C9D3D1" w:sz="4"/>
+              <w:bottom w:val="single" w:color="C9D3D1" w:sz="4"/>
+              <w:right w:val="single" w:color="C9D3D1" w:sz="4"/>
+            </w:tcBorders>
+            <w:tcMar>
+              <w:top w:type="dxa" w:w="70"/>
+              <w:left w:type="dxa" w:w="110"/>
+              <w:bottom w:type="dxa" w:w="70"/>
+              <w:right w:type="dxa" w:w="110"/>
+            </w:tcMar>
+          </w:tcPr>
+          <w:p>
+            <w:pPr>
+              <w:spacing w:after="0" w:line="260"/>
+            </w:pPr>
+            <w:r>
+              <w:rPr>
+                <w:rFonts w:ascii="Arial" w:cs="Arial" w:eastAsia="Arial" w:hAnsi="Arial"/>
+                <w:b w:val="false"/>
+                <w:bCs w:val="false"/>
+                <w:color w:val="1E2A30"/>
+                <w:sz w:val="18"/>
+                <w:szCs w:val="18"/>
+              </w:rPr>
+              <w:t xml:space="preserve">—</w:t>
+            </w:r>
+          </w:p>
+        </w:tc>
+        <w:tc>
+          <w:tcPr>
+            <w:tcW w:type="dxa" w:w="2272"/>
+            <w:tcBorders>
+              <w:top w:val="single" w:color="C9D3D1" w:sz="4"/>
+              <w:left w:val="single" w:color="C9D3D1" w:sz="4"/>
+              <w:bottom w:val="single" w:color="C9D3D1" w:sz="4"/>
+              <w:right w:val="single" w:color="C9D3D1" w:sz="4"/>
+            </w:tcBorders>
+            <w:tcMar>
+              <w:top w:type="dxa" w:w="70"/>
+              <w:left w:type="dxa" w:w="110"/>
+              <w:bottom w:type="dxa" w:w="70"/>
+              <w:right w:type="dxa" w:w="110"/>
+            </w:tcMar>
+          </w:tcPr>
+          <w:p>
+            <w:pPr>
+              <w:spacing w:after="0" w:line="260"/>
+            </w:pPr>
+            <w:r>
+              <w:rPr>
+                <w:rFonts w:ascii="Arial" w:cs="Arial" w:eastAsia="Arial" w:hAnsi="Arial"/>
+                <w:b w:val="false"/>
+                <w:bCs w:val="false"/>
+                <w:color w:val="1E2A30"/>
+                <w:sz w:val="18"/>
+                <w:szCs w:val="18"/>
+              </w:rPr>
+              <w:t xml:space="preserve">CT009, CT020, CT021</w:t>
+            </w:r>
+          </w:p>
+        </w:tc>
+        <w:tc>
+          <w:tcPr>
+            <w:tcW w:type="dxa" w:w="1200"/>
+            <w:tcBorders>
+              <w:top w:val="single" w:color="C9D3D1" w:sz="4"/>
+              <w:left w:val="single" w:color="C9D3D1" w:sz="4"/>
+              <w:bottom w:val="single" w:color="C9D3D1" w:sz="4"/>
+              <w:right w:val="single" w:color="C9D3D1" w:sz="4"/>
+            </w:tcBorders>
+            <w:tcMar>
+              <w:top w:type="dxa" w:w="70"/>
+              <w:left w:type="dxa" w:w="110"/>
+              <w:bottom w:type="dxa" w:w="70"/>
+              <w:right w:type="dxa" w:w="110"/>
+            </w:tcMar>
+          </w:tcPr>
+          <w:p>
+            <w:pPr>
+              <w:spacing w:after="0" w:line="260"/>
+            </w:pPr>
+            <w:r>
+              <w:rPr>
+                <w:rFonts w:ascii="Arial" w:cs="Arial" w:eastAsia="Arial" w:hAnsi="Arial"/>
+                <w:b w:val="false"/>
+                <w:bCs w:val="false"/>
+                <w:color w:val="1E2A30"/>
+                <w:sz w:val="18"/>
+                <w:szCs w:val="18"/>
+              </w:rPr>
+              <w:t xml:space="preserve">Não iniciado</w:t>
+            </w:r>
+          </w:p>
+        </w:tc>
+      </w:tr>
+      <w:tr>
+        <w:trPr>
+          <w:tblHeader w:val="off"/>
+        </w:trPr>
+        <w:tc>
+          <w:tcPr>
+            <w:tcW w:type="dxa" w:w="1050"/>
+            <w:tcBorders>
+              <w:top w:val="single" w:color="C9D3D1" w:sz="4"/>
+              <w:left w:val="single" w:color="C9D3D1" w:sz="4"/>
+              <w:bottom w:val="single" w:color="C9D3D1" w:sz="4"/>
+              <w:right w:val="single" w:color="C9D3D1" w:sz="4"/>
+            </w:tcBorders>
+            <w:tcMar>
+              <w:top w:type="dxa" w:w="70"/>
+              <w:left w:type="dxa" w:w="110"/>
+              <w:bottom w:type="dxa" w:w="70"/>
+              <w:right w:type="dxa" w:w="110"/>
+            </w:tcMar>
+          </w:tcPr>
+          <w:p>
+            <w:pPr>
+              <w:spacing w:after="0" w:line="260"/>
+            </w:pPr>
+            <w:r>
+              <w:rPr>
+                <w:rFonts w:ascii="Arial" w:cs="Arial" w:eastAsia="Arial" w:hAnsi="Arial"/>
+                <w:b/>
+                <w:bCs/>
+                <w:color w:val="1E2A30"/>
+                <w:sz w:val="18"/>
+                <w:szCs w:val="18"/>
+              </w:rPr>
+              <w:t xml:space="preserve">RNF004</w:t>
+            </w:r>
+          </w:p>
+        </w:tc>
+        <w:tc>
+          <w:tcPr>
+            <w:tcW w:type="dxa" w:w="2500"/>
+            <w:tcBorders>
+              <w:top w:val="single" w:color="C9D3D1" w:sz="4"/>
+              <w:left w:val="single" w:color="C9D3D1" w:sz="4"/>
+              <w:bottom w:val="single" w:color="C9D3D1" w:sz="4"/>
+              <w:right w:val="single" w:color="C9D3D1" w:sz="4"/>
+            </w:tcBorders>
+            <w:tcMar>
+              <w:top w:type="dxa" w:w="70"/>
+              <w:left w:type="dxa" w:w="110"/>
+              <w:bottom w:type="dxa" w:w="70"/>
+              <w:right w:type="dxa" w:w="110"/>
+            </w:tcMar>
+          </w:tcPr>
+          <w:p>
+            <w:pPr>
+              <w:spacing w:after="0" w:line="260"/>
+            </w:pPr>
+            <w:r>
+              <w:rPr>
+                <w:rFonts w:ascii="Arial" w:cs="Arial" w:eastAsia="Arial" w:hAnsi="Arial"/>
+                <w:b w:val="false"/>
+                <w:bCs w:val="false"/>
+                <w:color w:val="1E2A30"/>
+                <w:sz w:val="18"/>
+                <w:szCs w:val="18"/>
+              </w:rPr>
+              <w:t xml:space="preserve">Novos tipos de remuneração sem alterar os cálculos</w:t>
+            </w:r>
+          </w:p>
+        </w:tc>
+        <w:tc>
+          <w:tcPr>
+            <w:tcW w:type="dxa" w:w="2050"/>
+            <w:tcBorders>
+              <w:top w:val="single" w:color="C9D3D1" w:sz="4"/>
+              <w:left w:val="single" w:color="C9D3D1" w:sz="4"/>
+              <w:bottom w:val="single" w:color="C9D3D1" w:sz="4"/>
+              <w:right w:val="single" w:color="C9D3D1" w:sz="4"/>
+            </w:tcBorders>
+            <w:tcMar>
+              <w:top w:type="dxa" w:w="70"/>
+              <w:left w:type="dxa" w:w="110"/>
+              <w:bottom w:type="dxa" w:w="70"/>
+              <w:right w:type="dxa" w:w="110"/>
+            </w:tcMar>
+          </w:tcPr>
+          <w:p>
+            <w:pPr>
+              <w:spacing w:after="0" w:line="260"/>
+            </w:pPr>
+            <w:r>
+              <w:rPr>
+                <w:rFonts w:ascii="Arial" w:cs="Arial" w:eastAsia="Arial" w:hAnsi="Arial"/>
+                <w:b w:val="false"/>
+                <w:bCs w:val="false"/>
+                <w:color w:val="1E2A30"/>
+                <w:sz w:val="18"/>
+                <w:szCs w:val="18"/>
+              </w:rPr>
+              <w:t xml:space="preserve">RN008</w:t>
+            </w:r>
+          </w:p>
+        </w:tc>
+        <w:tc>
+          <w:tcPr>
+            <w:tcW w:type="dxa" w:w="2272"/>
+            <w:tcBorders>
+              <w:top w:val="single" w:color="C9D3D1" w:sz="4"/>
+              <w:left w:val="single" w:color="C9D3D1" w:sz="4"/>
+              <w:bottom w:val="single" w:color="C9D3D1" w:sz="4"/>
+              <w:right w:val="single" w:color="C9D3D1" w:sz="4"/>
+            </w:tcBorders>
+            <w:tcMar>
+              <w:top w:type="dxa" w:w="70"/>
+              <w:left w:type="dxa" w:w="110"/>
+              <w:bottom w:type="dxa" w:w="70"/>
+              <w:right w:type="dxa" w:w="110"/>
+            </w:tcMar>
+          </w:tcPr>
+          <w:p>
+            <w:pPr>
+              <w:spacing w:after="0" w:line="260"/>
+            </w:pPr>
+            <w:r>
+              <w:rPr>
+                <w:rFonts w:ascii="Arial" w:cs="Arial" w:eastAsia="Arial" w:hAnsi="Arial"/>
+                <w:b w:val="false"/>
+                <w:bCs w:val="false"/>
+                <w:color w:val="1E2A30"/>
+                <w:sz w:val="18"/>
+                <w:szCs w:val="18"/>
+              </w:rPr>
+              <w:t xml:space="preserve">CT023</w:t>
             </w:r>
           </w:p>
         </w:tc>
@@ -7357,7 +8232,7 @@
                 <w:sz w:val="18"/>
                 <w:szCs w:val="18"/>
               </w:rPr>
-              <w:t xml:space="preserve">Localizar um colaborador pela matrícula (RF005)</w:t>
+              <w:t xml:space="preserve">Listar os colaboradores com dados cadastrais e remuneratórios e localizar um pela matrícula (RF005)</w:t>
             </w:r>
           </w:p>
         </w:tc>
@@ -8075,7 +8950,7 @@
       <w:r>
         <w:drawing>
           <wp:inline distT="0" distB="0" distL="0" distR="0">
-            <wp:extent cx="4476750" cy="3771900"/>
+            <wp:extent cx="4476750" cy="4924425"/>
             <wp:effectExtent t="0" r="0" b="0" l="0"/>
             <wp:docPr id="2" name=""/>
             <wp:cNvGraphicFramePr>
@@ -8100,7 +8975,7 @@
                   <pic:spPr bwMode="auto">
                     <a:xfrm>
                       <a:off x="0" y="0"/>
-                      <a:ext cx="4476750" cy="3771900"/>
+                      <a:ext cx="4476750" cy="4924425"/>
                     </a:xfrm>
                     <a:prstGeom prst="rect">
                       <a:avLst/>
@@ -8127,7 +9002,7 @@
           <w:sz w:val="18"/>
           <w:szCs w:val="18"/>
         </w:rPr>
-        <w:t xml:space="preserve">Figura 2 · Colaborador é abstrata; cada subclasse implementa o próprio cálculo do salário bruto (RNF004)</w:t>
+        <w:t xml:space="preserve">Figura 2 · Colaborador é abstrata e cada subclasse implementa o próprio cálculo do salário bruto (RNF004); a gravação fica no RepositorioSQLite</w:t>
       </w:r>
     </w:p>
     <w:p>
@@ -8157,7 +9032,7 @@
       <w:r>
         <w:drawing>
           <wp:inline distT="0" distB="0" distL="0" distR="0">
-            <wp:extent cx="5143500" cy="5400675"/>
+            <wp:extent cx="5334000" cy="4886325"/>
             <wp:effectExtent t="0" r="0" b="0" l="0"/>
             <wp:docPr id="3" name=""/>
             <wp:cNvGraphicFramePr>
@@ -8182,7 +9057,7 @@
                   <pic:spPr bwMode="auto">
                     <a:xfrm>
                       <a:off x="0" y="0"/>
-                      <a:ext cx="5143500" cy="5400675"/>
+                      <a:ext cx="5334000" cy="4886325"/>
                     </a:xfrm>
                     <a:prstGeom prst="rect">
                       <a:avLst/>
@@ -8209,7 +9084,7 @@
           <w:sz w:val="18"/>
           <w:szCs w:val="18"/>
         </w:rPr>
-        <w:t xml:space="preserve">Figura 3 · Cadastro com validação e emissão do resumo consolidado</w:t>
+        <w:t xml:space="preserve">Figura 3 · Cadastro com validação, gravação pelo repositório e emissão do resumo consolidado</w:t>
       </w:r>
     </w:p>
     <w:p>
@@ -8239,7 +9114,7 @@
       <w:r>
         <w:drawing>
           <wp:inline distT="0" distB="0" distL="0" distR="0">
-            <wp:extent cx="5334000" cy="5133975"/>
+            <wp:extent cx="5715000" cy="4467225"/>
             <wp:effectExtent t="0" r="0" b="0" l="0"/>
             <wp:docPr id="4" name=""/>
             <wp:cNvGraphicFramePr>
@@ -8264,7 +9139,7 @@
                   <pic:spPr bwMode="auto">
                     <a:xfrm>
                       <a:off x="0" y="0"/>
-                      <a:ext cx="5334000" cy="5133975"/>
+                      <a:ext cx="5715000" cy="4467225"/>
                     </a:xfrm>
                     <a:prstGeom prst="rect">
                       <a:avLst/>
@@ -12755,6 +13630,33 @@
     </w:p>
     <w:p>
       <w:pPr>
+        <w:spacing w:after="120" w:line="300"/>
+      </w:pPr>
+      <w:r>
+        <w:rPr>
+          <w:rFonts w:ascii="Arial" w:cs="Arial" w:eastAsia="Arial" w:hAnsi="Arial"/>
+          <w:b/>
+          <w:bCs/>
+          <w:color w:val="1E2A30"/>
+          <w:sz w:val="22"/>
+          <w:szCs w:val="22"/>
+        </w:rPr>
+        <w:t xml:space="preserve">Registro e encerramento. </w:t>
+      </w:r>
+      <w:r>
+        <w:rPr>
+          <w:rFonts w:ascii="Arial" w:cs="Arial" w:eastAsia="Arial" w:hAnsi="Arial"/>
+          <w:b w:val="false"/>
+          <w:bCs w:val="false"/>
+          <w:color w:val="1E2A30"/>
+          <w:sz w:val="22"/>
+          <w:szCs w:val="22"/>
+        </w:rPr>
+        <w:t xml:space="preserve">Toda não conformidade, no código ou nos documentos e modelos, vira uma issue no repositório: etiqueta bug para código e documentação para artefatos, com severidade (crítica, alta, média ou baixa), responsável e prazo. A issue só é fechada quando a correção entra por Pull Request aprovado por outro integrante e, no caso de código, os testes automatizados passam. Cada revisão gera uma ata (modelo no Anexo) com data, participantes, artefatos revisados, não conformidades, correções e responsáveis, citando as issues abertas.</w:t>
+      </w:r>
+    </w:p>
+    <w:p>
+      <w:pPr>
         <w:pStyle w:val="Heading2"/>
         <w:keepNext/>
         <w:keepLines/>
@@ -12800,8 +13702,9 @@
         <w:tblLayout w:type="fixed"/>
       </w:tblPr>
       <w:tblGrid>
-        <w:gridCol w:w="2500"/>
-        <w:gridCol w:w="6572"/>
+        <w:gridCol w:w="1900"/>
+        <w:gridCol w:w="3600"/>
+        <w:gridCol w:w="3572"/>
       </w:tblGrid>
       <w:tr>
         <w:trPr>
@@ -12809,7 +13712,7 @@
         </w:trPr>
         <w:tc>
           <w:tcPr>
-            <w:tcW w:type="dxa" w:w="2500"/>
+            <w:tcW w:type="dxa" w:w="1900"/>
             <w:tcBorders>
               <w:top w:val="single" w:color="C9D3D1" w:sz="4"/>
               <w:left w:val="single" w:color="C9D3D1" w:sz="4"/>
@@ -12834,8 +13737,8 @@
                 <w:b/>
                 <w:bCs/>
                 <w:color w:val="1E2A30"/>
-                <w:sz w:val="19"/>
-                <w:szCs w:val="19"/>
+                <w:sz w:val="18"/>
+                <w:szCs w:val="18"/>
               </w:rPr>
               <w:t xml:space="preserve">Característica</w:t>
             </w:r>
@@ -12843,7 +13746,7 @@
         </w:tc>
         <w:tc>
           <w:tcPr>
-            <w:tcW w:type="dxa" w:w="6572"/>
+            <w:tcW w:type="dxa" w:w="3600"/>
             <w:tcBorders>
               <w:top w:val="single" w:color="C9D3D1" w:sz="4"/>
               <w:left w:val="single" w:color="C9D3D1" w:sz="4"/>
@@ -12868,10 +13771,44 @@
                 <w:b/>
                 <w:bCs/>
                 <w:color w:val="1E2A30"/>
-                <w:sz w:val="19"/>
-                <w:szCs w:val="19"/>
+                <w:sz w:val="18"/>
+                <w:szCs w:val="18"/>
               </w:rPr>
               <w:t xml:space="preserve">Critério no projeto</w:t>
+            </w:r>
+          </w:p>
+        </w:tc>
+        <w:tc>
+          <w:tcPr>
+            <w:tcW w:type="dxa" w:w="3572"/>
+            <w:tcBorders>
+              <w:top w:val="single" w:color="C9D3D1" w:sz="4"/>
+              <w:left w:val="single" w:color="C9D3D1" w:sz="4"/>
+              <w:bottom w:val="single" w:color="C9D3D1" w:sz="4"/>
+              <w:right w:val="single" w:color="C9D3D1" w:sz="4"/>
+            </w:tcBorders>
+            <w:shd w:fill="E3EEEC" w:color="auto" w:val="clear"/>
+            <w:tcMar>
+              <w:top w:type="dxa" w:w="70"/>
+              <w:left w:type="dxa" w:w="110"/>
+              <w:bottom w:type="dxa" w:w="70"/>
+              <w:right w:type="dxa" w:w="110"/>
+            </w:tcMar>
+          </w:tcPr>
+          <w:p>
+            <w:pPr>
+              <w:spacing w:after="0" w:line="260"/>
+            </w:pPr>
+            <w:r>
+              <w:rPr>
+                <w:rFonts w:ascii="Arial" w:cs="Arial" w:eastAsia="Arial" w:hAnsi="Arial"/>
+                <w:b/>
+                <w:bCs/>
+                <w:color w:val="1E2A30"/>
+                <w:sz w:val="18"/>
+                <w:szCs w:val="18"/>
+              </w:rPr>
+              <w:t xml:space="preserve">Como se verifica</w:t>
             </w:r>
           </w:p>
         </w:tc>
@@ -12882,7 +13819,7 @@
         </w:trPr>
         <w:tc>
           <w:tcPr>
-            <w:tcW w:type="dxa" w:w="2500"/>
+            <w:tcW w:type="dxa" w:w="1900"/>
             <w:tcBorders>
               <w:top w:val="single" w:color="C9D3D1" w:sz="4"/>
               <w:left w:val="single" w:color="C9D3D1" w:sz="4"/>
@@ -12906,8 +13843,8 @@
                 <w:b/>
                 <w:bCs/>
                 <w:color w:val="1E2A30"/>
-                <w:sz w:val="19"/>
-                <w:szCs w:val="19"/>
+                <w:sz w:val="18"/>
+                <w:szCs w:val="18"/>
               </w:rPr>
               <w:t xml:space="preserve">Adequação funcional</w:t>
             </w:r>
@@ -12915,34 +13852,67 @@
         </w:tc>
         <w:tc>
           <w:tcPr>
-            <w:tcW w:type="dxa" w:w="6572"/>
-            <w:tcBorders>
-              <w:top w:val="single" w:color="C9D3D1" w:sz="4"/>
-              <w:left w:val="single" w:color="C9D3D1" w:sz="4"/>
-              <w:bottom w:val="single" w:color="C9D3D1" w:sz="4"/>
-              <w:right w:val="single" w:color="C9D3D1" w:sz="4"/>
-            </w:tcBorders>
-            <w:tcMar>
-              <w:top w:type="dxa" w:w="70"/>
-              <w:left w:type="dxa" w:w="110"/>
-              <w:bottom w:type="dxa" w:w="70"/>
-              <w:right w:type="dxa" w:w="110"/>
-            </w:tcMar>
-          </w:tcPr>
-          <w:p>
-            <w:pPr>
-              <w:spacing w:after="0" w:line="260"/>
-            </w:pPr>
-            <w:r>
-              <w:rPr>
-                <w:rFonts w:ascii="Arial" w:cs="Arial" w:eastAsia="Arial" w:hAnsi="Arial"/>
-                <w:b w:val="false"/>
-                <w:bCs w:val="false"/>
-                <w:color w:val="1E2A30"/>
-                <w:sz w:val="19"/>
-                <w:szCs w:val="19"/>
-              </w:rPr>
-              <w:t xml:space="preserve">Executar todos os requisitos funcionais e os cálculos de salário, desconto e valores sem erro matemático.</w:t>
+            <w:tcW w:type="dxa" w:w="3600"/>
+            <w:tcBorders>
+              <w:top w:val="single" w:color="C9D3D1" w:sz="4"/>
+              <w:left w:val="single" w:color="C9D3D1" w:sz="4"/>
+              <w:bottom w:val="single" w:color="C9D3D1" w:sz="4"/>
+              <w:right w:val="single" w:color="C9D3D1" w:sz="4"/>
+            </w:tcBorders>
+            <w:tcMar>
+              <w:top w:type="dxa" w:w="70"/>
+              <w:left w:type="dxa" w:w="110"/>
+              <w:bottom w:type="dxa" w:w="70"/>
+              <w:right w:type="dxa" w:w="110"/>
+            </w:tcMar>
+          </w:tcPr>
+          <w:p>
+            <w:pPr>
+              <w:spacing w:after="0" w:line="260"/>
+            </w:pPr>
+            <w:r>
+              <w:rPr>
+                <w:rFonts w:ascii="Arial" w:cs="Arial" w:eastAsia="Arial" w:hAnsi="Arial"/>
+                <w:b w:val="false"/>
+                <w:bCs w:val="false"/>
+                <w:color w:val="1E2A30"/>
+                <w:sz w:val="18"/>
+                <w:szCs w:val="18"/>
+              </w:rPr>
+              <w:t xml:space="preserve">Todos os requisitos funcionais executados e os cálculos de salário, descontos e totais sem erro matemático.</w:t>
+            </w:r>
+          </w:p>
+        </w:tc>
+        <w:tc>
+          <w:tcPr>
+            <w:tcW w:type="dxa" w:w="3572"/>
+            <w:tcBorders>
+              <w:top w:val="single" w:color="C9D3D1" w:sz="4"/>
+              <w:left w:val="single" w:color="C9D3D1" w:sz="4"/>
+              <w:bottom w:val="single" w:color="C9D3D1" w:sz="4"/>
+              <w:right w:val="single" w:color="C9D3D1" w:sz="4"/>
+            </w:tcBorders>
+            <w:tcMar>
+              <w:top w:type="dxa" w:w="70"/>
+              <w:left w:type="dxa" w:w="110"/>
+              <w:bottom w:type="dxa" w:w="70"/>
+              <w:right w:type="dxa" w:w="110"/>
+            </w:tcMar>
+          </w:tcPr>
+          <w:p>
+            <w:pPr>
+              <w:spacing w:after="0" w:line="260"/>
+            </w:pPr>
+            <w:r>
+              <w:rPr>
+                <w:rFonts w:ascii="Arial" w:cs="Arial" w:eastAsia="Arial" w:hAnsi="Arial"/>
+                <w:b w:val="false"/>
+                <w:bCs w:val="false"/>
+                <w:color w:val="1E2A30"/>
+                <w:sz w:val="18"/>
+                <w:szCs w:val="18"/>
+              </w:rPr>
+              <w:t xml:space="preserve">CT001 a CT024 aprovados, com os valores conferidos centavo a centavo contra o resultado esperado.</w:t>
             </w:r>
           </w:p>
         </w:tc>
@@ -12953,7 +13923,7 @@
         </w:trPr>
         <w:tc>
           <w:tcPr>
-            <w:tcW w:type="dxa" w:w="2500"/>
+            <w:tcW w:type="dxa" w:w="1900"/>
             <w:tcBorders>
               <w:top w:val="single" w:color="C9D3D1" w:sz="4"/>
               <w:left w:val="single" w:color="C9D3D1" w:sz="4"/>
@@ -12977,8 +13947,8 @@
                 <w:b/>
                 <w:bCs/>
                 <w:color w:val="1E2A30"/>
-                <w:sz w:val="19"/>
-                <w:szCs w:val="19"/>
+                <w:sz w:val="18"/>
+                <w:szCs w:val="18"/>
               </w:rPr>
               <w:t xml:space="preserve">Eficiência de desempenho</w:t>
             </w:r>
@@ -12986,34 +13956,67 @@
         </w:tc>
         <w:tc>
           <w:tcPr>
-            <w:tcW w:type="dxa" w:w="6572"/>
-            <w:tcBorders>
-              <w:top w:val="single" w:color="C9D3D1" w:sz="4"/>
-              <w:left w:val="single" w:color="C9D3D1" w:sz="4"/>
-              <w:bottom w:val="single" w:color="C9D3D1" w:sz="4"/>
-              <w:right w:val="single" w:color="C9D3D1" w:sz="4"/>
-            </w:tcBorders>
-            <w:tcMar>
-              <w:top w:type="dxa" w:w="70"/>
-              <w:left w:type="dxa" w:w="110"/>
-              <w:bottom w:type="dxa" w:w="70"/>
-              <w:right w:type="dxa" w:w="110"/>
-            </w:tcMar>
-          </w:tcPr>
-          <w:p>
-            <w:pPr>
-              <w:spacing w:after="0" w:line="260"/>
-            </w:pPr>
-            <w:r>
-              <w:rPr>
-                <w:rFonts w:ascii="Arial" w:cs="Arial" w:eastAsia="Arial" w:hAnsi="Arial"/>
-                <w:b w:val="false"/>
-                <w:bCs w:val="false"/>
-                <w:color w:val="1E2A30"/>
-                <w:sz w:val="19"/>
-                <w:szCs w:val="19"/>
-              </w:rPr>
-              <w:t xml:space="preserve">Cálculo, registro e resumo executados com rapidez e baixo consumo de memória e processamento.</w:t>
+            <w:tcW w:type="dxa" w:w="3600"/>
+            <w:tcBorders>
+              <w:top w:val="single" w:color="C9D3D1" w:sz="4"/>
+              <w:left w:val="single" w:color="C9D3D1" w:sz="4"/>
+              <w:bottom w:val="single" w:color="C9D3D1" w:sz="4"/>
+              <w:right w:val="single" w:color="C9D3D1" w:sz="4"/>
+            </w:tcBorders>
+            <w:tcMar>
+              <w:top w:type="dxa" w:w="70"/>
+              <w:left w:type="dxa" w:w="110"/>
+              <w:bottom w:type="dxa" w:w="70"/>
+              <w:right w:type="dxa" w:w="110"/>
+            </w:tcMar>
+          </w:tcPr>
+          <w:p>
+            <w:pPr>
+              <w:spacing w:after="0" w:line="260"/>
+            </w:pPr>
+            <w:r>
+              <w:rPr>
+                <w:rFonts w:ascii="Arial" w:cs="Arial" w:eastAsia="Arial" w:hAnsi="Arial"/>
+                <w:b w:val="false"/>
+                <w:bCs w:val="false"/>
+                <w:color w:val="1E2A30"/>
+                <w:sz w:val="18"/>
+                <w:szCs w:val="18"/>
+              </w:rPr>
+              <w:t xml:space="preserve">Cadastro, consulta, folha individual e resumo respondem em até 1 segundo com 100 colaboradores cadastrados.</w:t>
+            </w:r>
+          </w:p>
+        </w:tc>
+        <w:tc>
+          <w:tcPr>
+            <w:tcW w:type="dxa" w:w="3572"/>
+            <w:tcBorders>
+              <w:top w:val="single" w:color="C9D3D1" w:sz="4"/>
+              <w:left w:val="single" w:color="C9D3D1" w:sz="4"/>
+              <w:bottom w:val="single" w:color="C9D3D1" w:sz="4"/>
+              <w:right w:val="single" w:color="C9D3D1" w:sz="4"/>
+            </w:tcBorders>
+            <w:tcMar>
+              <w:top w:type="dxa" w:w="70"/>
+              <w:left w:type="dxa" w:w="110"/>
+              <w:bottom w:type="dxa" w:w="70"/>
+              <w:right w:type="dxa" w:w="110"/>
+            </w:tcMar>
+          </w:tcPr>
+          <w:p>
+            <w:pPr>
+              <w:spacing w:after="0" w:line="260"/>
+            </w:pPr>
+            <w:r>
+              <w:rPr>
+                <w:rFonts w:ascii="Arial" w:cs="Arial" w:eastAsia="Arial" w:hAnsi="Arial"/>
+                <w:b w:val="false"/>
+                <w:bCs w:val="false"/>
+                <w:color w:val="1E2A30"/>
+                <w:sz w:val="18"/>
+                <w:szCs w:val="18"/>
+              </w:rPr>
+              <w:t xml:space="preserve">Teste de sistema com 100 colaboradores fictícios; o tempo de cada operação é medido no teste automatizado e registrado no Relatório de Testes.</w:t>
             </w:r>
           </w:p>
         </w:tc>
@@ -13024,7 +14027,7 @@
         </w:trPr>
         <w:tc>
           <w:tcPr>
-            <w:tcW w:type="dxa" w:w="2500"/>
+            <w:tcW w:type="dxa" w:w="1900"/>
             <w:tcBorders>
               <w:top w:val="single" w:color="C9D3D1" w:sz="4"/>
               <w:left w:val="single" w:color="C9D3D1" w:sz="4"/>
@@ -13048,8 +14051,8 @@
                 <w:b/>
                 <w:bCs/>
                 <w:color w:val="1E2A30"/>
-                <w:sz w:val="19"/>
-                <w:szCs w:val="19"/>
+                <w:sz w:val="18"/>
+                <w:szCs w:val="18"/>
               </w:rPr>
               <w:t xml:space="preserve">Compatibilidade</w:t>
             </w:r>
@@ -13057,34 +14060,67 @@
         </w:tc>
         <w:tc>
           <w:tcPr>
-            <w:tcW w:type="dxa" w:w="6572"/>
-            <w:tcBorders>
-              <w:top w:val="single" w:color="C9D3D1" w:sz="4"/>
-              <w:left w:val="single" w:color="C9D3D1" w:sz="4"/>
-              <w:bottom w:val="single" w:color="C9D3D1" w:sz="4"/>
-              <w:right w:val="single" w:color="C9D3D1" w:sz="4"/>
-            </w:tcBorders>
-            <w:tcMar>
-              <w:top w:type="dxa" w:w="70"/>
-              <w:left w:type="dxa" w:w="110"/>
-              <w:bottom w:type="dxa" w:w="70"/>
-              <w:right w:type="dxa" w:w="110"/>
-            </w:tcMar>
-          </w:tcPr>
-          <w:p>
-            <w:pPr>
-              <w:spacing w:after="0" w:line="260"/>
-            </w:pPr>
-            <w:r>
-              <w:rPr>
-                <w:rFonts w:ascii="Arial" w:cs="Arial" w:eastAsia="Arial" w:hAnsi="Arial"/>
-                <w:b w:val="false"/>
-                <w:bCs w:val="false"/>
-                <w:color w:val="1E2A30"/>
-                <w:sz w:val="19"/>
-                <w:szCs w:val="19"/>
-              </w:rPr>
-              <w:t xml:space="preserve">Rodar em conjunto com outros programas e nos sistemas operacionais e ambientes da equipe.</w:t>
+            <w:tcW w:type="dxa" w:w="3600"/>
+            <w:tcBorders>
+              <w:top w:val="single" w:color="C9D3D1" w:sz="4"/>
+              <w:left w:val="single" w:color="C9D3D1" w:sz="4"/>
+              <w:bottom w:val="single" w:color="C9D3D1" w:sz="4"/>
+              <w:right w:val="single" w:color="C9D3D1" w:sz="4"/>
+            </w:tcBorders>
+            <w:tcMar>
+              <w:top w:type="dxa" w:w="70"/>
+              <w:left w:type="dxa" w:w="110"/>
+              <w:bottom w:type="dxa" w:w="70"/>
+              <w:right w:type="dxa" w:w="110"/>
+            </w:tcMar>
+          </w:tcPr>
+          <w:p>
+            <w:pPr>
+              <w:spacing w:after="0" w:line="260"/>
+            </w:pPr>
+            <w:r>
+              <w:rPr>
+                <w:rFonts w:ascii="Arial" w:cs="Arial" w:eastAsia="Arial" w:hAnsi="Arial"/>
+                <w:b w:val="false"/>
+                <w:bCs w:val="false"/>
+                <w:color w:val="1E2A30"/>
+                <w:sz w:val="18"/>
+                <w:szCs w:val="18"/>
+              </w:rPr>
+              <w:t xml:space="preserve">Executa com Python 3.12 no Windows 10/11 e no Linux (Ubuntu 22.04); a página web funciona no Chrome e no Edge atuais, sem bibliotecas além das listadas em 4.2.</w:t>
+            </w:r>
+          </w:p>
+        </w:tc>
+        <w:tc>
+          <w:tcPr>
+            <w:tcW w:type="dxa" w:w="3572"/>
+            <w:tcBorders>
+              <w:top w:val="single" w:color="C9D3D1" w:sz="4"/>
+              <w:left w:val="single" w:color="C9D3D1" w:sz="4"/>
+              <w:bottom w:val="single" w:color="C9D3D1" w:sz="4"/>
+              <w:right w:val="single" w:color="C9D3D1" w:sz="4"/>
+            </w:tcBorders>
+            <w:tcMar>
+              <w:top w:type="dxa" w:w="70"/>
+              <w:left w:type="dxa" w:w="110"/>
+              <w:bottom w:type="dxa" w:w="70"/>
+              <w:right w:type="dxa" w:w="110"/>
+            </w:tcMar>
+          </w:tcPr>
+          <w:p>
+            <w:pPr>
+              <w:spacing w:after="0" w:line="260"/>
+            </w:pPr>
+            <w:r>
+              <w:rPr>
+                <w:rFonts w:ascii="Arial" w:cs="Arial" w:eastAsia="Arial" w:hAnsi="Arial"/>
+                <w:b w:val="false"/>
+                <w:bCs w:val="false"/>
+                <w:color w:val="1E2A30"/>
+                <w:sz w:val="18"/>
+                <w:szCs w:val="18"/>
+              </w:rPr>
+              <w:t xml:space="preserve">CT019 e CT020 executados em cada combinação de sistema e navegador, com o resultado anotado no Relatório de Testes.</w:t>
             </w:r>
           </w:p>
         </w:tc>
@@ -13095,7 +14131,7 @@
         </w:trPr>
         <w:tc>
           <w:tcPr>
-            <w:tcW w:type="dxa" w:w="2500"/>
+            <w:tcW w:type="dxa" w:w="1900"/>
             <w:tcBorders>
               <w:top w:val="single" w:color="C9D3D1" w:sz="4"/>
               <w:left w:val="single" w:color="C9D3D1" w:sz="4"/>
@@ -13119,8 +14155,8 @@
                 <w:b/>
                 <w:bCs/>
                 <w:color w:val="1E2A30"/>
-                <w:sz w:val="19"/>
-                <w:szCs w:val="19"/>
+                <w:sz w:val="18"/>
+                <w:szCs w:val="18"/>
               </w:rPr>
               <w:t xml:space="preserve">Usabilidade</w:t>
             </w:r>
@@ -13128,34 +14164,67 @@
         </w:tc>
         <w:tc>
           <w:tcPr>
-            <w:tcW w:type="dxa" w:w="6572"/>
-            <w:tcBorders>
-              <w:top w:val="single" w:color="C9D3D1" w:sz="4"/>
-              <w:left w:val="single" w:color="C9D3D1" w:sz="4"/>
-              <w:bottom w:val="single" w:color="C9D3D1" w:sz="4"/>
-              <w:right w:val="single" w:color="C9D3D1" w:sz="4"/>
-            </w:tcBorders>
-            <w:tcMar>
-              <w:top w:type="dxa" w:w="70"/>
-              <w:left w:type="dxa" w:w="110"/>
-              <w:bottom w:type="dxa" w:w="70"/>
-              <w:right w:type="dxa" w:w="110"/>
-            </w:tcMar>
-          </w:tcPr>
-          <w:p>
-            <w:pPr>
-              <w:spacing w:after="0" w:line="260"/>
-            </w:pPr>
-            <w:r>
-              <w:rPr>
-                <w:rFonts w:ascii="Arial" w:cs="Arial" w:eastAsia="Arial" w:hAnsi="Arial"/>
-                <w:b w:val="false"/>
-                <w:bCs w:val="false"/>
-                <w:color w:val="1E2A30"/>
-                <w:sz w:val="19"/>
-                <w:szCs w:val="19"/>
-              </w:rPr>
-              <w:t xml:space="preserve">Menus e formulários com linguagem simples; interface limpa; entradas validadas antes dos cálculos.</w:t>
+            <w:tcW w:type="dxa" w:w="3600"/>
+            <w:tcBorders>
+              <w:top w:val="single" w:color="C9D3D1" w:sz="4"/>
+              <w:left w:val="single" w:color="C9D3D1" w:sz="4"/>
+              <w:bottom w:val="single" w:color="C9D3D1" w:sz="4"/>
+              <w:right w:val="single" w:color="C9D3D1" w:sz="4"/>
+            </w:tcBorders>
+            <w:tcMar>
+              <w:top w:type="dxa" w:w="70"/>
+              <w:left w:type="dxa" w:w="110"/>
+              <w:bottom w:type="dxa" w:w="70"/>
+              <w:right w:type="dxa" w:w="110"/>
+            </w:tcMar>
+          </w:tcPr>
+          <w:p>
+            <w:pPr>
+              <w:spacing w:after="0" w:line="260"/>
+            </w:pPr>
+            <w:r>
+              <w:rPr>
+                <w:rFonts w:ascii="Arial" w:cs="Arial" w:eastAsia="Arial" w:hAnsi="Arial"/>
+                <w:b w:val="false"/>
+                <w:bCs w:val="false"/>
+                <w:color w:val="1E2A30"/>
+                <w:sz w:val="18"/>
+                <w:szCs w:val="18"/>
+              </w:rPr>
+              <w:t xml:space="preserve">Uma pessoa que não participou do projeto cadastra um colaborador e emite o resumo sem ajuda, em até 5 minutos; toda mensagem de erro cita o campo e a regra violada.</w:t>
+            </w:r>
+          </w:p>
+        </w:tc>
+        <w:tc>
+          <w:tcPr>
+            <w:tcW w:type="dxa" w:w="3572"/>
+            <w:tcBorders>
+              <w:top w:val="single" w:color="C9D3D1" w:sz="4"/>
+              <w:left w:val="single" w:color="C9D3D1" w:sz="4"/>
+              <w:bottom w:val="single" w:color="C9D3D1" w:sz="4"/>
+              <w:right w:val="single" w:color="C9D3D1" w:sz="4"/>
+            </w:tcBorders>
+            <w:tcMar>
+              <w:top w:type="dxa" w:w="70"/>
+              <w:left w:type="dxa" w:w="110"/>
+              <w:bottom w:type="dxa" w:w="70"/>
+              <w:right w:type="dxa" w:w="110"/>
+            </w:tcMar>
+          </w:tcPr>
+          <w:p>
+            <w:pPr>
+              <w:spacing w:after="0" w:line="260"/>
+            </w:pPr>
+            <w:r>
+              <w:rPr>
+                <w:rFonts w:ascii="Arial" w:cs="Arial" w:eastAsia="Arial" w:hAnsi="Arial"/>
+                <w:b w:val="false"/>
+                <w:bCs w:val="false"/>
+                <w:color w:val="1E2A30"/>
+                <w:sz w:val="18"/>
+                <w:szCs w:val="18"/>
+              </w:rPr>
+              <w:t xml:space="preserve">CT024, executado por uma pessoa de fora da equipe; mensagens conferidas nos CT010 a CT016.</w:t>
             </w:r>
           </w:p>
         </w:tc>
@@ -13166,7 +14235,7 @@
         </w:trPr>
         <w:tc>
           <w:tcPr>
-            <w:tcW w:type="dxa" w:w="2500"/>
+            <w:tcW w:type="dxa" w:w="1900"/>
             <w:tcBorders>
               <w:top w:val="single" w:color="C9D3D1" w:sz="4"/>
               <w:left w:val="single" w:color="C9D3D1" w:sz="4"/>
@@ -13190,8 +14259,8 @@
                 <w:b/>
                 <w:bCs/>
                 <w:color w:val="1E2A30"/>
-                <w:sz w:val="19"/>
-                <w:szCs w:val="19"/>
+                <w:sz w:val="18"/>
+                <w:szCs w:val="18"/>
               </w:rPr>
               <w:t xml:space="preserve">Confiabilidade</w:t>
             </w:r>
@@ -13199,34 +14268,67 @@
         </w:tc>
         <w:tc>
           <w:tcPr>
-            <w:tcW w:type="dxa" w:w="6572"/>
-            <w:tcBorders>
-              <w:top w:val="single" w:color="C9D3D1" w:sz="4"/>
-              <w:left w:val="single" w:color="C9D3D1" w:sz="4"/>
-              <w:bottom w:val="single" w:color="C9D3D1" w:sz="4"/>
-              <w:right w:val="single" w:color="C9D3D1" w:sz="4"/>
-            </w:tcBorders>
-            <w:tcMar>
-              <w:top w:type="dxa" w:w="70"/>
-              <w:left w:type="dxa" w:w="110"/>
-              <w:bottom w:type="dxa" w:w="70"/>
-              <w:right w:type="dxa" w:w="110"/>
-            </w:tcMar>
-          </w:tcPr>
-          <w:p>
-            <w:pPr>
-              <w:spacing w:after="0" w:line="260"/>
-            </w:pPr>
-            <w:r>
-              <w:rPr>
-                <w:rFonts w:ascii="Arial" w:cs="Arial" w:eastAsia="Arial" w:hAnsi="Arial"/>
-                <w:b w:val="false"/>
-                <w:bCs w:val="false"/>
-                <w:color w:val="1E2A30"/>
-                <w:sz w:val="19"/>
-                <w:szCs w:val="19"/>
-              </w:rPr>
-              <w:t xml:space="preserve">Guardar e restaurar dados em caso de erro, falha técnica ou desligamento; exceções tratadas sem encerrar a aplicação.</w:t>
+            <w:tcW w:type="dxa" w:w="3600"/>
+            <w:tcBorders>
+              <w:top w:val="single" w:color="C9D3D1" w:sz="4"/>
+              <w:left w:val="single" w:color="C9D3D1" w:sz="4"/>
+              <w:bottom w:val="single" w:color="C9D3D1" w:sz="4"/>
+              <w:right w:val="single" w:color="C9D3D1" w:sz="4"/>
+            </w:tcBorders>
+            <w:tcMar>
+              <w:top w:type="dxa" w:w="70"/>
+              <w:left w:type="dxa" w:w="110"/>
+              <w:bottom w:type="dxa" w:w="70"/>
+              <w:right w:type="dxa" w:w="110"/>
+            </w:tcMar>
+          </w:tcPr>
+          <w:p>
+            <w:pPr>
+              <w:spacing w:after="0" w:line="260"/>
+            </w:pPr>
+            <w:r>
+              <w:rPr>
+                <w:rFonts w:ascii="Arial" w:cs="Arial" w:eastAsia="Arial" w:hAnsi="Arial"/>
+                <w:b w:val="false"/>
+                <w:bCs w:val="false"/>
+                <w:color w:val="1E2A30"/>
+                <w:sz w:val="18"/>
+                <w:szCs w:val="18"/>
+              </w:rPr>
+              <w:t xml:space="preserve">Dado inválido não encerra a aplicação; os registros gravados sobrevivem ao fechamento do sistema.</w:t>
+            </w:r>
+          </w:p>
+        </w:tc>
+        <w:tc>
+          <w:tcPr>
+            <w:tcW w:type="dxa" w:w="3572"/>
+            <w:tcBorders>
+              <w:top w:val="single" w:color="C9D3D1" w:sz="4"/>
+              <w:left w:val="single" w:color="C9D3D1" w:sz="4"/>
+              <w:bottom w:val="single" w:color="C9D3D1" w:sz="4"/>
+              <w:right w:val="single" w:color="C9D3D1" w:sz="4"/>
+            </w:tcBorders>
+            <w:tcMar>
+              <w:top w:type="dxa" w:w="70"/>
+              <w:left w:type="dxa" w:w="110"/>
+              <w:bottom w:type="dxa" w:w="70"/>
+              <w:right w:type="dxa" w:w="110"/>
+            </w:tcMar>
+          </w:tcPr>
+          <w:p>
+            <w:pPr>
+              <w:spacing w:after="0" w:line="260"/>
+            </w:pPr>
+            <w:r>
+              <w:rPr>
+                <w:rFonts w:ascii="Arial" w:cs="Arial" w:eastAsia="Arial" w:hAnsi="Arial"/>
+                <w:b w:val="false"/>
+                <w:bCs w:val="false"/>
+                <w:color w:val="1E2A30"/>
+                <w:sz w:val="18"/>
+                <w:szCs w:val="18"/>
+              </w:rPr>
+              <w:t xml:space="preserve">CT010 a CT016 (erro tratado sem encerrar) e CT020 (dados restaurados).</w:t>
             </w:r>
           </w:p>
         </w:tc>
@@ -13237,7 +14339,7 @@
         </w:trPr>
         <w:tc>
           <w:tcPr>
-            <w:tcW w:type="dxa" w:w="2500"/>
+            <w:tcW w:type="dxa" w:w="1900"/>
             <w:tcBorders>
               <w:top w:val="single" w:color="C9D3D1" w:sz="4"/>
               <w:left w:val="single" w:color="C9D3D1" w:sz="4"/>
@@ -13261,8 +14363,8 @@
                 <w:b/>
                 <w:bCs/>
                 <w:color w:val="1E2A30"/>
-                <w:sz w:val="19"/>
-                <w:szCs w:val="19"/>
+                <w:sz w:val="18"/>
+                <w:szCs w:val="18"/>
               </w:rPr>
               <w:t xml:space="preserve">Segurança</w:t>
             </w:r>
@@ -13270,34 +14372,67 @@
         </w:tc>
         <w:tc>
           <w:tcPr>
-            <w:tcW w:type="dxa" w:w="6572"/>
-            <w:tcBorders>
-              <w:top w:val="single" w:color="C9D3D1" w:sz="4"/>
-              <w:left w:val="single" w:color="C9D3D1" w:sz="4"/>
-              <w:bottom w:val="single" w:color="C9D3D1" w:sz="4"/>
-              <w:right w:val="single" w:color="C9D3D1" w:sz="4"/>
-            </w:tcBorders>
-            <w:tcMar>
-              <w:top w:type="dxa" w:w="70"/>
-              <w:left w:type="dxa" w:w="110"/>
-              <w:bottom w:type="dxa" w:w="70"/>
-              <w:right w:type="dxa" w:w="110"/>
-            </w:tcMar>
-          </w:tcPr>
-          <w:p>
-            <w:pPr>
-              <w:spacing w:after="0" w:line="260"/>
-            </w:pPr>
-            <w:r>
-              <w:rPr>
-                <w:rFonts w:ascii="Arial" w:cs="Arial" w:eastAsia="Arial" w:hAnsi="Arial"/>
-                <w:b w:val="false"/>
-                <w:bCs w:val="false"/>
-                <w:color w:val="1E2A30"/>
-                <w:sz w:val="19"/>
-                <w:szCs w:val="19"/>
-              </w:rPr>
-              <w:t xml:space="preserve">Dados mantidos com integridade dos registros.</w:t>
+            <w:tcW w:type="dxa" w:w="3600"/>
+            <w:tcBorders>
+              <w:top w:val="single" w:color="C9D3D1" w:sz="4"/>
+              <w:left w:val="single" w:color="C9D3D1" w:sz="4"/>
+              <w:bottom w:val="single" w:color="C9D3D1" w:sz="4"/>
+              <w:right w:val="single" w:color="C9D3D1" w:sz="4"/>
+            </w:tcBorders>
+            <w:tcMar>
+              <w:top w:type="dxa" w:w="70"/>
+              <w:left w:type="dxa" w:w="110"/>
+              <w:bottom w:type="dxa" w:w="70"/>
+              <w:right w:type="dxa" w:w="110"/>
+            </w:tcMar>
+          </w:tcPr>
+          <w:p>
+            <w:pPr>
+              <w:spacing w:after="0" w:line="260"/>
+            </w:pPr>
+            <w:r>
+              <w:rPr>
+                <w:rFonts w:ascii="Arial" w:cs="Arial" w:eastAsia="Arial" w:hAnsi="Arial"/>
+                <w:b w:val="false"/>
+                <w:bCs w:val="false"/>
+                <w:color w:val="1E2A30"/>
+                <w:sz w:val="18"/>
+                <w:szCs w:val="18"/>
+              </w:rPr>
+              <w:t xml:space="preserve">Consultas ao banco só com parâmetros; nenhum dado inválido é gravado.</w:t>
+            </w:r>
+          </w:p>
+        </w:tc>
+        <w:tc>
+          <w:tcPr>
+            <w:tcW w:type="dxa" w:w="3572"/>
+            <w:tcBorders>
+              <w:top w:val="single" w:color="C9D3D1" w:sz="4"/>
+              <w:left w:val="single" w:color="C9D3D1" w:sz="4"/>
+              <w:bottom w:val="single" w:color="C9D3D1" w:sz="4"/>
+              <w:right w:val="single" w:color="C9D3D1" w:sz="4"/>
+            </w:tcBorders>
+            <w:tcMar>
+              <w:top w:type="dxa" w:w="70"/>
+              <w:left w:type="dxa" w:w="110"/>
+              <w:bottom w:type="dxa" w:w="70"/>
+              <w:right w:type="dxa" w:w="110"/>
+            </w:tcMar>
+          </w:tcPr>
+          <w:p>
+            <w:pPr>
+              <w:spacing w:after="0" w:line="260"/>
+            </w:pPr>
+            <w:r>
+              <w:rPr>
+                <w:rFonts w:ascii="Arial" w:cs="Arial" w:eastAsia="Arial" w:hAnsi="Arial"/>
+                <w:b w:val="false"/>
+                <w:bCs w:val="false"/>
+                <w:color w:val="1E2A30"/>
+                <w:sz w:val="18"/>
+                <w:szCs w:val="18"/>
+              </w:rPr>
+              <w:t xml:space="preserve">Revisão de código (5.3) e testes de integração com banco temporário.</w:t>
             </w:r>
           </w:p>
         </w:tc>
@@ -13308,7 +14443,7 @@
         </w:trPr>
         <w:tc>
           <w:tcPr>
-            <w:tcW w:type="dxa" w:w="2500"/>
+            <w:tcW w:type="dxa" w:w="1900"/>
             <w:tcBorders>
               <w:top w:val="single" w:color="C9D3D1" w:sz="4"/>
               <w:left w:val="single" w:color="C9D3D1" w:sz="4"/>
@@ -13332,8 +14467,8 @@
                 <w:b/>
                 <w:bCs/>
                 <w:color w:val="1E2A30"/>
-                <w:sz w:val="19"/>
-                <w:szCs w:val="19"/>
+                <w:sz w:val="18"/>
+                <w:szCs w:val="18"/>
               </w:rPr>
               <w:t xml:space="preserve">Manutenibilidade</w:t>
             </w:r>
@@ -13341,34 +14476,67 @@
         </w:tc>
         <w:tc>
           <w:tcPr>
-            <w:tcW w:type="dxa" w:w="6572"/>
-            <w:tcBorders>
-              <w:top w:val="single" w:color="C9D3D1" w:sz="4"/>
-              <w:left w:val="single" w:color="C9D3D1" w:sz="4"/>
-              <w:bottom w:val="single" w:color="C9D3D1" w:sz="4"/>
-              <w:right w:val="single" w:color="C9D3D1" w:sz="4"/>
-            </w:tcBorders>
-            <w:tcMar>
-              <w:top w:type="dxa" w:w="70"/>
-              <w:left w:type="dxa" w:w="110"/>
-              <w:bottom w:type="dxa" w:w="70"/>
-              <w:right w:type="dxa" w:w="110"/>
-            </w:tcMar>
-          </w:tcPr>
-          <w:p>
-            <w:pPr>
-              <w:spacing w:after="0" w:line="260"/>
-            </w:pPr>
-            <w:r>
-              <w:rPr>
-                <w:rFonts w:ascii="Arial" w:cs="Arial" w:eastAsia="Arial" w:hAnsi="Arial"/>
-                <w:b w:val="false"/>
-                <w:bCs w:val="false"/>
-                <w:color w:val="1E2A30"/>
-                <w:sz w:val="19"/>
-                <w:szCs w:val="19"/>
-              </w:rPr>
-              <w:t xml:space="preserve">Permitir atualizações, modificações e adaptações.</w:t>
+            <w:tcW w:type="dxa" w:w="3600"/>
+            <w:tcBorders>
+              <w:top w:val="single" w:color="C9D3D1" w:sz="4"/>
+              <w:left w:val="single" w:color="C9D3D1" w:sz="4"/>
+              <w:bottom w:val="single" w:color="C9D3D1" w:sz="4"/>
+              <w:right w:val="single" w:color="C9D3D1" w:sz="4"/>
+            </w:tcBorders>
+            <w:tcMar>
+              <w:top w:type="dxa" w:w="70"/>
+              <w:left w:type="dxa" w:w="110"/>
+              <w:bottom w:type="dxa" w:w="70"/>
+              <w:right w:type="dxa" w:w="110"/>
+            </w:tcMar>
+          </w:tcPr>
+          <w:p>
+            <w:pPr>
+              <w:spacing w:after="0" w:line="260"/>
+            </w:pPr>
+            <w:r>
+              <w:rPr>
+                <w:rFonts w:ascii="Arial" w:cs="Arial" w:eastAsia="Arial" w:hAnsi="Arial"/>
+                <w:b w:val="false"/>
+                <w:bCs w:val="false"/>
+                <w:color w:val="1E2A30"/>
+                <w:sz w:val="18"/>
+                <w:szCs w:val="18"/>
+              </w:rPr>
+              <w:t xml:space="preserve">Novo tipo de remuneração entra sem alterar os cálculos existentes (RNF004); código sem avisos do ruff.</w:t>
+            </w:r>
+          </w:p>
+        </w:tc>
+        <w:tc>
+          <w:tcPr>
+            <w:tcW w:type="dxa" w:w="3572"/>
+            <w:tcBorders>
+              <w:top w:val="single" w:color="C9D3D1" w:sz="4"/>
+              <w:left w:val="single" w:color="C9D3D1" w:sz="4"/>
+              <w:bottom w:val="single" w:color="C9D3D1" w:sz="4"/>
+              <w:right w:val="single" w:color="C9D3D1" w:sz="4"/>
+            </w:tcBorders>
+            <w:tcMar>
+              <w:top w:type="dxa" w:w="70"/>
+              <w:left w:type="dxa" w:w="110"/>
+              <w:bottom w:type="dxa" w:w="70"/>
+              <w:right w:type="dxa" w:w="110"/>
+            </w:tcMar>
+          </w:tcPr>
+          <w:p>
+            <w:pPr>
+              <w:spacing w:after="0" w:line="260"/>
+            </w:pPr>
+            <w:r>
+              <w:rPr>
+                <w:rFonts w:ascii="Arial" w:cs="Arial" w:eastAsia="Arial" w:hAnsi="Arial"/>
+                <w:b w:val="false"/>
+                <w:bCs w:val="false"/>
+                <w:color w:val="1E2A30"/>
+                <w:sz w:val="18"/>
+                <w:szCs w:val="18"/>
+              </w:rPr>
+              <w:t xml:space="preserve">CT023 e ruff sem avisos a cada Pull Request.</w:t>
             </w:r>
           </w:p>
         </w:tc>
@@ -13379,7 +14547,7 @@
         </w:trPr>
         <w:tc>
           <w:tcPr>
-            <w:tcW w:type="dxa" w:w="2500"/>
+            <w:tcW w:type="dxa" w:w="1900"/>
             <w:tcBorders>
               <w:top w:val="single" w:color="C9D3D1" w:sz="4"/>
               <w:left w:val="single" w:color="C9D3D1" w:sz="4"/>
@@ -13403,8 +14571,8 @@
                 <w:b/>
                 <w:bCs/>
                 <w:color w:val="1E2A30"/>
-                <w:sz w:val="19"/>
-                <w:szCs w:val="19"/>
+                <w:sz w:val="18"/>
+                <w:szCs w:val="18"/>
               </w:rPr>
               <w:t xml:space="preserve">Portabilidade</w:t>
             </w:r>
@@ -13412,34 +14580,67 @@
         </w:tc>
         <w:tc>
           <w:tcPr>
-            <w:tcW w:type="dxa" w:w="6572"/>
-            <w:tcBorders>
-              <w:top w:val="single" w:color="C9D3D1" w:sz="4"/>
-              <w:left w:val="single" w:color="C9D3D1" w:sz="4"/>
-              <w:bottom w:val="single" w:color="C9D3D1" w:sz="4"/>
-              <w:right w:val="single" w:color="C9D3D1" w:sz="4"/>
-            </w:tcBorders>
-            <w:tcMar>
-              <w:top w:type="dxa" w:w="70"/>
-              <w:left w:type="dxa" w:w="110"/>
-              <w:bottom w:type="dxa" w:w="70"/>
-              <w:right w:type="dxa" w:w="110"/>
-            </w:tcMar>
-          </w:tcPr>
-          <w:p>
-            <w:pPr>
-              <w:spacing w:after="0" w:line="260"/>
-            </w:pPr>
-            <w:r>
-              <w:rPr>
-                <w:rFonts w:ascii="Arial" w:cs="Arial" w:eastAsia="Arial" w:hAnsi="Arial"/>
-                <w:b w:val="false"/>
-                <w:bCs w:val="false"/>
-                <w:color w:val="1E2A30"/>
-                <w:sz w:val="19"/>
-                <w:szCs w:val="19"/>
-              </w:rPr>
-              <w:t xml:space="preserve">Ser transferido de um ambiente de hardware, software ou sistema operacional para outro.</w:t>
+            <w:tcW w:type="dxa" w:w="3600"/>
+            <w:tcBorders>
+              <w:top w:val="single" w:color="C9D3D1" w:sz="4"/>
+              <w:left w:val="single" w:color="C9D3D1" w:sz="4"/>
+              <w:bottom w:val="single" w:color="C9D3D1" w:sz="4"/>
+              <w:right w:val="single" w:color="C9D3D1" w:sz="4"/>
+            </w:tcBorders>
+            <w:tcMar>
+              <w:top w:type="dxa" w:w="70"/>
+              <w:left w:type="dxa" w:w="110"/>
+              <w:bottom w:type="dxa" w:w="70"/>
+              <w:right w:type="dxa" w:w="110"/>
+            </w:tcMar>
+          </w:tcPr>
+          <w:p>
+            <w:pPr>
+              <w:spacing w:after="0" w:line="260"/>
+            </w:pPr>
+            <w:r>
+              <w:rPr>
+                <w:rFonts w:ascii="Arial" w:cs="Arial" w:eastAsia="Arial" w:hAnsi="Arial"/>
+                <w:b w:val="false"/>
+                <w:bCs w:val="false"/>
+                <w:color w:val="1E2A30"/>
+                <w:sz w:val="18"/>
+                <w:szCs w:val="18"/>
+              </w:rPr>
+              <w:t xml:space="preserve">O sistema roda copiando a pasta do projeto e instalando as dependências, sem configurar a máquina.</w:t>
+            </w:r>
+          </w:p>
+        </w:tc>
+        <w:tc>
+          <w:tcPr>
+            <w:tcW w:type="dxa" w:w="3572"/>
+            <w:tcBorders>
+              <w:top w:val="single" w:color="C9D3D1" w:sz="4"/>
+              <w:left w:val="single" w:color="C9D3D1" w:sz="4"/>
+              <w:bottom w:val="single" w:color="C9D3D1" w:sz="4"/>
+              <w:right w:val="single" w:color="C9D3D1" w:sz="4"/>
+            </w:tcBorders>
+            <w:tcMar>
+              <w:top w:type="dxa" w:w="70"/>
+              <w:left w:type="dxa" w:w="110"/>
+              <w:bottom w:type="dxa" w:w="70"/>
+              <w:right w:type="dxa" w:w="110"/>
+            </w:tcMar>
+          </w:tcPr>
+          <w:p>
+            <w:pPr>
+              <w:spacing w:after="0" w:line="260"/>
+            </w:pPr>
+            <w:r>
+              <w:rPr>
+                <w:rFonts w:ascii="Arial" w:cs="Arial" w:eastAsia="Arial" w:hAnsi="Arial"/>
+                <w:b w:val="false"/>
+                <w:bCs w:val="false"/>
+                <w:color w:val="1E2A30"/>
+                <w:sz w:val="18"/>
+                <w:szCs w:val="18"/>
+              </w:rPr>
+              <w:t xml:space="preserve">Instalação do zero numa máquina da equipe, seguindo o Manual Técnico.</w:t>
             </w:r>
           </w:p>
         </w:tc>
@@ -16652,7 +17853,7 @@
                 <w:sz w:val="19"/>
                 <w:szCs w:val="19"/>
               </w:rPr>
-              <w:t xml:space="preserve">Os 20 casos de teste, do ponto de vista do cliente, com resultado esperado e obtido</w:t>
+              <w:t xml:space="preserve">Os 24 casos de teste, do ponto de vista do cliente, com resultado esperado e obtido</w:t>
             </w:r>
           </w:p>
         </w:tc>
@@ -17969,7 +19170,7 @@
           <w:sz w:val="22"/>
           <w:szCs w:val="22"/>
         </w:rPr>
-        <w:t xml:space="preserve">Vinte casos de teste, cada um ligado a um requisito ou regra da matriz de rastreabilidade (2.5). Os valores esperados de CT017 a CT019 foram calculados com as regras das premissas (1.4).</w:t>
+        <w:t xml:space="preserve">Vinte e quatro casos de teste, cada um ligado a um requisito ou regra da matriz de rastreabilidade (2.5). Pré-condição comum: o sistema começa com o banco vazio e a comissão é informada em percentual (5 = 5%). Quando um caso depende de outro, a coluna Passos diz qual. Os valores esperados foram calculados com as regras de 2.4 e das premissas (1.4).</w:t>
       </w:r>
     </w:p>
     <w:tbl>
@@ -18266,7 +19467,7 @@
                 <w:sz w:val="17"/>
                 <w:szCs w:val="17"/>
               </w:rPr>
-              <w:t xml:space="preserve">Verificar se o sistema realiza corretamente o cadastro de um colaborador.</w:t>
+              <w:t xml:space="preserve">Cadastrar um colaborador válido.</w:t>
             </w:r>
           </w:p>
         </w:tc>
@@ -18299,7 +19500,7 @@
                 <w:sz w:val="17"/>
                 <w:szCs w:val="17"/>
               </w:rPr>
-              <w:t xml:space="preserve">Informar matrícula, nome e tipo de colaborador. Consultar no sistema.</w:t>
+              <w:t xml:space="preserve">Banco vazio. Cadastrar padrão P01, nome Ana Souza, salário base R$ 3.000,00. Consultar P01.</w:t>
             </w:r>
           </w:p>
         </w:tc>
@@ -18332,7 +19533,7 @@
                 <w:sz w:val="17"/>
                 <w:szCs w:val="17"/>
               </w:rPr>
-              <w:t xml:space="preserve">O sistema cadastra e armazena o colaborador corretamente.</w:t>
+              <w:t xml:space="preserve">Mensagem de cadastro realizado; a consulta mostra P01, Ana Souza, padrão, R$ 3.000,00.</w:t>
             </w:r>
           </w:p>
         </w:tc>
@@ -18436,7 +19637,7 @@
                 <w:sz w:val="17"/>
                 <w:szCs w:val="17"/>
               </w:rPr>
-              <w:t xml:space="preserve">Validar o cadastro do colaborador padrão com salário positivo.</w:t>
+              <w:t xml:space="preserve">Cadastrar padrão no limite da regra RN003.</w:t>
             </w:r>
           </w:p>
         </w:tc>
@@ -18469,7 +19670,7 @@
                 <w:sz w:val="17"/>
                 <w:szCs w:val="17"/>
               </w:rPr>
-              <w:t xml:space="preserve">Selecionar a categoria padrão e informar salário positivo.</w:t>
+              <w:t xml:space="preserve">Banco vazio. Cadastrar padrão P03, nome Diego Alves, salário base R$ 0,00.</w:t>
             </w:r>
           </w:p>
         </w:tc>
@@ -18502,7 +19703,7 @@
                 <w:sz w:val="17"/>
                 <w:szCs w:val="17"/>
               </w:rPr>
-              <w:t xml:space="preserve">Cadastro aceito com o salário base válido.</w:t>
+              <w:t xml:space="preserve">Cadastro aceito; salário bruto R$ 0,00 (zero não é negativo).</w:t>
             </w:r>
           </w:p>
         </w:tc>
@@ -18573,7 +19774,7 @@
                 <w:sz w:val="17"/>
                 <w:szCs w:val="17"/>
               </w:rPr>
-              <w:t xml:space="preserve">RF003</w:t>
+              <w:t xml:space="preserve">RF003, RF006</w:t>
             </w:r>
           </w:p>
         </w:tc>
@@ -18606,7 +19807,7 @@
                 <w:sz w:val="17"/>
                 <w:szCs w:val="17"/>
               </w:rPr>
-              <w:t xml:space="preserve">Testar a aceitação dos dados de um colaborador comissionado.</w:t>
+              <w:t xml:space="preserve">Cadastrar comissionado e conferir o bruto com a comissão em percentual.</w:t>
             </w:r>
           </w:p>
         </w:tc>
@@ -18639,7 +19840,7 @@
                 <w:sz w:val="17"/>
                 <w:szCs w:val="17"/>
               </w:rPr>
-              <w:t xml:space="preserve">Selecionar comissionado, inserir salário, vendas e percentual. Salvar.</w:t>
+              <w:t xml:space="preserve">Banco vazio. Cadastrar comissionado C01, Bruno Lima: salário base R$ 2.000,00, vendas R$ 10.000,00, comissão 5.</w:t>
             </w:r>
           </w:p>
         </w:tc>
@@ -18672,7 +19873,7 @@
                 <w:sz w:val="17"/>
                 <w:szCs w:val="17"/>
               </w:rPr>
-              <w:t xml:space="preserve">Cadastro aceito com salário base, vendas e percentual de comissão.</w:t>
+              <w:t xml:space="preserve">Cadastro aceito; bruto R$ 2.500,00 (2.000 + 10.000 × 5 ÷ 100).</w:t>
             </w:r>
           </w:p>
         </w:tc>
@@ -18743,7 +19944,7 @@
                 <w:sz w:val="17"/>
                 <w:szCs w:val="17"/>
               </w:rPr>
-              <w:t xml:space="preserve">RF004</w:t>
+              <w:t xml:space="preserve">RF004, RF006</w:t>
             </w:r>
           </w:p>
         </w:tc>
@@ -18776,7 +19977,7 @@
                 <w:sz w:val="17"/>
                 <w:szCs w:val="17"/>
               </w:rPr>
-              <w:t xml:space="preserve">Cadastrar colaborador por produção a partir da quantidade e do valor por unidade.</w:t>
+              <w:t xml:space="preserve">Cadastrar colaborador por produção com salário base.</w:t>
             </w:r>
           </w:p>
         </w:tc>
@@ -18809,7 +20010,7 @@
                 <w:sz w:val="17"/>
                 <w:szCs w:val="17"/>
               </w:rPr>
-              <w:t xml:space="preserve">Informar quantidade produzida e valor por unidade. Executar o cadastro.</w:t>
+              <w:t xml:space="preserve">Banco vazio. Cadastrar produção R01, Carla Dias: salário base R$ 1.500,00, 500 unidades a R$ 10,00.</w:t>
             </w:r>
           </w:p>
         </w:tc>
@@ -18842,7 +20043,7 @@
                 <w:sz w:val="17"/>
                 <w:szCs w:val="17"/>
               </w:rPr>
-              <w:t xml:space="preserve">Cadastro aceito e salário calculado como quantidade × valor por unidade.</w:t>
+              <w:t xml:space="preserve">Cadastro aceito; bruto R$ 6.500,00 (1.500 + 500 × 10).</w:t>
             </w:r>
           </w:p>
         </w:tc>
@@ -18946,7 +20147,7 @@
                 <w:sz w:val="17"/>
                 <w:szCs w:val="17"/>
               </w:rPr>
-              <w:t xml:space="preserve">Testar a busca de um colaborador pela matrícula.</w:t>
+              <w:t xml:space="preserve">Localizar um colaborador pela matrícula.</w:t>
             </w:r>
           </w:p>
         </w:tc>
@@ -18979,7 +20180,7 @@
                 <w:sz w:val="17"/>
                 <w:szCs w:val="17"/>
               </w:rPr>
-              <w:t xml:space="preserve">Acessar a consulta, digitar a matrícula e ver o resultado.</w:t>
+              <w:t xml:space="preserve">P01 cadastrado (CT001). Consultar P01; depois consultar X99, que não existe.</w:t>
             </w:r>
           </w:p>
         </w:tc>
@@ -19012,7 +20213,7 @@
                 <w:sz w:val="17"/>
                 <w:szCs w:val="17"/>
               </w:rPr>
-              <w:t xml:space="preserve">O colaborador é localizado e os detalhes são exibidos.</w:t>
+              <w:t xml:space="preserve">P01 exibido com todos os dados; para X99, a mensagem "Nenhum colaborador encontrado".</w:t>
             </w:r>
           </w:p>
         </w:tc>
@@ -19083,7 +20284,7 @@
                 <w:sz w:val="17"/>
                 <w:szCs w:val="17"/>
               </w:rPr>
-              <w:t xml:space="preserve">RF006</w:t>
+              <w:t xml:space="preserve">RF006, RF010</w:t>
             </w:r>
           </w:p>
         </w:tc>
@@ -19116,7 +20317,7 @@
                 <w:sz w:val="17"/>
                 <w:szCs w:val="17"/>
               </w:rPr>
-              <w:t xml:space="preserve">Confirmar a exatidão dos cálculos do sistema.</w:t>
+              <w:t xml:space="preserve">Conferir o cálculo completo de um padrão acima do limite do IRRF.</w:t>
             </w:r>
           </w:p>
         </w:tc>
@@ -19149,7 +20350,7 @@
                 <w:sz w:val="17"/>
                 <w:szCs w:val="17"/>
               </w:rPr>
-              <w:t xml:space="preserve">Cadastrar colaboradores e verificar os valores calculados.</w:t>
+              <w:t xml:space="preserve">Banco vazio. Cadastrar padrão P02, Eduardo Reis, salário base R$ 5.000,00. Gerar a folha individual.</w:t>
             </w:r>
           </w:p>
         </w:tc>
@@ -19182,7 +20383,7 @@
                 <w:sz w:val="17"/>
                 <w:szCs w:val="17"/>
               </w:rPr>
-              <w:t xml:space="preserve">Cálculos feitos de forma automática e precisa.</w:t>
+              <w:t xml:space="preserve">Bruto R$ 5.000,00; INSS R$ 500,00; base do IRRF R$ 4.500,00; IRRF R$ 337,50; líquido R$ 4.162,50.</w:t>
             </w:r>
           </w:p>
         </w:tc>
@@ -19286,7 +20487,7 @@
                 <w:sz w:val="17"/>
                 <w:szCs w:val="17"/>
               </w:rPr>
-              <w:t xml:space="preserve">Gerar e exibir a folha de pagamento individual.</w:t>
+              <w:t xml:space="preserve">Gerar a folha individual.</w:t>
             </w:r>
           </w:p>
         </w:tc>
@@ -19319,7 +20520,7 @@
                 <w:sz w:val="17"/>
                 <w:szCs w:val="17"/>
               </w:rPr>
-              <w:t xml:space="preserve">Acessar a geração de folha, informar a matrícula e solicitar a emissão.</w:t>
+              <w:t xml:space="preserve">P01 cadastrado (CT001). Gerar a folha de P01.</w:t>
             </w:r>
           </w:p>
         </w:tc>
@@ -19352,7 +20553,7 @@
                 <w:sz w:val="17"/>
                 <w:szCs w:val="17"/>
               </w:rPr>
-              <w:t xml:space="preserve">Relatório individual com nome, salário bruto, INSS, IRRF e líquido.</w:t>
+              <w:t xml:space="preserve">Folha com matrícula, nome, tipo, bruto R$ 3.000,00, INSS R$ 300,00, IRRF R$ 202,50 e líquido R$ 2.497,50.</w:t>
             </w:r>
           </w:p>
         </w:tc>
@@ -19456,7 +20657,7 @@
                 <w:sz w:val="17"/>
                 <w:szCs w:val="17"/>
               </w:rPr>
-              <w:t xml:space="preserve">Gerar o relatório consolidado e conferir o total geral.</w:t>
+              <w:t xml:space="preserve">Conferir o conteúdo de cada linha do resumo.</w:t>
             </w:r>
           </w:p>
         </w:tc>
@@ -19489,7 +20690,7 @@
                 <w:sz w:val="17"/>
                 <w:szCs w:val="17"/>
               </w:rPr>
-              <w:t xml:space="preserve">Emitir o resumo consolidado e visualizar a listagem de colaboradores.</w:t>
+              <w:t xml:space="preserve">P01, C01 e R01 cadastrados (CT001, CT003, CT004). Emitir o resumo.</w:t>
             </w:r>
           </w:p>
         </w:tc>
@@ -19522,7 +20723,7 @@
                 <w:sz w:val="17"/>
                 <w:szCs w:val="17"/>
               </w:rPr>
-              <w:t xml:space="preserve">Todos os registros listados, com o somatório dos salários e dos impostos.</w:t>
+              <w:t xml:space="preserve">Três linhas, cada uma com matrícula, nome, tipo, bruto, INSS, IRRF e líquido, mais a linha de total geral.</w:t>
             </w:r>
           </w:p>
         </w:tc>
@@ -19593,7 +20794,7 @@
                 <w:sz w:val="17"/>
                 <w:szCs w:val="17"/>
               </w:rPr>
-              <w:t xml:space="preserve">RF009</w:t>
+              <w:t xml:space="preserve">RF009, RNF003</w:t>
             </w:r>
           </w:p>
         </w:tc>
@@ -19626,7 +20827,7 @@
                 <w:sz w:val="17"/>
                 <w:szCs w:val="17"/>
               </w:rPr>
-              <w:t xml:space="preserve">Testar a exclusão de um registro e a atualização da persistência.</w:t>
+              <w:t xml:space="preserve">Excluir um cadastro.</w:t>
             </w:r>
           </w:p>
         </w:tc>
@@ -19659,7 +20860,7 @@
                 <w:sz w:val="17"/>
                 <w:szCs w:val="17"/>
               </w:rPr>
-              <w:t xml:space="preserve">Excluir colaborador informando a matrícula e confirmar.</w:t>
+              <w:t xml:space="preserve">P01 e C01 cadastrados. Excluir C01 e confirmar. Consultar C01, listar todos, fechar e abrir o sistema e listar de novo.</w:t>
             </w:r>
           </w:p>
         </w:tc>
@@ -19692,7 +20893,7 @@
                 <w:sz w:val="17"/>
                 <w:szCs w:val="17"/>
               </w:rPr>
-              <w:t xml:space="preserve">O cadastro é excluído e deixa de aparecer na consulta.</w:t>
+              <w:t xml:space="preserve">C01 retorna "Nenhum colaborador encontrado"; as duas listagens mostram só P01.</w:t>
             </w:r>
           </w:p>
         </w:tc>
@@ -19796,7 +20997,7 @@
                 <w:sz w:val="17"/>
                 <w:szCs w:val="17"/>
               </w:rPr>
-              <w:t xml:space="preserve">Verificar se o sistema impede duas matrículas iguais.</w:t>
+              <w:t xml:space="preserve">Impedir matrícula repetida.</w:t>
             </w:r>
           </w:p>
         </w:tc>
@@ -19829,7 +21030,7 @@
                 <w:sz w:val="17"/>
                 <w:szCs w:val="17"/>
               </w:rPr>
-              <w:t xml:space="preserve">Cadastrar o padrão P01 (Ana Souza, R$ 3.000,00). Tentar cadastrar outro colaborador com a matrícula P01.</w:t>
+              <w:t xml:space="preserve">P01 cadastrado. Cadastrar outro colaborador com a matrícula P01.</w:t>
             </w:r>
           </w:p>
         </w:tc>
@@ -19862,7 +21063,7 @@
                 <w:sz w:val="17"/>
                 <w:szCs w:val="17"/>
               </w:rPr>
-              <w:t xml:space="preserve">Segundo cadastro recusado com "RN001: Toda matrícula deverá ser única"; só o primeiro permanece.</w:t>
+              <w:t xml:space="preserve">Recusado com "RN001: Toda matrícula deverá ser única"; só o primeiro P01 permanece.</w:t>
             </w:r>
           </w:p>
         </w:tc>
@@ -19966,7 +21167,7 @@
                 <w:sz w:val="17"/>
                 <w:szCs w:val="17"/>
               </w:rPr>
-              <w:t xml:space="preserve">Verificar se o sistema recusa nome vazio ou só com espaços.</w:t>
+              <w:t xml:space="preserve">Recusar nome vazio ou só com espaços.</w:t>
             </w:r>
           </w:p>
         </w:tc>
@@ -19999,7 +21200,7 @@
                 <w:sz w:val="17"/>
                 <w:szCs w:val="17"/>
               </w:rPr>
-              <w:t xml:space="preserve">Cadastrar padrão com matrícula P02, nome em branco e salário R$ 1.500,00.</w:t>
+              <w:t xml:space="preserve">Banco vazio. Cadastrar padrão P02 com nome "   " e salário R$ 1.500,00.</w:t>
             </w:r>
           </w:p>
         </w:tc>
@@ -20032,7 +21233,7 @@
                 <w:sz w:val="17"/>
                 <w:szCs w:val="17"/>
               </w:rPr>
-              <w:t xml:space="preserve">Cadastro recusado com "RN002: O nome do colaborador é obrigatório."; nada é gravado.</w:t>
+              <w:t xml:space="preserve">Recusado com "RN002: O nome do colaborador é obrigatório."; nada é gravado.</w:t>
             </w:r>
           </w:p>
         </w:tc>
@@ -20136,7 +21337,7 @@
                 <w:sz w:val="17"/>
                 <w:szCs w:val="17"/>
               </w:rPr>
-              <w:t xml:space="preserve">Verificar se o sistema impede salário base negativo e exibe o erro.</w:t>
+              <w:t xml:space="preserve">Recusar salário base negativo.</w:t>
             </w:r>
           </w:p>
         </w:tc>
@@ -20169,7 +21370,7 @@
                 <w:sz w:val="17"/>
                 <w:szCs w:val="17"/>
               </w:rPr>
-              <w:t xml:space="preserve">Preencher matrícula e nome, selecionar o tipo e inserir salário negativo.</w:t>
+              <w:t xml:space="preserve">Banco vazio. Cadastrar padrão P04, Fábio Melo, salário base R$ −100,00.</w:t>
             </w:r>
           </w:p>
         </w:tc>
@@ -20202,7 +21403,7 @@
                 <w:sz w:val="17"/>
                 <w:szCs w:val="17"/>
               </w:rPr>
-              <w:t xml:space="preserve">Cadastro barrado, com mensagem de erro na interface; o registro não é salvo.</w:t>
+              <w:t xml:space="preserve">Recusado com "RN003: O salário base não pode ser negativo."; nada é gravado e o sistema continua aberto.</w:t>
             </w:r>
           </w:p>
         </w:tc>
@@ -20306,7 +21507,7 @@
                 <w:sz w:val="17"/>
                 <w:szCs w:val="17"/>
               </w:rPr>
-              <w:t xml:space="preserve">Verificar se o sistema recusa valor de vendas negativo.</w:t>
+              <w:t xml:space="preserve">Recusar vendas negativas.</w:t>
             </w:r>
           </w:p>
         </w:tc>
@@ -20339,7 +21540,7 @@
                 <w:sz w:val="17"/>
                 <w:szCs w:val="17"/>
               </w:rPr>
-              <w:t xml:space="preserve">Cadastrar comissionado C02 com salário R$ 2.000,00, vendas R$ −100,00 e comissão 5%.</w:t>
+              <w:t xml:space="preserve">Banco vazio. Cadastrar comissionado C02 com salário R$ 2.000,00, vendas R$ −100,00 e comissão 5.</w:t>
             </w:r>
           </w:p>
         </w:tc>
@@ -20372,7 +21573,7 @@
                 <w:sz w:val="17"/>
                 <w:szCs w:val="17"/>
               </w:rPr>
-              <w:t xml:space="preserve">Cadastro recusado com "RN004: O valor de vendas não pode ser negativo."</w:t>
+              <w:t xml:space="preserve">Recusado com "RN004: O valor de vendas não pode ser negativo."</w:t>
             </w:r>
           </w:p>
         </w:tc>
@@ -20476,7 +21677,7 @@
                 <w:sz w:val="17"/>
                 <w:szCs w:val="17"/>
               </w:rPr>
-              <w:t xml:space="preserve">Verificar se o sistema recusa comissão negativa.</w:t>
+              <w:t xml:space="preserve">Recusar comissão negativa.</w:t>
             </w:r>
           </w:p>
         </w:tc>
@@ -20509,7 +21710,7 @@
                 <w:sz w:val="17"/>
                 <w:szCs w:val="17"/>
               </w:rPr>
-              <w:t xml:space="preserve">Cadastrar comissionado C03 com salário R$ 2.000,00, vendas R$ 10.000,00 e comissão −5%.</w:t>
+              <w:t xml:space="preserve">Banco vazio. Cadastrar comissionado C03 com salário R$ 2.000,00, vendas R$ 10.000,00 e comissão −5.</w:t>
             </w:r>
           </w:p>
         </w:tc>
@@ -20542,7 +21743,7 @@
                 <w:sz w:val="17"/>
                 <w:szCs w:val="17"/>
               </w:rPr>
-              <w:t xml:space="preserve">Cadastro recusado com "RN005: O percentual de comissão não pode ser negativo."</w:t>
+              <w:t xml:space="preserve">Recusado com "RN005: O percentual de comissão não pode ser negativo."</w:t>
             </w:r>
           </w:p>
         </w:tc>
@@ -20646,7 +21847,7 @@
                 <w:sz w:val="17"/>
                 <w:szCs w:val="17"/>
               </w:rPr>
-              <w:t xml:space="preserve">Verificar se o sistema recusa quantidade produzida negativa.</w:t>
+              <w:t xml:space="preserve">Recusar quantidade produzida negativa.</w:t>
             </w:r>
           </w:p>
         </w:tc>
@@ -20679,7 +21880,7 @@
                 <w:sz w:val="17"/>
                 <w:szCs w:val="17"/>
               </w:rPr>
-              <w:t xml:space="preserve">Cadastrar produção R02 com quantidade −10 e valor por unidade R$ 10,00.</w:t>
+              <w:t xml:space="preserve">Banco vazio. Cadastrar produção R02 com salário R$ 1.500,00, quantidade −10 e valor R$ 10,00.</w:t>
             </w:r>
           </w:p>
         </w:tc>
@@ -20712,7 +21913,7 @@
                 <w:sz w:val="17"/>
                 <w:szCs w:val="17"/>
               </w:rPr>
-              <w:t xml:space="preserve">Cadastro recusado com "RN006: A quantidade produzida não pode ser negativa."</w:t>
+              <w:t xml:space="preserve">Recusado com "RN006: A quantidade produzida não pode ser negativa."</w:t>
             </w:r>
           </w:p>
         </w:tc>
@@ -20816,7 +22017,7 @@
                 <w:sz w:val="17"/>
                 <w:szCs w:val="17"/>
               </w:rPr>
-              <w:t xml:space="preserve">Verificar se o sistema recusa valor por unidade negativo.</w:t>
+              <w:t xml:space="preserve">Recusar valor por unidade negativo.</w:t>
             </w:r>
           </w:p>
         </w:tc>
@@ -20849,7 +22050,7 @@
                 <w:sz w:val="17"/>
                 <w:szCs w:val="17"/>
               </w:rPr>
-              <w:t xml:space="preserve">Cadastrar produção R03 com quantidade 100 e valor por unidade R$ −2,00.</w:t>
+              <w:t xml:space="preserve">Banco vazio. Cadastrar produção R03 com salário R$ 1.500,00, quantidade 100 e valor R$ −2,00.</w:t>
             </w:r>
           </w:p>
         </w:tc>
@@ -20882,7 +22083,7 @@
                 <w:sz w:val="17"/>
                 <w:szCs w:val="17"/>
               </w:rPr>
-              <w:t xml:space="preserve">Cadastro recusado com "RN007: O valor pago por unidade produzida não pode ser negativo."</w:t>
+              <w:t xml:space="preserve">Recusado com "RN007: O valor pago por unidade produzida não pode ser negativo."</w:t>
             </w:r>
           </w:p>
         </w:tc>
@@ -20986,7 +22187,7 @@
                 <w:sz w:val="17"/>
                 <w:szCs w:val="17"/>
               </w:rPr>
-              <w:t xml:space="preserve">Conferir bruto, INSS, IRRF e líquido de um comissionado, no limite de isenção do IRRF.</w:t>
+              <w:t xml:space="preserve">Conferir um comissionado com base do IRRF abaixo do limite de isenção.</w:t>
             </w:r>
           </w:p>
         </w:tc>
@@ -21019,7 +22220,7 @@
                 <w:sz w:val="17"/>
                 <w:szCs w:val="17"/>
               </w:rPr>
-              <w:t xml:space="preserve">Cadastrar C01 (Bruno Lima): salário R$ 2.000,00, vendas R$ 10.000,00, comissão 5%. Gerar a folha individual.</w:t>
+              <w:t xml:space="preserve">C01 cadastrado (CT003). Gerar a folha de C01.</w:t>
             </w:r>
           </w:p>
         </w:tc>
@@ -21052,7 +22253,7 @@
                 <w:sz w:val="17"/>
                 <w:szCs w:val="17"/>
               </w:rPr>
-              <w:t xml:space="preserve">Bruto R$ 2.500,00; INSS R$ 250,00; IRRF R$ 0,00 (base R$ 2.250,00); líquido R$ 2.250,00.</w:t>
+              <w:t xml:space="preserve">Bruto R$ 2.500,00; INSS R$ 250,00; base do IRRF R$ 2.250,00, abaixo de R$ 2.259,20; IRRF R$ 0,00; líquido R$ 2.250,00.</w:t>
             </w:r>
           </w:p>
         </w:tc>
@@ -21156,7 +22357,7 @@
                 <w:sz w:val="17"/>
                 <w:szCs w:val="17"/>
               </w:rPr>
-              <w:t xml:space="preserve">Conferir bruto, INSS, IRRF e líquido de um colaborador por produção, com IRRF.</w:t>
+              <w:t xml:space="preserve">Conferir um colaborador por produção com IRRF.</w:t>
             </w:r>
           </w:p>
         </w:tc>
@@ -21189,7 +22390,7 @@
                 <w:sz w:val="17"/>
                 <w:szCs w:val="17"/>
               </w:rPr>
-              <w:t xml:space="preserve">Cadastrar R01 (Carla Dias): 500 unidades a R$ 10,00. Gerar a folha individual.</w:t>
+              <w:t xml:space="preserve">R01 cadastrado (CT004). Gerar a folha de R01.</w:t>
             </w:r>
           </w:p>
         </w:tc>
@@ -21222,7 +22423,7 @@
                 <w:sz w:val="17"/>
                 <w:szCs w:val="17"/>
               </w:rPr>
-              <w:t xml:space="preserve">Bruto R$ 5.000,00; INSS R$ 500,00; IRRF R$ 337,50; líquido R$ 4.162,50.</w:t>
+              <w:t xml:space="preserve">Bruto R$ 6.500,00; INSS R$ 650,00; base do IRRF R$ 5.850,00; IRRF R$ 438,75; líquido R$ 5.411,25.</w:t>
             </w:r>
           </w:p>
         </w:tc>
@@ -21326,7 +22527,7 @@
                 <w:sz w:val="17"/>
                 <w:szCs w:val="17"/>
               </w:rPr>
-              <w:t xml:space="preserve">Conferir os totais do resumo com os três tipos de colaborador.</w:t>
+              <w:t xml:space="preserve">Conferir os totais do resumo com os três tipos.</w:t>
             </w:r>
           </w:p>
         </w:tc>
@@ -21359,7 +22560,7 @@
                 <w:sz w:val="17"/>
                 <w:szCs w:val="17"/>
               </w:rPr>
-              <w:t xml:space="preserve">Cadastrar P01 (padrão, R$ 3.000,00), C01 e R01. Emitir o resumo consolidado.</w:t>
+              <w:t xml:space="preserve">P01, C01 e R01 cadastrados (CT001, CT003, CT004). Emitir o resumo.</w:t>
             </w:r>
           </w:p>
         </w:tc>
@@ -21392,7 +22593,7 @@
                 <w:sz w:val="17"/>
                 <w:szCs w:val="17"/>
               </w:rPr>
-              <w:t xml:space="preserve">3 colaboradores; bruto R$ 10.500,00; INSS R$ 1.050,00; IRRF R$ 540,00; líquido R$ 8.910,00.</w:t>
+              <w:t xml:space="preserve">3 colaboradores; bruto R$ 12.000,00; INSS R$ 1.200,00; IRRF R$ 641,25; líquido R$ 10.158,75.</w:t>
             </w:r>
           </w:p>
         </w:tc>
@@ -21496,7 +22697,7 @@
                 <w:sz w:val="17"/>
                 <w:szCs w:val="17"/>
               </w:rPr>
-              <w:t xml:space="preserve">Verificar se os dados continuam gravados após fechar e abrir o sistema.</w:t>
+              <w:t xml:space="preserve">Manter os dados depois de fechar e abrir o sistema.</w:t>
             </w:r>
           </w:p>
         </w:tc>
@@ -21529,7 +22730,7 @@
                 <w:sz w:val="17"/>
                 <w:szCs w:val="17"/>
               </w:rPr>
-              <w:t xml:space="preserve">Cadastrar P01, C01 e R01. Sair, abrir de novo e consultar as três matrículas.</w:t>
+              <w:t xml:space="preserve">P01, C01 e R01 cadastrados. Fechar o sistema, abrir de novo e consultar as três matrículas.</w:t>
             </w:r>
           </w:p>
         </w:tc>
@@ -21562,7 +22763,687 @@
                 <w:sz w:val="17"/>
                 <w:szCs w:val="17"/>
               </w:rPr>
-              <w:t xml:space="preserve">As três matrículas são encontradas, com os mesmos dados do cadastro.</w:t>
+              <w:t xml:space="preserve">As três são encontradas com os mesmos dados; o resumo repete os valores do CT019.</w:t>
+            </w:r>
+          </w:p>
+        </w:tc>
+      </w:tr>
+      <w:tr>
+        <w:trPr>
+          <w:tblHeader w:val="off"/>
+        </w:trPr>
+        <w:tc>
+          <w:tcPr>
+            <w:tcW w:type="dxa" w:w="800"/>
+            <w:tcBorders>
+              <w:top w:val="single" w:color="C9D3D1" w:sz="4"/>
+              <w:left w:val="single" w:color="C9D3D1" w:sz="4"/>
+              <w:bottom w:val="single" w:color="C9D3D1" w:sz="4"/>
+              <w:right w:val="single" w:color="C9D3D1" w:sz="4"/>
+            </w:tcBorders>
+            <w:tcMar>
+              <w:top w:type="dxa" w:w="70"/>
+              <w:left w:type="dxa" w:w="110"/>
+              <w:bottom w:type="dxa" w:w="70"/>
+              <w:right w:type="dxa" w:w="110"/>
+            </w:tcMar>
+          </w:tcPr>
+          <w:p>
+            <w:pPr>
+              <w:spacing w:after="0" w:line="260"/>
+            </w:pPr>
+            <w:r>
+              <w:rPr>
+                <w:rFonts w:ascii="Arial" w:cs="Arial" w:eastAsia="Arial" w:hAnsi="Arial"/>
+                <w:b/>
+                <w:bCs/>
+                <w:color w:val="1E2A30"/>
+                <w:sz w:val="17"/>
+                <w:szCs w:val="17"/>
+              </w:rPr>
+              <w:t xml:space="preserve">CT021</w:t>
+            </w:r>
+          </w:p>
+        </w:tc>
+        <w:tc>
+          <w:tcPr>
+            <w:tcW w:type="dxa" w:w="1150"/>
+            <w:tcBorders>
+              <w:top w:val="single" w:color="C9D3D1" w:sz="4"/>
+              <w:left w:val="single" w:color="C9D3D1" w:sz="4"/>
+              <w:bottom w:val="single" w:color="C9D3D1" w:sz="4"/>
+              <w:right w:val="single" w:color="C9D3D1" w:sz="4"/>
+            </w:tcBorders>
+            <w:tcMar>
+              <w:top w:type="dxa" w:w="70"/>
+              <w:left w:type="dxa" w:w="110"/>
+              <w:bottom w:type="dxa" w:w="70"/>
+              <w:right w:type="dxa" w:w="110"/>
+            </w:tcMar>
+          </w:tcPr>
+          <w:p>
+            <w:pPr>
+              <w:spacing w:after="0" w:line="260"/>
+            </w:pPr>
+            <w:r>
+              <w:rPr>
+                <w:rFonts w:ascii="Arial" w:cs="Arial" w:eastAsia="Arial" w:hAnsi="Arial"/>
+                <w:b w:val="false"/>
+                <w:bCs w:val="false"/>
+                <w:color w:val="1E2A30"/>
+                <w:sz w:val="17"/>
+                <w:szCs w:val="17"/>
+              </w:rPr>
+              <w:t xml:space="preserve">RF009, RNF003</w:t>
+            </w:r>
+          </w:p>
+        </w:tc>
+        <w:tc>
+          <w:tcPr>
+            <w:tcW w:type="dxa" w:w="2350"/>
+            <w:tcBorders>
+              <w:top w:val="single" w:color="C9D3D1" w:sz="4"/>
+              <w:left w:val="single" w:color="C9D3D1" w:sz="4"/>
+              <w:bottom w:val="single" w:color="C9D3D1" w:sz="4"/>
+              <w:right w:val="single" w:color="C9D3D1" w:sz="4"/>
+            </w:tcBorders>
+            <w:tcMar>
+              <w:top w:type="dxa" w:w="70"/>
+              <w:left w:type="dxa" w:w="110"/>
+              <w:bottom w:type="dxa" w:w="70"/>
+              <w:right w:type="dxa" w:w="110"/>
+            </w:tcMar>
+          </w:tcPr>
+          <w:p>
+            <w:pPr>
+              <w:spacing w:after="0" w:line="260"/>
+            </w:pPr>
+            <w:r>
+              <w:rPr>
+                <w:rFonts w:ascii="Arial" w:cs="Arial" w:eastAsia="Arial" w:hAnsi="Arial"/>
+                <w:b w:val="false"/>
+                <w:bCs w:val="false"/>
+                <w:color w:val="1E2A30"/>
+                <w:sz w:val="17"/>
+                <w:szCs w:val="17"/>
+              </w:rPr>
+              <w:t xml:space="preserve">Alterar um cadastro e conferir o novo cálculo.</w:t>
+            </w:r>
+          </w:p>
+        </w:tc>
+        <w:tc>
+          <w:tcPr>
+            <w:tcW w:type="dxa" w:w="2522"/>
+            <w:tcBorders>
+              <w:top w:val="single" w:color="C9D3D1" w:sz="4"/>
+              <w:left w:val="single" w:color="C9D3D1" w:sz="4"/>
+              <w:bottom w:val="single" w:color="C9D3D1" w:sz="4"/>
+              <w:right w:val="single" w:color="C9D3D1" w:sz="4"/>
+            </w:tcBorders>
+            <w:tcMar>
+              <w:top w:type="dxa" w:w="70"/>
+              <w:left w:type="dxa" w:w="110"/>
+              <w:bottom w:type="dxa" w:w="70"/>
+              <w:right w:type="dxa" w:w="110"/>
+            </w:tcMar>
+          </w:tcPr>
+          <w:p>
+            <w:pPr>
+              <w:spacing w:after="0" w:line="260"/>
+            </w:pPr>
+            <w:r>
+              <w:rPr>
+                <w:rFonts w:ascii="Arial" w:cs="Arial" w:eastAsia="Arial" w:hAnsi="Arial"/>
+                <w:b w:val="false"/>
+                <w:bCs w:val="false"/>
+                <w:color w:val="1E2A30"/>
+                <w:sz w:val="17"/>
+                <w:szCs w:val="17"/>
+              </w:rPr>
+              <w:t xml:space="preserve">P01 cadastrado (R$ 3.000,00). Alterar o salário base de P01 para R$ 3.500,00. Gerar a folha, fechar e abrir o sistema e gerar de novo.</w:t>
+            </w:r>
+          </w:p>
+        </w:tc>
+        <w:tc>
+          <w:tcPr>
+            <w:tcW w:type="dxa" w:w="2250"/>
+            <w:tcBorders>
+              <w:top w:val="single" w:color="C9D3D1" w:sz="4"/>
+              <w:left w:val="single" w:color="C9D3D1" w:sz="4"/>
+              <w:bottom w:val="single" w:color="C9D3D1" w:sz="4"/>
+              <w:right w:val="single" w:color="C9D3D1" w:sz="4"/>
+            </w:tcBorders>
+            <w:tcMar>
+              <w:top w:type="dxa" w:w="70"/>
+              <w:left w:type="dxa" w:w="110"/>
+              <w:bottom w:type="dxa" w:w="70"/>
+              <w:right w:type="dxa" w:w="110"/>
+            </w:tcMar>
+          </w:tcPr>
+          <w:p>
+            <w:pPr>
+              <w:spacing w:after="0" w:line="260"/>
+            </w:pPr>
+            <w:r>
+              <w:rPr>
+                <w:rFonts w:ascii="Arial" w:cs="Arial" w:eastAsia="Arial" w:hAnsi="Arial"/>
+                <w:b w:val="false"/>
+                <w:bCs w:val="false"/>
+                <w:color w:val="1E2A30"/>
+                <w:sz w:val="17"/>
+                <w:szCs w:val="17"/>
+              </w:rPr>
+              <w:t xml:space="preserve">As duas folhas mostram bruto R$ 3.500,00; INSS R$ 350,00; IRRF R$ 236,25; líquido R$ 2.913,75.</w:t>
+            </w:r>
+          </w:p>
+        </w:tc>
+      </w:tr>
+      <w:tr>
+        <w:trPr>
+          <w:tblHeader w:val="off"/>
+        </w:trPr>
+        <w:tc>
+          <w:tcPr>
+            <w:tcW w:type="dxa" w:w="800"/>
+            <w:tcBorders>
+              <w:top w:val="single" w:color="C9D3D1" w:sz="4"/>
+              <w:left w:val="single" w:color="C9D3D1" w:sz="4"/>
+              <w:bottom w:val="single" w:color="C9D3D1" w:sz="4"/>
+              <w:right w:val="single" w:color="C9D3D1" w:sz="4"/>
+            </w:tcBorders>
+            <w:tcMar>
+              <w:top w:type="dxa" w:w="70"/>
+              <w:left w:type="dxa" w:w="110"/>
+              <w:bottom w:type="dxa" w:w="70"/>
+              <w:right w:type="dxa" w:w="110"/>
+            </w:tcMar>
+          </w:tcPr>
+          <w:p>
+            <w:pPr>
+              <w:spacing w:after="0" w:line="260"/>
+            </w:pPr>
+            <w:r>
+              <w:rPr>
+                <w:rFonts w:ascii="Arial" w:cs="Arial" w:eastAsia="Arial" w:hAnsi="Arial"/>
+                <w:b/>
+                <w:bCs/>
+                <w:color w:val="1E2A30"/>
+                <w:sz w:val="17"/>
+                <w:szCs w:val="17"/>
+              </w:rPr>
+              <w:t xml:space="preserve">CT022</w:t>
+            </w:r>
+          </w:p>
+        </w:tc>
+        <w:tc>
+          <w:tcPr>
+            <w:tcW w:type="dxa" w:w="1150"/>
+            <w:tcBorders>
+              <w:top w:val="single" w:color="C9D3D1" w:sz="4"/>
+              <w:left w:val="single" w:color="C9D3D1" w:sz="4"/>
+              <w:bottom w:val="single" w:color="C9D3D1" w:sz="4"/>
+              <w:right w:val="single" w:color="C9D3D1" w:sz="4"/>
+            </w:tcBorders>
+            <w:tcMar>
+              <w:top w:type="dxa" w:w="70"/>
+              <w:left w:type="dxa" w:w="110"/>
+              <w:bottom w:type="dxa" w:w="70"/>
+              <w:right w:type="dxa" w:w="110"/>
+            </w:tcMar>
+          </w:tcPr>
+          <w:p>
+            <w:pPr>
+              <w:spacing w:after="0" w:line="260"/>
+            </w:pPr>
+            <w:r>
+              <w:rPr>
+                <w:rFonts w:ascii="Arial" w:cs="Arial" w:eastAsia="Arial" w:hAnsi="Arial"/>
+                <w:b w:val="false"/>
+                <w:bCs w:val="false"/>
+                <w:color w:val="1E2A30"/>
+                <w:sz w:val="17"/>
+                <w:szCs w:val="17"/>
+              </w:rPr>
+              <w:t xml:space="preserve">RF005</w:t>
+            </w:r>
+          </w:p>
+        </w:tc>
+        <w:tc>
+          <w:tcPr>
+            <w:tcW w:type="dxa" w:w="2350"/>
+            <w:tcBorders>
+              <w:top w:val="single" w:color="C9D3D1" w:sz="4"/>
+              <w:left w:val="single" w:color="C9D3D1" w:sz="4"/>
+              <w:bottom w:val="single" w:color="C9D3D1" w:sz="4"/>
+              <w:right w:val="single" w:color="C9D3D1" w:sz="4"/>
+            </w:tcBorders>
+            <w:tcMar>
+              <w:top w:type="dxa" w:w="70"/>
+              <w:left w:type="dxa" w:w="110"/>
+              <w:bottom w:type="dxa" w:w="70"/>
+              <w:right w:type="dxa" w:w="110"/>
+            </w:tcMar>
+          </w:tcPr>
+          <w:p>
+            <w:pPr>
+              <w:spacing w:after="0" w:line="260"/>
+            </w:pPr>
+            <w:r>
+              <w:rPr>
+                <w:rFonts w:ascii="Arial" w:cs="Arial" w:eastAsia="Arial" w:hAnsi="Arial"/>
+                <w:b w:val="false"/>
+                <w:bCs w:val="false"/>
+                <w:color w:val="1E2A30"/>
+                <w:sz w:val="17"/>
+                <w:szCs w:val="17"/>
+              </w:rPr>
+              <w:t xml:space="preserve">Listar todos os colaboradores com dados cadastrais e remuneratórios.</w:t>
+            </w:r>
+          </w:p>
+        </w:tc>
+        <w:tc>
+          <w:tcPr>
+            <w:tcW w:type="dxa" w:w="2522"/>
+            <w:tcBorders>
+              <w:top w:val="single" w:color="C9D3D1" w:sz="4"/>
+              <w:left w:val="single" w:color="C9D3D1" w:sz="4"/>
+              <w:bottom w:val="single" w:color="C9D3D1" w:sz="4"/>
+              <w:right w:val="single" w:color="C9D3D1" w:sz="4"/>
+            </w:tcBorders>
+            <w:tcMar>
+              <w:top w:type="dxa" w:w="70"/>
+              <w:left w:type="dxa" w:w="110"/>
+              <w:bottom w:type="dxa" w:w="70"/>
+              <w:right w:type="dxa" w:w="110"/>
+            </w:tcMar>
+          </w:tcPr>
+          <w:p>
+            <w:pPr>
+              <w:spacing w:after="0" w:line="260"/>
+            </w:pPr>
+            <w:r>
+              <w:rPr>
+                <w:rFonts w:ascii="Arial" w:cs="Arial" w:eastAsia="Arial" w:hAnsi="Arial"/>
+                <w:b w:val="false"/>
+                <w:bCs w:val="false"/>
+                <w:color w:val="1E2A30"/>
+                <w:sz w:val="17"/>
+                <w:szCs w:val="17"/>
+              </w:rPr>
+              <w:t xml:space="preserve">P01, C01 e R01 cadastrados. Abrir a listagem.</w:t>
+            </w:r>
+          </w:p>
+        </w:tc>
+        <w:tc>
+          <w:tcPr>
+            <w:tcW w:type="dxa" w:w="2250"/>
+            <w:tcBorders>
+              <w:top w:val="single" w:color="C9D3D1" w:sz="4"/>
+              <w:left w:val="single" w:color="C9D3D1" w:sz="4"/>
+              <w:bottom w:val="single" w:color="C9D3D1" w:sz="4"/>
+              <w:right w:val="single" w:color="C9D3D1" w:sz="4"/>
+            </w:tcBorders>
+            <w:tcMar>
+              <w:top w:type="dxa" w:w="70"/>
+              <w:left w:type="dxa" w:w="110"/>
+              <w:bottom w:type="dxa" w:w="70"/>
+              <w:right w:type="dxa" w:w="110"/>
+            </w:tcMar>
+          </w:tcPr>
+          <w:p>
+            <w:pPr>
+              <w:spacing w:after="0" w:line="260"/>
+            </w:pPr>
+            <w:r>
+              <w:rPr>
+                <w:rFonts w:ascii="Arial" w:cs="Arial" w:eastAsia="Arial" w:hAnsi="Arial"/>
+                <w:b w:val="false"/>
+                <w:bCs w:val="false"/>
+                <w:color w:val="1E2A30"/>
+                <w:sz w:val="17"/>
+                <w:szCs w:val="17"/>
+              </w:rPr>
+              <w:t xml:space="preserve">Três linhas com matrícula, nome, tipo, valores informados e salário bruto: P01 R$ 3.000,00; C01 R$ 2.500,00; R01 R$ 6.500,00.</w:t>
+            </w:r>
+          </w:p>
+        </w:tc>
+      </w:tr>
+      <w:tr>
+        <w:trPr>
+          <w:tblHeader w:val="off"/>
+        </w:trPr>
+        <w:tc>
+          <w:tcPr>
+            <w:tcW w:type="dxa" w:w="800"/>
+            <w:tcBorders>
+              <w:top w:val="single" w:color="C9D3D1" w:sz="4"/>
+              <w:left w:val="single" w:color="C9D3D1" w:sz="4"/>
+              <w:bottom w:val="single" w:color="C9D3D1" w:sz="4"/>
+              <w:right w:val="single" w:color="C9D3D1" w:sz="4"/>
+            </w:tcBorders>
+            <w:tcMar>
+              <w:top w:type="dxa" w:w="70"/>
+              <w:left w:type="dxa" w:w="110"/>
+              <w:bottom w:type="dxa" w:w="70"/>
+              <w:right w:type="dxa" w:w="110"/>
+            </w:tcMar>
+          </w:tcPr>
+          <w:p>
+            <w:pPr>
+              <w:spacing w:after="0" w:line="260"/>
+            </w:pPr>
+            <w:r>
+              <w:rPr>
+                <w:rFonts w:ascii="Arial" w:cs="Arial" w:eastAsia="Arial" w:hAnsi="Arial"/>
+                <w:b/>
+                <w:bCs/>
+                <w:color w:val="1E2A30"/>
+                <w:sz w:val="17"/>
+                <w:szCs w:val="17"/>
+              </w:rPr>
+              <w:t xml:space="preserve">CT023</w:t>
+            </w:r>
+          </w:p>
+        </w:tc>
+        <w:tc>
+          <w:tcPr>
+            <w:tcW w:type="dxa" w:w="1150"/>
+            <w:tcBorders>
+              <w:top w:val="single" w:color="C9D3D1" w:sz="4"/>
+              <w:left w:val="single" w:color="C9D3D1" w:sz="4"/>
+              <w:bottom w:val="single" w:color="C9D3D1" w:sz="4"/>
+              <w:right w:val="single" w:color="C9D3D1" w:sz="4"/>
+            </w:tcBorders>
+            <w:tcMar>
+              <w:top w:type="dxa" w:w="70"/>
+              <w:left w:type="dxa" w:w="110"/>
+              <w:bottom w:type="dxa" w:w="70"/>
+              <w:right w:type="dxa" w:w="110"/>
+            </w:tcMar>
+          </w:tcPr>
+          <w:p>
+            <w:pPr>
+              <w:spacing w:after="0" w:line="260"/>
+            </w:pPr>
+            <w:r>
+              <w:rPr>
+                <w:rFonts w:ascii="Arial" w:cs="Arial" w:eastAsia="Arial" w:hAnsi="Arial"/>
+                <w:b w:val="false"/>
+                <w:bCs w:val="false"/>
+                <w:color w:val="1E2A30"/>
+                <w:sz w:val="17"/>
+                <w:szCs w:val="17"/>
+              </w:rPr>
+              <w:t xml:space="preserve">RNF004</w:t>
+            </w:r>
+          </w:p>
+        </w:tc>
+        <w:tc>
+          <w:tcPr>
+            <w:tcW w:type="dxa" w:w="2350"/>
+            <w:tcBorders>
+              <w:top w:val="single" w:color="C9D3D1" w:sz="4"/>
+              <w:left w:val="single" w:color="C9D3D1" w:sz="4"/>
+              <w:bottom w:val="single" w:color="C9D3D1" w:sz="4"/>
+              <w:right w:val="single" w:color="C9D3D1" w:sz="4"/>
+            </w:tcBorders>
+            <w:tcMar>
+              <w:top w:type="dxa" w:w="70"/>
+              <w:left w:type="dxa" w:w="110"/>
+              <w:bottom w:type="dxa" w:w="70"/>
+              <w:right w:type="dxa" w:w="110"/>
+            </w:tcMar>
+          </w:tcPr>
+          <w:p>
+            <w:pPr>
+              <w:spacing w:after="0" w:line="260"/>
+            </w:pPr>
+            <w:r>
+              <w:rPr>
+                <w:rFonts w:ascii="Arial" w:cs="Arial" w:eastAsia="Arial" w:hAnsi="Arial"/>
+                <w:b w:val="false"/>
+                <w:bCs w:val="false"/>
+                <w:color w:val="1E2A30"/>
+                <w:sz w:val="17"/>
+                <w:szCs w:val="17"/>
+              </w:rPr>
+              <w:t xml:space="preserve">Incluir um novo tipo de remuneração sem alterar os cálculos existentes.</w:t>
+            </w:r>
+          </w:p>
+        </w:tc>
+        <w:tc>
+          <w:tcPr>
+            <w:tcW w:type="dxa" w:w="2522"/>
+            <w:tcBorders>
+              <w:top w:val="single" w:color="C9D3D1" w:sz="4"/>
+              <w:left w:val="single" w:color="C9D3D1" w:sz="4"/>
+              <w:bottom w:val="single" w:color="C9D3D1" w:sz="4"/>
+              <w:right w:val="single" w:color="C9D3D1" w:sz="4"/>
+            </w:tcBorders>
+            <w:tcMar>
+              <w:top w:type="dxa" w:w="70"/>
+              <w:left w:type="dxa" w:w="110"/>
+              <w:bottom w:type="dxa" w:w="70"/>
+              <w:right w:type="dxa" w:w="110"/>
+            </w:tcMar>
+          </w:tcPr>
+          <w:p>
+            <w:pPr>
+              <w:spacing w:after="0" w:line="260"/>
+            </w:pPr>
+            <w:r>
+              <w:rPr>
+                <w:rFonts w:ascii="Arial" w:cs="Arial" w:eastAsia="Arial" w:hAnsi="Arial"/>
+                <w:b w:val="false"/>
+                <w:bCs w:val="false"/>
+                <w:color w:val="1E2A30"/>
+                <w:sz w:val="17"/>
+                <w:szCs w:val="17"/>
+              </w:rPr>
+              <w:t xml:space="preserve">Criar, só no teste, uma subclasse de Colaborador com cálculo próprio (horista: 10 horas a R$ 50,00). Rodar CT006, CT017 e CT018 de novo.</w:t>
+            </w:r>
+          </w:p>
+        </w:tc>
+        <w:tc>
+          <w:tcPr>
+            <w:tcW w:type="dxa" w:w="2250"/>
+            <w:tcBorders>
+              <w:top w:val="single" w:color="C9D3D1" w:sz="4"/>
+              <w:left w:val="single" w:color="C9D3D1" w:sz="4"/>
+              <w:bottom w:val="single" w:color="C9D3D1" w:sz="4"/>
+              <w:right w:val="single" w:color="C9D3D1" w:sz="4"/>
+            </w:tcBorders>
+            <w:tcMar>
+              <w:top w:type="dxa" w:w="70"/>
+              <w:left w:type="dxa" w:w="110"/>
+              <w:bottom w:type="dxa" w:w="70"/>
+              <w:right w:type="dxa" w:w="110"/>
+            </w:tcMar>
+          </w:tcPr>
+          <w:p>
+            <w:pPr>
+              <w:spacing w:after="0" w:line="260"/>
+            </w:pPr>
+            <w:r>
+              <w:rPr>
+                <w:rFonts w:ascii="Arial" w:cs="Arial" w:eastAsia="Arial" w:hAnsi="Arial"/>
+                <w:b w:val="false"/>
+                <w:bCs w:val="false"/>
+                <w:color w:val="1E2A30"/>
+                <w:sz w:val="17"/>
+                <w:szCs w:val="17"/>
+              </w:rPr>
+              <w:t xml:space="preserve">O novo tipo calcula bruto R$ 500,00; CT006, CT017 e CT018 continuam aprovados; nenhuma linha das classes existentes muda (git diff vazio nelas).</w:t>
+            </w:r>
+          </w:p>
+        </w:tc>
+      </w:tr>
+      <w:tr>
+        <w:trPr>
+          <w:tblHeader w:val="off"/>
+        </w:trPr>
+        <w:tc>
+          <w:tcPr>
+            <w:tcW w:type="dxa" w:w="800"/>
+            <w:tcBorders>
+              <w:top w:val="single" w:color="C9D3D1" w:sz="4"/>
+              <w:left w:val="single" w:color="C9D3D1" w:sz="4"/>
+              <w:bottom w:val="single" w:color="C9D3D1" w:sz="4"/>
+              <w:right w:val="single" w:color="C9D3D1" w:sz="4"/>
+            </w:tcBorders>
+            <w:tcMar>
+              <w:top w:type="dxa" w:w="70"/>
+              <w:left w:type="dxa" w:w="110"/>
+              <w:bottom w:type="dxa" w:w="70"/>
+              <w:right w:type="dxa" w:w="110"/>
+            </w:tcMar>
+          </w:tcPr>
+          <w:p>
+            <w:pPr>
+              <w:spacing w:after="0" w:line="260"/>
+            </w:pPr>
+            <w:r>
+              <w:rPr>
+                <w:rFonts w:ascii="Arial" w:cs="Arial" w:eastAsia="Arial" w:hAnsi="Arial"/>
+                <w:b/>
+                <w:bCs/>
+                <w:color w:val="1E2A30"/>
+                <w:sz w:val="17"/>
+                <w:szCs w:val="17"/>
+              </w:rPr>
+              <w:t xml:space="preserve">CT024</w:t>
+            </w:r>
+          </w:p>
+        </w:tc>
+        <w:tc>
+          <w:tcPr>
+            <w:tcW w:type="dxa" w:w="1150"/>
+            <w:tcBorders>
+              <w:top w:val="single" w:color="C9D3D1" w:sz="4"/>
+              <w:left w:val="single" w:color="C9D3D1" w:sz="4"/>
+              <w:bottom w:val="single" w:color="C9D3D1" w:sz="4"/>
+              <w:right w:val="single" w:color="C9D3D1" w:sz="4"/>
+            </w:tcBorders>
+            <w:tcMar>
+              <w:top w:type="dxa" w:w="70"/>
+              <w:left w:type="dxa" w:w="110"/>
+              <w:bottom w:type="dxa" w:w="70"/>
+              <w:right w:type="dxa" w:w="110"/>
+            </w:tcMar>
+          </w:tcPr>
+          <w:p>
+            <w:pPr>
+              <w:spacing w:after="0" w:line="260"/>
+            </w:pPr>
+            <w:r>
+              <w:rPr>
+                <w:rFonts w:ascii="Arial" w:cs="Arial" w:eastAsia="Arial" w:hAnsi="Arial"/>
+                <w:b w:val="false"/>
+                <w:bCs w:val="false"/>
+                <w:color w:val="1E2A30"/>
+                <w:sz w:val="17"/>
+                <w:szCs w:val="17"/>
+              </w:rPr>
+              <w:t xml:space="preserve">RNF001</w:t>
+            </w:r>
+          </w:p>
+        </w:tc>
+        <w:tc>
+          <w:tcPr>
+            <w:tcW w:type="dxa" w:w="2350"/>
+            <w:tcBorders>
+              <w:top w:val="single" w:color="C9D3D1" w:sz="4"/>
+              <w:left w:val="single" w:color="C9D3D1" w:sz="4"/>
+              <w:bottom w:val="single" w:color="C9D3D1" w:sz="4"/>
+              <w:right w:val="single" w:color="C9D3D1" w:sz="4"/>
+            </w:tcBorders>
+            <w:tcMar>
+              <w:top w:type="dxa" w:w="70"/>
+              <w:left w:type="dxa" w:w="110"/>
+              <w:bottom w:type="dxa" w:w="70"/>
+              <w:right w:type="dxa" w:w="110"/>
+            </w:tcMar>
+          </w:tcPr>
+          <w:p>
+            <w:pPr>
+              <w:spacing w:after="0" w:line="260"/>
+            </w:pPr>
+            <w:r>
+              <w:rPr>
+                <w:rFonts w:ascii="Arial" w:cs="Arial" w:eastAsia="Arial" w:hAnsi="Arial"/>
+                <w:b w:val="false"/>
+                <w:bCs w:val="false"/>
+                <w:color w:val="1E2A30"/>
+                <w:sz w:val="17"/>
+                <w:szCs w:val="17"/>
+              </w:rPr>
+              <w:t xml:space="preserve">Usar o sistema sem ajuda.</w:t>
+            </w:r>
+          </w:p>
+        </w:tc>
+        <w:tc>
+          <w:tcPr>
+            <w:tcW w:type="dxa" w:w="2522"/>
+            <w:tcBorders>
+              <w:top w:val="single" w:color="C9D3D1" w:sz="4"/>
+              <w:left w:val="single" w:color="C9D3D1" w:sz="4"/>
+              <w:bottom w:val="single" w:color="C9D3D1" w:sz="4"/>
+              <w:right w:val="single" w:color="C9D3D1" w:sz="4"/>
+            </w:tcBorders>
+            <w:tcMar>
+              <w:top w:type="dxa" w:w="70"/>
+              <w:left w:type="dxa" w:w="110"/>
+              <w:bottom w:type="dxa" w:w="70"/>
+              <w:right w:type="dxa" w:w="110"/>
+            </w:tcMar>
+          </w:tcPr>
+          <w:p>
+            <w:pPr>
+              <w:spacing w:after="0" w:line="260"/>
+            </w:pPr>
+            <w:r>
+              <w:rPr>
+                <w:rFonts w:ascii="Arial" w:cs="Arial" w:eastAsia="Arial" w:hAnsi="Arial"/>
+                <w:b w:val="false"/>
+                <w:bCs w:val="false"/>
+                <w:color w:val="1E2A30"/>
+                <w:sz w:val="17"/>
+                <w:szCs w:val="17"/>
+              </w:rPr>
+              <w:t xml:space="preserve">Uma pessoa de fora da equipe recebe só o Manual do Usuário e precisa cadastrar P01 e emitir o resumo.</w:t>
+            </w:r>
+          </w:p>
+        </w:tc>
+        <w:tc>
+          <w:tcPr>
+            <w:tcW w:type="dxa" w:w="2250"/>
+            <w:tcBorders>
+              <w:top w:val="single" w:color="C9D3D1" w:sz="4"/>
+              <w:left w:val="single" w:color="C9D3D1" w:sz="4"/>
+              <w:bottom w:val="single" w:color="C9D3D1" w:sz="4"/>
+              <w:right w:val="single" w:color="C9D3D1" w:sz="4"/>
+            </w:tcBorders>
+            <w:tcMar>
+              <w:top w:type="dxa" w:w="70"/>
+              <w:left w:type="dxa" w:w="110"/>
+              <w:bottom w:type="dxa" w:w="70"/>
+              <w:right w:type="dxa" w:w="110"/>
+            </w:tcMar>
+          </w:tcPr>
+          <w:p>
+            <w:pPr>
+              <w:spacing w:after="0" w:line="260"/>
+            </w:pPr>
+            <w:r>
+              <w:rPr>
+                <w:rFonts w:ascii="Arial" w:cs="Arial" w:eastAsia="Arial" w:hAnsi="Arial"/>
+                <w:b w:val="false"/>
+                <w:bCs w:val="false"/>
+                <w:color w:val="1E2A30"/>
+                <w:sz w:val="17"/>
+                <w:szCs w:val="17"/>
+              </w:rPr>
+              <w:t xml:space="preserve">Tarefa concluída sem ajuda em até 5 minutos; tempo e dificuldades anotados no Relatório de Testes.</w:t>
             </w:r>
           </w:p>
         </w:tc>
@@ -23819,6 +25700,135 @@
                 <w:szCs w:val="19"/>
               </w:rPr>
               <w:t xml:space="preserve">Equipe</w:t>
+            </w:r>
+          </w:p>
+        </w:tc>
+      </w:tr>
+      <w:tr>
+        <w:trPr>
+          <w:tblHeader w:val="off"/>
+        </w:trPr>
+        <w:tc>
+          <w:tcPr>
+            <w:tcW w:type="dxa" w:w="4072"/>
+            <w:tcBorders>
+              <w:top w:val="single" w:color="C9D3D1" w:sz="4"/>
+              <w:left w:val="single" w:color="C9D3D1" w:sz="4"/>
+              <w:bottom w:val="single" w:color="C9D3D1" w:sz="4"/>
+              <w:right w:val="single" w:color="C9D3D1" w:sz="4"/>
+            </w:tcBorders>
+            <w:tcMar>
+              <w:top w:type="dxa" w:w="70"/>
+              <w:left w:type="dxa" w:w="110"/>
+              <w:bottom w:type="dxa" w:w="70"/>
+              <w:right w:type="dxa" w:w="110"/>
+            </w:tcMar>
+          </w:tcPr>
+          <w:p>
+            <w:pPr>
+              <w:spacing w:after="0" w:line="260"/>
+            </w:pPr>
+            <w:r>
+              <w:rPr>
+                <w:rFonts w:ascii="Arial" w:cs="Arial" w:eastAsia="Arial" w:hAnsi="Arial"/>
+                <w:color w:val="1E2A30"/>
+                <w:sz w:val="19"/>
+                <w:szCs w:val="19"/>
+              </w:rPr>
+              <w:t xml:space="preserve">Correções da avaliação da A1 (versão 1.1)</w:t>
+            </w:r>
+          </w:p>
+        </w:tc>
+        <w:tc>
+          <w:tcPr>
+            <w:tcW w:type="dxa" w:w="1300"/>
+            <w:tcBorders>
+              <w:top w:val="single" w:color="C9D3D1" w:sz="4"/>
+              <w:left w:val="single" w:color="C9D3D1" w:sz="4"/>
+              <w:bottom w:val="single" w:color="C9D3D1" w:sz="4"/>
+              <w:right w:val="single" w:color="C9D3D1" w:sz="4"/>
+            </w:tcBorders>
+            <w:tcMar>
+              <w:top w:type="dxa" w:w="70"/>
+              <w:left w:type="dxa" w:w="110"/>
+              <w:bottom w:type="dxa" w:w="70"/>
+              <w:right w:type="dxa" w:w="110"/>
+            </w:tcMar>
+          </w:tcPr>
+          <w:p>
+            <w:pPr>
+              <w:spacing w:after="0" w:line="260"/>
+            </w:pPr>
+            <w:r>
+              <w:rPr>
+                <w:rFonts w:ascii="Arial" w:cs="Arial" w:eastAsia="Arial" w:hAnsi="Arial"/>
+                <w:color w:val="1E2A30"/>
+                <w:sz w:val="19"/>
+                <w:szCs w:val="19"/>
+              </w:rPr>
+              <w:t xml:space="preserve">30/10</w:t>
+            </w:r>
+          </w:p>
+        </w:tc>
+        <w:tc>
+          <w:tcPr>
+            <w:tcW w:type="dxa" w:w="1300"/>
+            <w:tcBorders>
+              <w:top w:val="single" w:color="C9D3D1" w:sz="4"/>
+              <w:left w:val="single" w:color="C9D3D1" w:sz="4"/>
+              <w:bottom w:val="single" w:color="C9D3D1" w:sz="4"/>
+              <w:right w:val="single" w:color="C9D3D1" w:sz="4"/>
+            </w:tcBorders>
+            <w:tcMar>
+              <w:top w:type="dxa" w:w="70"/>
+              <w:left w:type="dxa" w:w="110"/>
+              <w:bottom w:type="dxa" w:w="70"/>
+              <w:right w:type="dxa" w:w="110"/>
+            </w:tcMar>
+          </w:tcPr>
+          <w:p>
+            <w:pPr>
+              <w:spacing w:after="0" w:line="260"/>
+            </w:pPr>
+            <w:r>
+              <w:rPr>
+                <w:rFonts w:ascii="Arial" w:cs="Arial" w:eastAsia="Arial" w:hAnsi="Arial"/>
+                <w:color w:val="1E2A30"/>
+                <w:sz w:val="19"/>
+                <w:szCs w:val="19"/>
+              </w:rPr>
+              <w:t xml:space="preserve">30/10</w:t>
+            </w:r>
+          </w:p>
+        </w:tc>
+        <w:tc>
+          <w:tcPr>
+            <w:tcW w:type="dxa" w:w="2400"/>
+            <w:tcBorders>
+              <w:top w:val="single" w:color="C9D3D1" w:sz="4"/>
+              <w:left w:val="single" w:color="C9D3D1" w:sz="4"/>
+              <w:bottom w:val="single" w:color="C9D3D1" w:sz="4"/>
+              <w:right w:val="single" w:color="C9D3D1" w:sz="4"/>
+            </w:tcBorders>
+            <w:tcMar>
+              <w:top w:type="dxa" w:w="70"/>
+              <w:left w:type="dxa" w:w="110"/>
+              <w:bottom w:type="dxa" w:w="70"/>
+              <w:right w:type="dxa" w:w="110"/>
+            </w:tcMar>
+          </w:tcPr>
+          <w:p>
+            <w:pPr>
+              <w:spacing w:after="0" w:line="260"/>
+            </w:pPr>
+            <w:r>
+              <w:rPr>
+                <w:rFonts w:ascii="Arial" w:cs="Arial" w:eastAsia="Arial" w:hAnsi="Arial"/>
+                <w:color w:val="1E2A30"/>
+                <w:sz w:val="19"/>
+                <w:szCs w:val="19"/>
+              </w:rPr>
+              <w:t xml:space="preserve">João e Iago</w:t>
             </w:r>
           </w:p>
         </w:tc>
@@ -25450,6 +27460,20 @@
     </w:p>
     <w:p>
       <w:pPr>
+        <w:spacing w:after="120" w:line="300"/>
+      </w:pPr>
+      <w:r>
+        <w:rPr>
+          <w:rFonts w:ascii="Arial" w:cs="Arial" w:eastAsia="Arial" w:hAnsi="Arial"/>
+          <w:color w:val="1E2A30"/>
+          <w:sz w:val="22"/>
+          <w:szCs w:val="22"/>
+        </w:rPr>
+        <w:t xml:space="preserve">A partir da versão 1.1, cada artefato da A1 também fica na pasta do seu tipo, em PDF: 01_Requisitos (Visão e ERS), 02_Analise (Modelagem UML, com o código PlantUML e as imagens), 03_Projeto (Arquitetura e Planejamento), 04_Testes (Plano de Testes e Casos de Teste) e 10_Qualidade (PGQ e ata de revisão). O documento completo continua em 11_Apresentacao.</w:t>
+      </w:r>
+    </w:p>
+    <w:p>
+      <w:pPr>
         <w:pStyle w:val="Heading2"/>
         <w:keepNext/>
         <w:keepLines/>
@@ -26368,7 +28392,7 @@
           <w:sz w:val="22"/>
           <w:szCs w:val="22"/>
         </w:rPr>
-        <w:t xml:space="preserve">Modelo do Anexo I (seção 15), preenchido na revisão cruzada da A1.</w:t>
+        <w:t xml:space="preserve">Modelo do Anexo I (seção 15), preenchido na revisão feita a partir da avaliação da A1 recebida em 21/10/2026.</w:t>
       </w:r>
     </w:p>
     <w:tbl>
@@ -26419,8 +28443,8 @@
                 <w:b/>
                 <w:bCs/>
                 <w:color w:val="1E2A30"/>
-                <w:sz w:val="20"/>
-                <w:szCs w:val="20"/>
+                <w:sz w:val="19"/>
+                <w:szCs w:val="19"/>
               </w:rPr>
               <w:t xml:space="preserve">Item</w:t>
             </w:r>
@@ -26453,8 +28477,8 @@
                 <w:b/>
                 <w:bCs/>
                 <w:color w:val="1E2A30"/>
-                <w:sz w:val="20"/>
-                <w:szCs w:val="20"/>
+                <w:sz w:val="19"/>
+                <w:szCs w:val="19"/>
               </w:rPr>
               <w:t xml:space="preserve">Informação</w:t>
             </w:r>
@@ -26491,8 +28515,8 @@
                 <w:b/>
                 <w:bCs/>
                 <w:color w:val="1E2A30"/>
-                <w:sz w:val="20"/>
-                <w:szCs w:val="20"/>
+                <w:sz w:val="19"/>
+                <w:szCs w:val="19"/>
               </w:rPr>
               <w:t xml:space="preserve">Projeto</w:t>
             </w:r>
@@ -26524,10 +28548,10 @@
                 <w:b w:val="false"/>
                 <w:bCs w:val="false"/>
                 <w:color w:val="1E2A30"/>
-                <w:sz w:val="20"/>
-                <w:szCs w:val="20"/>
-              </w:rPr>
-              <w:t xml:space="preserve">Sistema de Folha de Pagamento</w:t>
+                <w:sz w:val="19"/>
+                <w:szCs w:val="19"/>
+              </w:rPr>
+              <w:t xml:space="preserve">Financy · Sistema de Folha de Pagamento</w:t>
             </w:r>
           </w:p>
         </w:tc>
@@ -26562,8 +28586,8 @@
                 <w:b/>
                 <w:bCs/>
                 <w:color w:val="1E2A30"/>
-                <w:sz w:val="20"/>
-                <w:szCs w:val="20"/>
+                <w:sz w:val="19"/>
+                <w:szCs w:val="19"/>
               </w:rPr>
               <w:t xml:space="preserve">Data</w:t>
             </w:r>
@@ -26595,10 +28619,10 @@
                 <w:b w:val="false"/>
                 <w:bCs w:val="false"/>
                 <w:color w:val="1E2A30"/>
-                <w:sz w:val="20"/>
-                <w:szCs w:val="20"/>
-              </w:rPr>
-              <w:t xml:space="preserve"/>
+                <w:sz w:val="19"/>
+                <w:szCs w:val="19"/>
+              </w:rPr>
+              <w:t xml:space="preserve">30/10/2026</w:t>
             </w:r>
           </w:p>
         </w:tc>
@@ -26633,8 +28657,8 @@
                 <w:b/>
                 <w:bCs/>
                 <w:color w:val="1E2A30"/>
-                <w:sz w:val="20"/>
-                <w:szCs w:val="20"/>
+                <w:sz w:val="19"/>
+                <w:szCs w:val="19"/>
               </w:rPr>
               <w:t xml:space="preserve">Participantes</w:t>
             </w:r>
@@ -26666,10 +28690,26 @@
                 <w:b w:val="false"/>
                 <w:bCs w:val="false"/>
                 <w:color w:val="1E2A30"/>
-                <w:sz w:val="20"/>
-                <w:szCs w:val="20"/>
-              </w:rPr>
-              <w:t xml:space="preserve"/>
+                <w:sz w:val="19"/>
+                <w:szCs w:val="19"/>
+              </w:rPr>
+              <w:t xml:space="preserve">João Vitor Rosiak de O. Baltezan</w:t>
+            </w:r>
+          </w:p>
+          <w:p>
+            <w:pPr>
+              <w:spacing w:after="0" w:line="260"/>
+            </w:pPr>
+            <w:r>
+              <w:rPr>
+                <w:rFonts w:ascii="Arial" w:cs="Arial" w:eastAsia="Arial" w:hAnsi="Arial"/>
+                <w:b w:val="false"/>
+                <w:bCs w:val="false"/>
+                <w:color w:val="1E2A30"/>
+                <w:sz w:val="19"/>
+                <w:szCs w:val="19"/>
+              </w:rPr>
+              <w:t xml:space="preserve">Iago Ferst Tubiana</w:t>
             </w:r>
           </w:p>
         </w:tc>
@@ -26704,8 +28744,8 @@
                 <w:b/>
                 <w:bCs/>
                 <w:color w:val="1E2A30"/>
-                <w:sz w:val="20"/>
-                <w:szCs w:val="20"/>
+                <w:sz w:val="19"/>
+                <w:szCs w:val="19"/>
               </w:rPr>
               <w:t xml:space="preserve">Artefatos revisados</w:t>
             </w:r>
@@ -26737,10 +28777,10 @@
                 <w:b w:val="false"/>
                 <w:bCs w:val="false"/>
                 <w:color w:val="1E2A30"/>
-                <w:sz w:val="20"/>
-                <w:szCs w:val="20"/>
-              </w:rPr>
-              <w:t xml:space="preserve"/>
+                <w:sz w:val="19"/>
+                <w:szCs w:val="19"/>
+              </w:rPr>
+              <w:t xml:space="preserve">Documento da A1 versão 1.0 (seções 1 a 9), diagramas UML 3.1 a 3.4 e organização do repositório</w:t>
             </w:r>
           </w:p>
         </w:tc>
@@ -26775,8 +28815,8 @@
                 <w:b/>
                 <w:bCs/>
                 <w:color w:val="1E2A30"/>
-                <w:sz w:val="20"/>
-                <w:szCs w:val="20"/>
+                <w:sz w:val="19"/>
+                <w:szCs w:val="19"/>
               </w:rPr>
               <w:t xml:space="preserve">Não conformidades encontradas</w:t>
             </w:r>
@@ -26808,10 +28848,106 @@
                 <w:b w:val="false"/>
                 <w:bCs w:val="false"/>
                 <w:color w:val="1E2A30"/>
-                <w:sz w:val="20"/>
-                <w:szCs w:val="20"/>
-              </w:rPr>
-              <w:t xml:space="preserve"/>
+                <w:sz w:val="19"/>
+                <w:szCs w:val="19"/>
+              </w:rPr>
+              <w:t xml:space="preserve">1. Remuneração por produção sem o salário base em RF004, UML e casos de teste.</w:t>
+            </w:r>
+          </w:p>
+          <w:p>
+            <w:pPr>
+              <w:spacing w:after="0" w:line="260"/>
+            </w:pPr>
+            <w:r>
+              <w:rPr>
+                <w:rFonts w:ascii="Arial" w:cs="Arial" w:eastAsia="Arial" w:hAnsi="Arial"/>
+                <w:b w:val="false"/>
+                <w:bCs w:val="false"/>
+                <w:color w:val="1E2A30"/>
+                <w:sz w:val="19"/>
+                <w:szCs w:val="19"/>
+              </w:rPr>
+              <w:t xml:space="preserve">2. Requisitos funcionais só com título; RF005 sem a listagem cadastral e remuneratória.</w:t>
+            </w:r>
+          </w:p>
+          <w:p>
+            <w:pPr>
+              <w:spacing w:after="0" w:line="260"/>
+            </w:pPr>
+            <w:r>
+              <w:rPr>
+                <w:rFonts w:ascii="Arial" w:cs="Arial" w:eastAsia="Arial" w:hAnsi="Arial"/>
+                <w:b w:val="false"/>
+                <w:bCs w:val="false"/>
+                <w:color w:val="1E2A30"/>
+                <w:sz w:val="19"/>
+                <w:szCs w:val="19"/>
+              </w:rPr>
+              <w:t xml:space="preserve">3. Matriz sem RNF001, RNF002 e RNF004.</w:t>
+            </w:r>
+          </w:p>
+          <w:p>
+            <w:pPr>
+              <w:spacing w:after="0" w:line="260"/>
+            </w:pPr>
+            <w:r>
+              <w:rPr>
+                <w:rFonts w:ascii="Arial" w:cs="Arial" w:eastAsia="Arial" w:hAnsi="Arial"/>
+                <w:b w:val="false"/>
+                <w:bCs w:val="false"/>
+                <w:color w:val="1E2A30"/>
+                <w:sz w:val="19"/>
+                <w:szCs w:val="19"/>
+              </w:rPr>
+              <w:t xml:space="preserve">4. Diagrama de classes sem alteração e sem o repositório; atividades sem a conversão do percentual.</w:t>
+            </w:r>
+          </w:p>
+          <w:p>
+            <w:pPr>
+              <w:spacing w:after="0" w:line="260"/>
+            </w:pPr>
+            <w:r>
+              <w:rPr>
+                <w:rFonts w:ascii="Arial" w:cs="Arial" w:eastAsia="Arial" w:hAnsi="Arial"/>
+                <w:b w:val="false"/>
+                <w:bCs w:val="false"/>
+                <w:color w:val="1E2A30"/>
+                <w:sz w:val="19"/>
+                <w:szCs w:val="19"/>
+              </w:rPr>
+              <w:t xml:space="preserve">5. Critérios de qualidade sem limites verificáveis; revisão sem registro e encerramento das não conformidades.</w:t>
+            </w:r>
+          </w:p>
+          <w:p>
+            <w:pPr>
+              <w:spacing w:after="0" w:line="260"/>
+            </w:pPr>
+            <w:r>
+              <w:rPr>
+                <w:rFonts w:ascii="Arial" w:cs="Arial" w:eastAsia="Arial" w:hAnsi="Arial"/>
+                <w:b w:val="false"/>
+                <w:bCs w:val="false"/>
+                <w:color w:val="1E2A30"/>
+                <w:sz w:val="19"/>
+                <w:szCs w:val="19"/>
+              </w:rPr>
+              <w:t xml:space="preserve">6. Casos de teste genéricos (CT006), sem alteração (CT009) e sem extensibilidade; CT017 descrito como no limite.</w:t>
+            </w:r>
+          </w:p>
+          <w:p>
+            <w:pPr>
+              <w:spacing w:after="0" w:line="260"/>
+            </w:pPr>
+            <w:r>
+              <w:rPr>
+                <w:rFonts w:ascii="Arial" w:cs="Arial" w:eastAsia="Arial" w:hAnsi="Arial"/>
+                <w:b w:val="false"/>
+                <w:bCs w:val="false"/>
+                <w:color w:val="1E2A30"/>
+                <w:sz w:val="19"/>
+                <w:szCs w:val="19"/>
+              </w:rPr>
+              <w:t xml:space="preserve">7. Artefatos concentrados em 11_Apresentacao; ata em branco.</w:t>
             </w:r>
           </w:p>
         </w:tc>
@@ -26846,8 +28982,8 @@
                 <w:b/>
                 <w:bCs/>
                 <w:color w:val="1E2A30"/>
-                <w:sz w:val="20"/>
-                <w:szCs w:val="20"/>
+                <w:sz w:val="19"/>
+                <w:szCs w:val="19"/>
               </w:rPr>
               <w:t xml:space="preserve">Correções combinadas</w:t>
             </w:r>
@@ -26879,10 +29015,10 @@
                 <w:b w:val="false"/>
                 <w:bCs w:val="false"/>
                 <w:color w:val="1E2A30"/>
-                <w:sz w:val="20"/>
-                <w:szCs w:val="20"/>
-              </w:rPr>
-              <w:t xml:space="preserve"/>
+                <w:sz w:val="19"/>
+                <w:szCs w:val="19"/>
+              </w:rPr>
+              <w:t xml:space="preserve">Todas aplicadas na versão 1.1: fórmula da produção corrigida; RF com descrição; matriz com RNF001 a RNF004; diagramas de classes, sequência e atividades refeitos; critérios de qualidade com forma de verificação; registro e encerramento em 5.3; CT001 a CT024 com dados e valores; um PDF por pasta; esta ata.</w:t>
             </w:r>
           </w:p>
         </w:tc>
@@ -26917,8 +29053,8 @@
                 <w:b/>
                 <w:bCs/>
                 <w:color w:val="1E2A30"/>
-                <w:sz w:val="20"/>
-                <w:szCs w:val="20"/>
+                <w:sz w:val="19"/>
+                <w:szCs w:val="19"/>
               </w:rPr>
               <w:t xml:space="preserve">Responsável e prazo</w:t>
             </w:r>
@@ -26950,10 +29086,10 @@
                 <w:b w:val="false"/>
                 <w:bCs w:val="false"/>
                 <w:color w:val="1E2A30"/>
-                <w:sz w:val="20"/>
-                <w:szCs w:val="20"/>
-              </w:rPr>
-              <w:t xml:space="preserve"/>
+                <w:sz w:val="19"/>
+                <w:szCs w:val="19"/>
+              </w:rPr>
+              <w:t xml:space="preserve">João: documento, diagramas e repositório (30/10, concluído). Iago: Google Doc da equipe (30/10, concluído). Pendente para a A3: o código herdado do T1 calcula a produção sem o salário base (05_Codigo_Fonte/folhadepagamento.py); João corrige na implementação, até 01/11.</w:t>
             </w:r>
           </w:p>
         </w:tc>
@@ -27158,7 +29294,7 @@
         <w:sz w:val="16"/>
         <w:szCs w:val="16"/>
       </w:rPr>
-      <w:t xml:space="preserve">Financy · Sistema de Folha de Pagamento · A1</w:t>
+      <w:t xml:space="preserve">Financy · Sistema de Folha de Pagamento · A1 · versão 1.1</w:t>
     </w:r>
   </w:p>
 </w:hdr>
@@ -27374,6 +29510,139 @@
     <w:basedOn w:val="Normal"/>
     <w:qFormat/>
   </w:style>
+  <w:style w:type="paragraph" w:styleId="Caption">
+    <w:name w:val="caption"/>
+    <w:basedOn w:val="Normal"/>
+    <w:next w:val="Normal"/>
+    <w:uiPriority w:val="35"/>
+    <w:semiHidden/>
+    <w:unhideWhenUsed/>
+    <w:qFormat/>
+    <w:pPr>
+      <w:spacing w:after="200"/>
+    </w:pPr>
+    <w:rPr>
+      <w:i/>
+      <w:iCs/>
+      <w:color w:val="44546A" w:themeColor="dark2"/>
+      <w:sz w:val="18"/>
+      <w:szCs w:val="18"/>
+    </w:rPr>
+  </w:style>
+  <w:style w:type="paragraph" w:styleId="Bibliography">
+    <w:name w:val="Bibliography"/>
+    <w:basedOn w:val="Normal"/>
+    <w:next w:val="Normal"/>
+    <w:uiPriority w:val="37"/>
+    <w:unhideWhenUsed/>
+  </w:style>
+  <w:style w:type="paragraph" w:styleId="TOC1">
+    <w:name w:val="toc 1"/>
+    <w:basedOn w:val="Normal"/>
+    <w:next w:val="Normal"/>
+    <w:uiPriority w:val="39"/>
+    <w:semiHidden/>
+    <w:unhideWhenUsed/>
+    <w:pPr>
+      <w:spacing w:after="100"/>
+    </w:pPr>
+  </w:style>
+  <w:style w:type="paragraph" w:styleId="TOC2">
+    <w:name w:val="toc 2"/>
+    <w:basedOn w:val="Normal"/>
+    <w:next w:val="Normal"/>
+    <w:uiPriority w:val="39"/>
+    <w:semiHidden/>
+    <w:unhideWhenUsed/>
+    <w:pPr>
+      <w:spacing w:after="100"/>
+      <w:ind w:left="220"/>
+    </w:pPr>
+  </w:style>
+  <w:style w:type="paragraph" w:styleId="TOC3">
+    <w:name w:val="toc 3"/>
+    <w:basedOn w:val="Normal"/>
+    <w:next w:val="Normal"/>
+    <w:uiPriority w:val="39"/>
+    <w:semiHidden/>
+    <w:unhideWhenUsed/>
+    <w:pPr>
+      <w:spacing w:after="100"/>
+      <w:ind w:left="440"/>
+    </w:pPr>
+  </w:style>
+  <w:style w:type="paragraph" w:styleId="TOC4">
+    <w:name w:val="toc 4"/>
+    <w:basedOn w:val="Normal"/>
+    <w:next w:val="Normal"/>
+    <w:uiPriority w:val="39"/>
+    <w:semiHidden/>
+    <w:unhideWhenUsed/>
+    <w:pPr>
+      <w:spacing w:after="100"/>
+      <w:ind w:left="660"/>
+    </w:pPr>
+  </w:style>
+  <w:style w:type="paragraph" w:styleId="TOC5">
+    <w:name w:val="toc 5"/>
+    <w:basedOn w:val="Normal"/>
+    <w:next w:val="Normal"/>
+    <w:uiPriority w:val="39"/>
+    <w:semiHidden/>
+    <w:unhideWhenUsed/>
+    <w:pPr>
+      <w:spacing w:after="100"/>
+      <w:ind w:left="880"/>
+    </w:pPr>
+  </w:style>
+  <w:style w:type="paragraph" w:styleId="TOC6">
+    <w:name w:val="toc 6"/>
+    <w:basedOn w:val="Normal"/>
+    <w:next w:val="Normal"/>
+    <w:uiPriority w:val="39"/>
+    <w:semiHidden/>
+    <w:unhideWhenUsed/>
+    <w:pPr>
+      <w:spacing w:after="100"/>
+      <w:ind w:left="1100"/>
+    </w:pPr>
+  </w:style>
+  <w:style w:type="paragraph" w:styleId="TOC7">
+    <w:name w:val="toc 7"/>
+    <w:basedOn w:val="Normal"/>
+    <w:next w:val="Normal"/>
+    <w:uiPriority w:val="39"/>
+    <w:semiHidden/>
+    <w:unhideWhenUsed/>
+    <w:pPr>
+      <w:spacing w:after="100"/>
+      <w:ind w:left="1320"/>
+    </w:pPr>
+  </w:style>
+  <w:style w:type="paragraph" w:styleId="TOC8">
+    <w:name w:val="toc 8"/>
+    <w:basedOn w:val="Normal"/>
+    <w:next w:val="Normal"/>
+    <w:uiPriority w:val="39"/>
+    <w:semiHidden/>
+    <w:unhideWhenUsed/>
+    <w:pPr>
+      <w:spacing w:after="100"/>
+      <w:ind w:left="1540"/>
+    </w:pPr>
+  </w:style>
+  <w:style w:type="paragraph" w:styleId="TOC9">
+    <w:name w:val="toc 9"/>
+    <w:basedOn w:val="Normal"/>
+    <w:next w:val="Normal"/>
+    <w:uiPriority w:val="39"/>
+    <w:semiHidden/>
+    <w:unhideWhenUsed/>
+    <w:pPr>
+      <w:spacing w:after="100"/>
+      <w:ind w:left="1760"/>
+    </w:pPr>
+  </w:style>
   <w:style w:type="character" w:styleId="Hyperlink">
     <w:name w:val="Hyperlink"/>
     <w:basedOn w:val="DefaultParagraphFont"/>
@@ -27457,6 +29726,13 @@
       <w:sz w:val="20"/>
       <w:szCs w:val="20"/>
     </w:rPr>
+  </w:style>
+  <w:style w:type="character" w:styleId="LineNumber">
+    <w:name w:val="line number"/>
+    <w:basedOn w:val="DefaultParagraphFont"/>
+    <w:uiPriority w:val="99"/>
+    <w:semiHidden/>
+    <w:unhideWhenUsed/>
   </w:style>
   <w:style w:type="paragraph" w:styleId="Heading1">
     <w:name w:val="Heading 1"/>

</xml_diff>